<commit_message>
docs: lock four-method direction, add context overview, sync title defense materials
Syncs the scope document to the confirmed four-method comparison (static
threshold, supervised, contextual bandit, sequential RL), re-verifies
CrowdStrike Charlotte AI's current capabilities against primary sources,
and adds a self-contained ARSS context document for readers outside the
team. Also commits the presented and revised title-defense decks, the
concept-clarification writeup, and the system/workflow diagrams.

Co-Authored-By: Claude Sonnet 5 <noreply@anthropic.com>
</commit_message>
<xml_diff>
--- a/ARSS Scope Document .docx
+++ b/ARSS Scope Document .docx
@@ -287,7 +287,7 @@
           <w:rFonts w:ascii="Times New Roman" w:eastAsia="Calibri" w:hAnsi="Times New Roman"/>
           <w:color w:val="000000" w:themeColor="text1"/>
         </w:rPr>
-        <w:t>Version 1.0</w:t>
+        <w:t>Version 3.0</w:t>
       </w:r>
     </w:p>
     <w:p>
@@ -893,7 +893,12 @@
           <w:szCs w:val="32"/>
         </w:rPr>
         <w:sectPr>
-          <w:footerReference w:type="default" r:id="rId12"/>
+          <w:headerReference w:type="even" r:id="rId12"/>
+          <w:headerReference w:type="default" r:id="rId13"/>
+          <w:footerReference w:type="even" r:id="rId14"/>
+          <w:footerReference w:type="default" r:id="rId15"/>
+          <w:headerReference w:type="first" r:id="rId16"/>
+          <w:footerReference w:type="first" r:id="rId17"/>
           <w:pgSz w:w="11906" w:h="16838" w:code="9"/>
           <w:pgMar w:top="1440" w:right="1440" w:bottom="1440" w:left="1440" w:header="720" w:footer="720" w:gutter="0"/>
           <w:pgNumType w:start="1"/>
@@ -995,9 +1000,10 @@
           <w:pPr>
             <w:pStyle w:val="TOC1"/>
             <w:rPr>
-              <w:rFonts w:ascii="Times New Roman" w:eastAsiaTheme="minorEastAsia" w:hAnsi="Times New Roman"/>
+              <w:rFonts w:asciiTheme="minorHAnsi" w:eastAsiaTheme="minorEastAsia" w:hAnsiTheme="minorHAnsi" w:cstheme="minorBidi"/>
               <w:kern w:val="2"/>
               <w:szCs w:val="24"/>
+              <w:lang w:val="en-GB" w:eastAsia="en-GB"/>
               <w14:ligatures w14:val="standardContextual"/>
             </w:rPr>
           </w:pPr>
@@ -1019,7 +1025,7 @@
             </w:rPr>
             <w:fldChar w:fldCharType="separate"/>
           </w:r>
-          <w:hyperlink w:anchor="_Toc196150931" w:history="1">
+          <w:hyperlink w:anchor="_Toc241185782" w:history="1">
             <w:r>
               <w:rPr>
                 <w:rStyle w:val="Hyperlink"/>
@@ -1029,48 +1035,41 @@
             </w:r>
             <w:r>
               <w:rPr>
-                <w:rFonts w:ascii="Times New Roman" w:hAnsi="Times New Roman"/>
                 <w:webHidden/>
               </w:rPr>
               <w:tab/>
             </w:r>
             <w:r>
               <w:rPr>
-                <w:rFonts w:ascii="Times New Roman" w:hAnsi="Times New Roman"/>
                 <w:webHidden/>
               </w:rPr>
               <w:fldChar w:fldCharType="begin"/>
             </w:r>
             <w:r>
               <w:rPr>
-                <w:rFonts w:ascii="Times New Roman" w:hAnsi="Times New Roman"/>
                 <w:webHidden/>
               </w:rPr>
-              <w:instrText xml:space="preserve"> PAGEREF _Toc196150931 \h </w:instrText>
-            </w:r>
-            <w:r>
-              <w:rPr>
-                <w:rFonts w:ascii="Times New Roman" w:hAnsi="Times New Roman"/>
+              <w:instrText xml:space="preserve"> PAGEREF _Toc241185782 \h </w:instrText>
+            </w:r>
+            <w:r>
+              <w:rPr>
                 <w:webHidden/>
               </w:rPr>
             </w:r>
             <w:r>
               <w:rPr>
-                <w:rFonts w:ascii="Times New Roman" w:hAnsi="Times New Roman"/>
                 <w:webHidden/>
               </w:rPr>
               <w:fldChar w:fldCharType="separate"/>
             </w:r>
             <w:r>
               <w:rPr>
-                <w:rFonts w:ascii="Times New Roman" w:hAnsi="Times New Roman"/>
                 <w:webHidden/>
               </w:rPr>
               <w:t>3</w:t>
             </w:r>
             <w:r>
               <w:rPr>
-                <w:rFonts w:ascii="Times New Roman" w:hAnsi="Times New Roman"/>
                 <w:webHidden/>
               </w:rPr>
               <w:fldChar w:fldCharType="end"/>
@@ -1081,13 +1080,14 @@
           <w:pPr>
             <w:pStyle w:val="TOC1"/>
             <w:rPr>
-              <w:rFonts w:ascii="Times New Roman" w:eastAsiaTheme="minorEastAsia" w:hAnsi="Times New Roman"/>
+              <w:rFonts w:asciiTheme="minorHAnsi" w:eastAsiaTheme="minorEastAsia" w:hAnsiTheme="minorHAnsi" w:cstheme="minorBidi"/>
               <w:kern w:val="2"/>
               <w:szCs w:val="24"/>
+              <w:lang w:val="en-GB" w:eastAsia="en-GB"/>
               <w14:ligatures w14:val="standardContextual"/>
             </w:rPr>
           </w:pPr>
-          <w:hyperlink w:anchor="_Toc196150932" w:history="1">
+          <w:hyperlink w:anchor="_Toc241185783" w:history="1">
             <w:r>
               <w:rPr>
                 <w:rStyle w:val="Hyperlink"/>
@@ -1097,9 +1097,10 @@
             </w:r>
             <w:r>
               <w:rPr>
-                <w:rFonts w:ascii="Times New Roman" w:eastAsiaTheme="minorEastAsia" w:hAnsi="Times New Roman"/>
+                <w:rFonts w:asciiTheme="minorHAnsi" w:eastAsiaTheme="minorEastAsia" w:hAnsiTheme="minorHAnsi" w:cstheme="minorBidi"/>
                 <w:kern w:val="2"/>
                 <w:szCs w:val="24"/>
+                <w:lang w:val="en-GB" w:eastAsia="en-GB"/>
                 <w14:ligatures w14:val="standardContextual"/>
               </w:rPr>
               <w:tab/>
@@ -1113,216 +1114,41 @@
             </w:r>
             <w:r>
               <w:rPr>
-                <w:rFonts w:ascii="Times New Roman" w:hAnsi="Times New Roman"/>
                 <w:webHidden/>
               </w:rPr>
               <w:tab/>
             </w:r>
             <w:r>
               <w:rPr>
-                <w:rFonts w:ascii="Times New Roman" w:hAnsi="Times New Roman"/>
                 <w:webHidden/>
               </w:rPr>
               <w:fldChar w:fldCharType="begin"/>
             </w:r>
             <w:r>
               <w:rPr>
-                <w:rFonts w:ascii="Times New Roman" w:hAnsi="Times New Roman"/>
                 <w:webHidden/>
               </w:rPr>
-              <w:instrText xml:space="preserve"> PAGEREF _Toc196150932 \h </w:instrText>
-            </w:r>
-            <w:r>
-              <w:rPr>
-                <w:rFonts w:ascii="Times New Roman" w:hAnsi="Times New Roman"/>
+              <w:instrText xml:space="preserve"> PAGEREF _Toc241185783 \h </w:instrText>
+            </w:r>
+            <w:r>
+              <w:rPr>
                 <w:webHidden/>
               </w:rPr>
             </w:r>
             <w:r>
               <w:rPr>
-                <w:rFonts w:ascii="Times New Roman" w:hAnsi="Times New Roman"/>
                 <w:webHidden/>
               </w:rPr>
               <w:fldChar w:fldCharType="separate"/>
             </w:r>
             <w:r>
               <w:rPr>
-                <w:rFonts w:ascii="Times New Roman" w:hAnsi="Times New Roman"/>
                 <w:webHidden/>
               </w:rPr>
               <w:t>4</w:t>
             </w:r>
             <w:r>
               <w:rPr>
-                <w:rFonts w:ascii="Times New Roman" w:hAnsi="Times New Roman"/>
-                <w:webHidden/>
-              </w:rPr>
-              <w:fldChar w:fldCharType="end"/>
-            </w:r>
-          </w:hyperlink>
-        </w:p>
-        <w:p>
-          <w:pPr>
-            <w:pStyle w:val="TOC1"/>
-            <w:rPr>
-              <w:rFonts w:ascii="Times New Roman" w:eastAsiaTheme="minorEastAsia" w:hAnsi="Times New Roman"/>
-              <w:kern w:val="2"/>
-              <w:szCs w:val="24"/>
-              <w14:ligatures w14:val="standardContextual"/>
-            </w:rPr>
-          </w:pPr>
-          <w:hyperlink w:anchor="_Toc196150933" w:history="1">
-            <w:r>
-              <w:rPr>
-                <w:rStyle w:val="Hyperlink"/>
-                <w:rFonts w:ascii="Times New Roman" w:hAnsi="Times New Roman"/>
-              </w:rPr>
-              <w:t>2.</w:t>
-            </w:r>
-            <w:r>
-              <w:rPr>
-                <w:rFonts w:ascii="Times New Roman" w:eastAsiaTheme="minorEastAsia" w:hAnsi="Times New Roman"/>
-                <w:kern w:val="2"/>
-                <w:szCs w:val="24"/>
-                <w14:ligatures w14:val="standardContextual"/>
-              </w:rPr>
-              <w:tab/>
-            </w:r>
-            <w:r>
-              <w:rPr>
-                <w:rStyle w:val="Hyperlink"/>
-                <w:rFonts w:ascii="Times New Roman" w:hAnsi="Times New Roman"/>
-              </w:rPr>
-              <w:t>Problem Statement</w:t>
-            </w:r>
-            <w:r>
-              <w:rPr>
-                <w:rFonts w:ascii="Times New Roman" w:hAnsi="Times New Roman"/>
-                <w:webHidden/>
-              </w:rPr>
-              <w:tab/>
-            </w:r>
-            <w:r>
-              <w:rPr>
-                <w:rFonts w:ascii="Times New Roman" w:hAnsi="Times New Roman"/>
-                <w:webHidden/>
-              </w:rPr>
-              <w:fldChar w:fldCharType="begin"/>
-            </w:r>
-            <w:r>
-              <w:rPr>
-                <w:rFonts w:ascii="Times New Roman" w:hAnsi="Times New Roman"/>
-                <w:webHidden/>
-              </w:rPr>
-              <w:instrText xml:space="preserve"> PAGEREF _Toc196150933 \h </w:instrText>
-            </w:r>
-            <w:r>
-              <w:rPr>
-                <w:rFonts w:ascii="Times New Roman" w:hAnsi="Times New Roman"/>
-                <w:webHidden/>
-              </w:rPr>
-            </w:r>
-            <w:r>
-              <w:rPr>
-                <w:rFonts w:ascii="Times New Roman" w:hAnsi="Times New Roman"/>
-                <w:webHidden/>
-              </w:rPr>
-              <w:fldChar w:fldCharType="separate"/>
-            </w:r>
-            <w:r>
-              <w:rPr>
-                <w:rFonts w:ascii="Times New Roman" w:hAnsi="Times New Roman"/>
-                <w:webHidden/>
-              </w:rPr>
-              <w:t>4</w:t>
-            </w:r>
-            <w:r>
-              <w:rPr>
-                <w:rFonts w:ascii="Times New Roman" w:hAnsi="Times New Roman"/>
-                <w:webHidden/>
-              </w:rPr>
-              <w:fldChar w:fldCharType="end"/>
-            </w:r>
-          </w:hyperlink>
-        </w:p>
-        <w:p>
-          <w:pPr>
-            <w:pStyle w:val="TOC1"/>
-            <w:rPr>
-              <w:rFonts w:ascii="Times New Roman" w:eastAsiaTheme="minorEastAsia" w:hAnsi="Times New Roman"/>
-              <w:kern w:val="2"/>
-              <w:szCs w:val="24"/>
-              <w14:ligatures w14:val="standardContextual"/>
-            </w:rPr>
-          </w:pPr>
-          <w:hyperlink w:anchor="_Toc196150934" w:history="1">
-            <w:r>
-              <w:rPr>
-                <w:rStyle w:val="Hyperlink"/>
-                <w:rFonts w:ascii="Times New Roman" w:hAnsi="Times New Roman"/>
-              </w:rPr>
-              <w:t>3.</w:t>
-            </w:r>
-            <w:r>
-              <w:rPr>
-                <w:rFonts w:ascii="Times New Roman" w:eastAsiaTheme="minorEastAsia" w:hAnsi="Times New Roman"/>
-                <w:kern w:val="2"/>
-                <w:szCs w:val="24"/>
-                <w14:ligatures w14:val="standardContextual"/>
-              </w:rPr>
-              <w:tab/>
-            </w:r>
-            <w:r>
-              <w:rPr>
-                <w:rStyle w:val="Hyperlink"/>
-                <w:rFonts w:ascii="Times New Roman" w:hAnsi="Times New Roman"/>
-              </w:rPr>
-              <w:t>Problem Solution/Objectives of the Proposed System</w:t>
-            </w:r>
-            <w:r>
-              <w:rPr>
-                <w:rFonts w:ascii="Times New Roman" w:hAnsi="Times New Roman"/>
-                <w:webHidden/>
-              </w:rPr>
-              <w:tab/>
-            </w:r>
-            <w:r>
-              <w:rPr>
-                <w:rFonts w:ascii="Times New Roman" w:hAnsi="Times New Roman"/>
-                <w:webHidden/>
-              </w:rPr>
-              <w:fldChar w:fldCharType="begin"/>
-            </w:r>
-            <w:r>
-              <w:rPr>
-                <w:rFonts w:ascii="Times New Roman" w:hAnsi="Times New Roman"/>
-                <w:webHidden/>
-              </w:rPr>
-              <w:instrText xml:space="preserve"> PAGEREF _Toc196150934 \h </w:instrText>
-            </w:r>
-            <w:r>
-              <w:rPr>
-                <w:rFonts w:ascii="Times New Roman" w:hAnsi="Times New Roman"/>
-                <w:webHidden/>
-              </w:rPr>
-            </w:r>
-            <w:r>
-              <w:rPr>
-                <w:rFonts w:ascii="Times New Roman" w:hAnsi="Times New Roman"/>
-                <w:webHidden/>
-              </w:rPr>
-              <w:fldChar w:fldCharType="separate"/>
-            </w:r>
-            <w:r>
-              <w:rPr>
-                <w:rFonts w:ascii="Times New Roman" w:hAnsi="Times New Roman"/>
-                <w:webHidden/>
-              </w:rPr>
-              <w:t>5</w:t>
-            </w:r>
-            <w:r>
-              <w:rPr>
-                <w:rFonts w:ascii="Times New Roman" w:hAnsi="Times New Roman"/>
                 <w:webHidden/>
               </w:rPr>
               <w:fldChar w:fldCharType="end"/>
@@ -1336,30 +1162,31 @@
               <w:tab w:val="left" w:pos="960"/>
             </w:tabs>
             <w:rPr>
-              <w:rFonts w:ascii="Times New Roman" w:eastAsiaTheme="minorEastAsia" w:hAnsi="Times New Roman"/>
+              <w:rFonts w:asciiTheme="minorHAnsi" w:eastAsiaTheme="minorEastAsia" w:hAnsiTheme="minorHAnsi" w:cstheme="minorBidi"/>
               <w:noProof/>
               <w:kern w:val="2"/>
               <w:sz w:val="24"/>
               <w:szCs w:val="24"/>
+              <w:lang w:val="en-GB" w:eastAsia="en-GB"/>
               <w14:ligatures w14:val="standardContextual"/>
             </w:rPr>
           </w:pPr>
-          <w:hyperlink w:anchor="_Toc196150935" w:history="1">
+          <w:hyperlink w:anchor="_Toc241185784" w:history="1">
             <w:r>
               <w:rPr>
                 <w:rStyle w:val="Hyperlink"/>
-                <w:rFonts w:ascii="Times New Roman" w:hAnsi="Times New Roman"/>
                 <w:noProof/>
               </w:rPr>
-              <w:t>3.1</w:t>
-            </w:r>
-            <w:r>
-              <w:rPr>
-                <w:rFonts w:ascii="Times New Roman" w:eastAsiaTheme="minorEastAsia" w:hAnsi="Times New Roman"/>
+              <w:t>1.1</w:t>
+            </w:r>
+            <w:r>
+              <w:rPr>
+                <w:rFonts w:asciiTheme="minorHAnsi" w:eastAsiaTheme="minorEastAsia" w:hAnsiTheme="minorHAnsi" w:cstheme="minorBidi"/>
                 <w:noProof/>
                 <w:kern w:val="2"/>
                 <w:sz w:val="24"/>
                 <w:szCs w:val="24"/>
+                <w:lang w:val="en-GB" w:eastAsia="en-GB"/>
                 <w14:ligatures w14:val="standardContextual"/>
               </w:rPr>
               <w:tab/>
@@ -1367,14 +1194,12 @@
             <w:r>
               <w:rPr>
                 <w:rStyle w:val="Hyperlink"/>
-                <w:rFonts w:ascii="Times New Roman" w:hAnsi="Times New Roman"/>
                 <w:noProof/>
               </w:rPr>
-              <w:t>Objectives</w:t>
-            </w:r>
-            <w:r>
-              <w:rPr>
-                <w:rFonts w:ascii="Times New Roman" w:hAnsi="Times New Roman"/>
+              <w:t>Problem Statement</w:t>
+            </w:r>
+            <w:r>
+              <w:rPr>
                 <w:noProof/>
                 <w:webHidden/>
               </w:rPr>
@@ -1382,7 +1207,6 @@
             </w:r>
             <w:r>
               <w:rPr>
-                <w:rFonts w:ascii="Times New Roman" w:hAnsi="Times New Roman"/>
                 <w:noProof/>
                 <w:webHidden/>
               </w:rPr>
@@ -1390,22 +1214,19 @@
             </w:r>
             <w:r>
               <w:rPr>
-                <w:rFonts w:ascii="Times New Roman" w:hAnsi="Times New Roman"/>
                 <w:noProof/>
                 <w:webHidden/>
               </w:rPr>
-              <w:instrText xml:space="preserve"> PAGEREF _Toc196150935 \h </w:instrText>
-            </w:r>
-            <w:r>
-              <w:rPr>
-                <w:rFonts w:ascii="Times New Roman" w:hAnsi="Times New Roman"/>
+              <w:instrText xml:space="preserve"> PAGEREF _Toc241185784 \h </w:instrText>
+            </w:r>
+            <w:r>
+              <w:rPr>
                 <w:noProof/>
                 <w:webHidden/>
               </w:rPr>
             </w:r>
             <w:r>
               <w:rPr>
-                <w:rFonts w:ascii="Times New Roman" w:hAnsi="Times New Roman"/>
                 <w:noProof/>
                 <w:webHidden/>
               </w:rPr>
@@ -1413,16 +1234,186 @@
             </w:r>
             <w:r>
               <w:rPr>
-                <w:rFonts w:ascii="Times New Roman" w:hAnsi="Times New Roman"/>
                 <w:noProof/>
                 <w:webHidden/>
               </w:rPr>
+              <w:t>4</w:t>
+            </w:r>
+            <w:r>
+              <w:rPr>
+                <w:noProof/>
+                <w:webHidden/>
+              </w:rPr>
+              <w:fldChar w:fldCharType="end"/>
+            </w:r>
+          </w:hyperlink>
+        </w:p>
+        <w:p>
+          <w:pPr>
+            <w:pStyle w:val="TOC2"/>
+            <w:tabs>
+              <w:tab w:val="left" w:pos="960"/>
+            </w:tabs>
+            <w:rPr>
+              <w:rFonts w:asciiTheme="minorHAnsi" w:eastAsiaTheme="minorEastAsia" w:hAnsiTheme="minorHAnsi" w:cstheme="minorBidi"/>
+              <w:noProof/>
+              <w:kern w:val="2"/>
+              <w:sz w:val="24"/>
+              <w:szCs w:val="24"/>
+              <w:lang w:val="en-GB" w:eastAsia="en-GB"/>
+              <w14:ligatures w14:val="standardContextual"/>
+            </w:rPr>
+          </w:pPr>
+          <w:hyperlink w:anchor="_Toc241185785" w:history="1">
+            <w:r>
+              <w:rPr>
+                <w:rStyle w:val="Hyperlink"/>
+                <w:noProof/>
+              </w:rPr>
+              <w:t>1.2</w:t>
+            </w:r>
+            <w:r>
+              <w:rPr>
+                <w:rFonts w:asciiTheme="minorHAnsi" w:eastAsiaTheme="minorEastAsia" w:hAnsiTheme="minorHAnsi" w:cstheme="minorBidi"/>
+                <w:noProof/>
+                <w:kern w:val="2"/>
+                <w:sz w:val="24"/>
+                <w:szCs w:val="24"/>
+                <w:lang w:val="en-GB" w:eastAsia="en-GB"/>
+                <w14:ligatures w14:val="standardContextual"/>
+              </w:rPr>
+              <w:tab/>
+            </w:r>
+            <w:r>
+              <w:rPr>
+                <w:rStyle w:val="Hyperlink"/>
+                <w:noProof/>
+              </w:rPr>
+              <w:t>Problem Solution/Objectives of the Proposed System</w:t>
+            </w:r>
+            <w:r>
+              <w:rPr>
+                <w:noProof/>
+                <w:webHidden/>
+              </w:rPr>
+              <w:tab/>
+            </w:r>
+            <w:r>
+              <w:rPr>
+                <w:noProof/>
+                <w:webHidden/>
+              </w:rPr>
+              <w:fldChar w:fldCharType="begin"/>
+            </w:r>
+            <w:r>
+              <w:rPr>
+                <w:noProof/>
+                <w:webHidden/>
+              </w:rPr>
+              <w:instrText xml:space="preserve"> PAGEREF _Toc241185785 \h </w:instrText>
+            </w:r>
+            <w:r>
+              <w:rPr>
+                <w:noProof/>
+                <w:webHidden/>
+              </w:rPr>
+            </w:r>
+            <w:r>
+              <w:rPr>
+                <w:noProof/>
+                <w:webHidden/>
+              </w:rPr>
+              <w:fldChar w:fldCharType="separate"/>
+            </w:r>
+            <w:r>
+              <w:rPr>
+                <w:noProof/>
+                <w:webHidden/>
+              </w:rPr>
               <w:t>5</w:t>
             </w:r>
             <w:r>
               <w:rPr>
-                <w:rFonts w:ascii="Times New Roman" w:hAnsi="Times New Roman"/>
                 <w:noProof/>
+                <w:webHidden/>
+              </w:rPr>
+              <w:fldChar w:fldCharType="end"/>
+            </w:r>
+          </w:hyperlink>
+        </w:p>
+        <w:p>
+          <w:pPr>
+            <w:pStyle w:val="TOC3"/>
+            <w:rPr>
+              <w:rFonts w:asciiTheme="minorHAnsi" w:eastAsiaTheme="minorEastAsia" w:hAnsiTheme="minorHAnsi" w:cstheme="minorBidi"/>
+              <w:kern w:val="2"/>
+              <w:sz w:val="24"/>
+              <w:szCs w:val="24"/>
+              <w:lang w:val="en-GB" w:eastAsia="en-GB"/>
+              <w14:ligatures w14:val="standardContextual"/>
+            </w:rPr>
+          </w:pPr>
+          <w:hyperlink w:anchor="_Toc241185786" w:history="1">
+            <w:r>
+              <w:rPr>
+                <w:rStyle w:val="Hyperlink"/>
+              </w:rPr>
+              <w:t>1.2.1</w:t>
+            </w:r>
+            <w:r>
+              <w:rPr>
+                <w:rFonts w:asciiTheme="minorHAnsi" w:eastAsiaTheme="minorEastAsia" w:hAnsiTheme="minorHAnsi" w:cstheme="minorBidi"/>
+                <w:kern w:val="2"/>
+                <w:sz w:val="24"/>
+                <w:szCs w:val="24"/>
+                <w:lang w:val="en-GB" w:eastAsia="en-GB"/>
+                <w14:ligatures w14:val="standardContextual"/>
+              </w:rPr>
+              <w:tab/>
+            </w:r>
+            <w:r>
+              <w:rPr>
+                <w:rStyle w:val="Hyperlink"/>
+              </w:rPr>
+              <w:t>Objectives</w:t>
+            </w:r>
+            <w:r>
+              <w:rPr>
+                <w:webHidden/>
+              </w:rPr>
+              <w:tab/>
+            </w:r>
+            <w:r>
+              <w:rPr>
+                <w:webHidden/>
+              </w:rPr>
+              <w:fldChar w:fldCharType="begin"/>
+            </w:r>
+            <w:r>
+              <w:rPr>
+                <w:webHidden/>
+              </w:rPr>
+              <w:instrText xml:space="preserve"> PAGEREF _Toc241185786 \h </w:instrText>
+            </w:r>
+            <w:r>
+              <w:rPr>
+                <w:webHidden/>
+              </w:rPr>
+            </w:r>
+            <w:r>
+              <w:rPr>
+                <w:webHidden/>
+              </w:rPr>
+              <w:fldChar w:fldCharType="separate"/>
+            </w:r>
+            <w:r>
+              <w:rPr>
+                <w:webHidden/>
+              </w:rPr>
+              <w:t>5</w:t>
+            </w:r>
+            <w:r>
+              <w:rPr>
                 <w:webHidden/>
               </w:rPr>
               <w:fldChar w:fldCharType="end"/>
@@ -1433,25 +1424,27 @@
           <w:pPr>
             <w:pStyle w:val="TOC1"/>
             <w:rPr>
-              <w:rFonts w:ascii="Times New Roman" w:eastAsiaTheme="minorEastAsia" w:hAnsi="Times New Roman"/>
+              <w:rFonts w:asciiTheme="minorHAnsi" w:eastAsiaTheme="minorEastAsia" w:hAnsiTheme="minorHAnsi" w:cstheme="minorBidi"/>
               <w:kern w:val="2"/>
               <w:szCs w:val="24"/>
+              <w:lang w:val="en-GB" w:eastAsia="en-GB"/>
               <w14:ligatures w14:val="standardContextual"/>
             </w:rPr>
           </w:pPr>
-          <w:hyperlink w:anchor="_Toc196150936" w:history="1">
+          <w:hyperlink w:anchor="_Toc241185787" w:history="1">
             <w:r>
               <w:rPr>
                 <w:rStyle w:val="Hyperlink"/>
                 <w:rFonts w:ascii="Times New Roman" w:hAnsi="Times New Roman"/>
               </w:rPr>
-              <w:t>4.</w:t>
-            </w:r>
-            <w:r>
-              <w:rPr>
-                <w:rFonts w:ascii="Times New Roman" w:eastAsiaTheme="minorEastAsia" w:hAnsi="Times New Roman"/>
+              <w:t>2.</w:t>
+            </w:r>
+            <w:r>
+              <w:rPr>
+                <w:rFonts w:asciiTheme="minorHAnsi" w:eastAsiaTheme="minorEastAsia" w:hAnsiTheme="minorHAnsi" w:cstheme="minorBidi"/>
                 <w:kern w:val="2"/>
                 <w:szCs w:val="24"/>
+                <w:lang w:val="en-GB" w:eastAsia="en-GB"/>
                 <w14:ligatures w14:val="standardContextual"/>
               </w:rPr>
               <w:tab/>
@@ -1465,48 +1458,134 @@
             </w:r>
             <w:r>
               <w:rPr>
-                <w:rFonts w:ascii="Times New Roman" w:hAnsi="Times New Roman"/>
                 <w:webHidden/>
               </w:rPr>
               <w:tab/>
             </w:r>
             <w:r>
               <w:rPr>
-                <w:rFonts w:ascii="Times New Roman" w:hAnsi="Times New Roman"/>
                 <w:webHidden/>
               </w:rPr>
               <w:fldChar w:fldCharType="begin"/>
             </w:r>
             <w:r>
               <w:rPr>
-                <w:rFonts w:ascii="Times New Roman" w:hAnsi="Times New Roman"/>
                 <w:webHidden/>
               </w:rPr>
-              <w:instrText xml:space="preserve"> PAGEREF _Toc196150936 \h </w:instrText>
-            </w:r>
-            <w:r>
-              <w:rPr>
-                <w:rFonts w:ascii="Times New Roman" w:hAnsi="Times New Roman"/>
+              <w:instrText xml:space="preserve"> PAGEREF _Toc241185787 \h </w:instrText>
+            </w:r>
+            <w:r>
+              <w:rPr>
                 <w:webHidden/>
               </w:rPr>
             </w:r>
             <w:r>
               <w:rPr>
-                <w:rFonts w:ascii="Times New Roman" w:hAnsi="Times New Roman"/>
                 <w:webHidden/>
               </w:rPr>
               <w:fldChar w:fldCharType="separate"/>
             </w:r>
             <w:r>
               <w:rPr>
-                <w:rFonts w:ascii="Times New Roman" w:hAnsi="Times New Roman"/>
                 <w:webHidden/>
               </w:rPr>
               <w:t>6</w:t>
             </w:r>
             <w:r>
               <w:rPr>
-                <w:rFonts w:ascii="Times New Roman" w:hAnsi="Times New Roman"/>
+                <w:webHidden/>
+              </w:rPr>
+              <w:fldChar w:fldCharType="end"/>
+            </w:r>
+          </w:hyperlink>
+        </w:p>
+        <w:p>
+          <w:pPr>
+            <w:pStyle w:val="TOC2"/>
+            <w:tabs>
+              <w:tab w:val="left" w:pos="960"/>
+            </w:tabs>
+            <w:rPr>
+              <w:rFonts w:asciiTheme="minorHAnsi" w:eastAsiaTheme="minorEastAsia" w:hAnsiTheme="minorHAnsi" w:cstheme="minorBidi"/>
+              <w:noProof/>
+              <w:kern w:val="2"/>
+              <w:sz w:val="24"/>
+              <w:szCs w:val="24"/>
+              <w:lang w:val="en-GB" w:eastAsia="en-GB"/>
+              <w14:ligatures w14:val="standardContextual"/>
+            </w:rPr>
+          </w:pPr>
+          <w:hyperlink w:anchor="_Toc241185788" w:history="1">
+            <w:r>
+              <w:rPr>
+                <w:rStyle w:val="Hyperlink"/>
+                <w:noProof/>
+              </w:rPr>
+              <w:t>2.1</w:t>
+            </w:r>
+            <w:r>
+              <w:rPr>
+                <w:rFonts w:asciiTheme="minorHAnsi" w:eastAsiaTheme="minorEastAsia" w:hAnsiTheme="minorHAnsi" w:cstheme="minorBidi"/>
+                <w:noProof/>
+                <w:kern w:val="2"/>
+                <w:sz w:val="24"/>
+                <w:szCs w:val="24"/>
+                <w:lang w:val="en-GB" w:eastAsia="en-GB"/>
+                <w14:ligatures w14:val="standardContextual"/>
+              </w:rPr>
+              <w:tab/>
+            </w:r>
+            <w:r>
+              <w:rPr>
+                <w:rStyle w:val="Hyperlink"/>
+                <w:noProof/>
+              </w:rPr>
+              <w:t>Vision Statement</w:t>
+            </w:r>
+            <w:r>
+              <w:rPr>
+                <w:noProof/>
+                <w:webHidden/>
+              </w:rPr>
+              <w:tab/>
+            </w:r>
+            <w:r>
+              <w:rPr>
+                <w:noProof/>
+                <w:webHidden/>
+              </w:rPr>
+              <w:fldChar w:fldCharType="begin"/>
+            </w:r>
+            <w:r>
+              <w:rPr>
+                <w:noProof/>
+                <w:webHidden/>
+              </w:rPr>
+              <w:instrText xml:space="preserve"> PAGEREF _Toc241185788 \h </w:instrText>
+            </w:r>
+            <w:r>
+              <w:rPr>
+                <w:noProof/>
+                <w:webHidden/>
+              </w:rPr>
+            </w:r>
+            <w:r>
+              <w:rPr>
+                <w:noProof/>
+                <w:webHidden/>
+              </w:rPr>
+              <w:fldChar w:fldCharType="separate"/>
+            </w:r>
+            <w:r>
+              <w:rPr>
+                <w:noProof/>
+                <w:webHidden/>
+              </w:rPr>
+              <w:t>8</w:t>
+            </w:r>
+            <w:r>
+              <w:rPr>
+                <w:noProof/>
                 <w:webHidden/>
               </w:rPr>
               <w:fldChar w:fldCharType="end"/>
@@ -1517,25 +1596,27 @@
           <w:pPr>
             <w:pStyle w:val="TOC1"/>
             <w:rPr>
-              <w:rFonts w:ascii="Times New Roman" w:eastAsiaTheme="minorEastAsia" w:hAnsi="Times New Roman"/>
+              <w:rFonts w:asciiTheme="minorHAnsi" w:eastAsiaTheme="minorEastAsia" w:hAnsiTheme="minorHAnsi" w:cstheme="minorBidi"/>
               <w:kern w:val="2"/>
               <w:szCs w:val="24"/>
+              <w:lang w:val="en-GB" w:eastAsia="en-GB"/>
               <w14:ligatures w14:val="standardContextual"/>
             </w:rPr>
           </w:pPr>
-          <w:hyperlink w:anchor="_Toc196150937" w:history="1">
+          <w:hyperlink w:anchor="_Toc241185789" w:history="1">
             <w:r>
               <w:rPr>
                 <w:rStyle w:val="Hyperlink"/>
                 <w:rFonts w:ascii="Times New Roman" w:hAnsi="Times New Roman"/>
               </w:rPr>
-              <w:t>5.</w:t>
-            </w:r>
-            <w:r>
-              <w:rPr>
-                <w:rFonts w:ascii="Times New Roman" w:eastAsiaTheme="minorEastAsia" w:hAnsi="Times New Roman"/>
+              <w:t>3.</w:t>
+            </w:r>
+            <w:r>
+              <w:rPr>
+                <w:rFonts w:asciiTheme="minorHAnsi" w:eastAsiaTheme="minorEastAsia" w:hAnsiTheme="minorHAnsi" w:cstheme="minorBidi"/>
                 <w:kern w:val="2"/>
                 <w:szCs w:val="24"/>
+                <w:lang w:val="en-GB" w:eastAsia="en-GB"/>
                 <w14:ligatures w14:val="standardContextual"/>
               </w:rPr>
               <w:tab/>
@@ -1545,52 +1626,45 @@
                 <w:rStyle w:val="Hyperlink"/>
                 <w:rFonts w:ascii="Times New Roman" w:hAnsi="Times New Roman"/>
               </w:rPr>
-              <w:t>Vision Statement</w:t>
-            </w:r>
-            <w:r>
-              <w:rPr>
-                <w:rFonts w:ascii="Times New Roman" w:hAnsi="Times New Roman"/>
+              <w:t>Scope</w:t>
+            </w:r>
+            <w:r>
+              <w:rPr>
                 <w:webHidden/>
               </w:rPr>
               <w:tab/>
             </w:r>
             <w:r>
               <w:rPr>
-                <w:rFonts w:ascii="Times New Roman" w:hAnsi="Times New Roman"/>
                 <w:webHidden/>
               </w:rPr>
               <w:fldChar w:fldCharType="begin"/>
             </w:r>
             <w:r>
               <w:rPr>
-                <w:rFonts w:ascii="Times New Roman" w:hAnsi="Times New Roman"/>
                 <w:webHidden/>
               </w:rPr>
-              <w:instrText xml:space="preserve"> PAGEREF _Toc196150937 \h </w:instrText>
-            </w:r>
-            <w:r>
-              <w:rPr>
-                <w:rFonts w:ascii="Times New Roman" w:hAnsi="Times New Roman"/>
+              <w:instrText xml:space="preserve"> PAGEREF _Toc241185789 \h </w:instrText>
+            </w:r>
+            <w:r>
+              <w:rPr>
                 <w:webHidden/>
               </w:rPr>
             </w:r>
             <w:r>
               <w:rPr>
-                <w:rFonts w:ascii="Times New Roman" w:hAnsi="Times New Roman"/>
                 <w:webHidden/>
               </w:rPr>
               <w:fldChar w:fldCharType="separate"/>
             </w:r>
             <w:r>
               <w:rPr>
-                <w:rFonts w:ascii="Times New Roman" w:hAnsi="Times New Roman"/>
                 <w:webHidden/>
               </w:rPr>
-              <w:t>7</w:t>
-            </w:r>
-            <w:r>
-              <w:rPr>
-                <w:rFonts w:ascii="Times New Roman" w:hAnsi="Times New Roman"/>
+              <w:t>8</w:t>
+            </w:r>
+            <w:r>
+              <w:rPr>
                 <w:webHidden/>
               </w:rPr>
               <w:fldChar w:fldCharType="end"/>
@@ -1601,25 +1675,27 @@
           <w:pPr>
             <w:pStyle w:val="TOC1"/>
             <w:rPr>
-              <w:rFonts w:ascii="Times New Roman" w:eastAsiaTheme="minorEastAsia" w:hAnsi="Times New Roman"/>
+              <w:rFonts w:asciiTheme="minorHAnsi" w:eastAsiaTheme="minorEastAsia" w:hAnsiTheme="minorHAnsi" w:cstheme="minorBidi"/>
               <w:kern w:val="2"/>
               <w:szCs w:val="24"/>
+              <w:lang w:val="en-GB" w:eastAsia="en-GB"/>
               <w14:ligatures w14:val="standardContextual"/>
             </w:rPr>
           </w:pPr>
-          <w:hyperlink w:anchor="_Toc196150938" w:history="1">
+          <w:hyperlink w:anchor="_Toc241185790" w:history="1">
             <w:r>
               <w:rPr>
                 <w:rStyle w:val="Hyperlink"/>
                 <w:rFonts w:ascii="Times New Roman" w:hAnsi="Times New Roman"/>
               </w:rPr>
-              <w:t>6.</w:t>
-            </w:r>
-            <w:r>
-              <w:rPr>
-                <w:rFonts w:ascii="Times New Roman" w:eastAsiaTheme="minorEastAsia" w:hAnsi="Times New Roman"/>
+              <w:t>4.</w:t>
+            </w:r>
+            <w:r>
+              <w:rPr>
+                <w:rFonts w:asciiTheme="minorHAnsi" w:eastAsiaTheme="minorEastAsia" w:hAnsiTheme="minorHAnsi" w:cstheme="minorBidi"/>
                 <w:kern w:val="2"/>
                 <w:szCs w:val="24"/>
+                <w:lang w:val="en-GB" w:eastAsia="en-GB"/>
                 <w14:ligatures w14:val="standardContextual"/>
               </w:rPr>
               <w:tab/>
@@ -1629,52 +1705,45 @@
                 <w:rStyle w:val="Hyperlink"/>
                 <w:rFonts w:ascii="Times New Roman" w:hAnsi="Times New Roman"/>
               </w:rPr>
-              <w:t>Scope</w:t>
-            </w:r>
-            <w:r>
-              <w:rPr>
-                <w:rFonts w:ascii="Times New Roman" w:hAnsi="Times New Roman"/>
+              <w:t>Project Stakeholders and Roles</w:t>
+            </w:r>
+            <w:r>
+              <w:rPr>
                 <w:webHidden/>
               </w:rPr>
               <w:tab/>
             </w:r>
             <w:r>
               <w:rPr>
-                <w:rFonts w:ascii="Times New Roman" w:hAnsi="Times New Roman"/>
                 <w:webHidden/>
               </w:rPr>
               <w:fldChar w:fldCharType="begin"/>
             </w:r>
             <w:r>
               <w:rPr>
-                <w:rFonts w:ascii="Times New Roman" w:hAnsi="Times New Roman"/>
                 <w:webHidden/>
               </w:rPr>
-              <w:instrText xml:space="preserve"> PAGEREF _Toc196150938 \h </w:instrText>
-            </w:r>
-            <w:r>
-              <w:rPr>
-                <w:rFonts w:ascii="Times New Roman" w:hAnsi="Times New Roman"/>
+              <w:instrText xml:space="preserve"> PAGEREF _Toc241185790 \h </w:instrText>
+            </w:r>
+            <w:r>
+              <w:rPr>
                 <w:webHidden/>
               </w:rPr>
             </w:r>
             <w:r>
               <w:rPr>
-                <w:rFonts w:ascii="Times New Roman" w:hAnsi="Times New Roman"/>
                 <w:webHidden/>
               </w:rPr>
               <w:fldChar w:fldCharType="separate"/>
             </w:r>
             <w:r>
               <w:rPr>
-                <w:rFonts w:ascii="Times New Roman" w:hAnsi="Times New Roman"/>
                 <w:webHidden/>
               </w:rPr>
-              <w:t>7</w:t>
-            </w:r>
-            <w:r>
-              <w:rPr>
-                <w:rFonts w:ascii="Times New Roman" w:hAnsi="Times New Roman"/>
+              <w:t>9</w:t>
+            </w:r>
+            <w:r>
+              <w:rPr>
                 <w:webHidden/>
               </w:rPr>
               <w:fldChar w:fldCharType="end"/>
@@ -1683,27 +1752,36 @@
         </w:p>
         <w:p>
           <w:pPr>
-            <w:pStyle w:val="TOC1"/>
+            <w:pStyle w:val="TOC2"/>
+            <w:tabs>
+              <w:tab w:val="left" w:pos="960"/>
+            </w:tabs>
             <w:rPr>
-              <w:rFonts w:ascii="Times New Roman" w:eastAsiaTheme="minorEastAsia" w:hAnsi="Times New Roman"/>
+              <w:rFonts w:asciiTheme="minorHAnsi" w:eastAsiaTheme="minorEastAsia" w:hAnsiTheme="minorHAnsi" w:cstheme="minorBidi"/>
+              <w:noProof/>
               <w:kern w:val="2"/>
+              <w:sz w:val="24"/>
               <w:szCs w:val="24"/>
+              <w:lang w:val="en-GB" w:eastAsia="en-GB"/>
               <w14:ligatures w14:val="standardContextual"/>
             </w:rPr>
           </w:pPr>
-          <w:hyperlink w:anchor="_Toc196150939" w:history="1">
+          <w:hyperlink w:anchor="_Toc241185791" w:history="1">
             <w:r>
               <w:rPr>
                 <w:rStyle w:val="Hyperlink"/>
-                <w:rFonts w:ascii="Times New Roman" w:hAnsi="Times New Roman"/>
-              </w:rPr>
-              <w:t>7.</w:t>
-            </w:r>
-            <w:r>
-              <w:rPr>
-                <w:rFonts w:ascii="Times New Roman" w:eastAsiaTheme="minorEastAsia" w:hAnsi="Times New Roman"/>
+                <w:noProof/>
+              </w:rPr>
+              <w:t>4.1</w:t>
+            </w:r>
+            <w:r>
+              <w:rPr>
+                <w:rFonts w:asciiTheme="minorHAnsi" w:eastAsiaTheme="minorEastAsia" w:hAnsiTheme="minorHAnsi" w:cstheme="minorBidi"/>
+                <w:noProof/>
                 <w:kern w:val="2"/>
+                <w:sz w:val="24"/>
                 <w:szCs w:val="24"/>
+                <w:lang w:val="en-GB" w:eastAsia="en-GB"/>
                 <w14:ligatures w14:val="standardContextual"/>
               </w:rPr>
               <w:tab/>
@@ -1711,138 +1789,54 @@
             <w:r>
               <w:rPr>
                 <w:rStyle w:val="Hyperlink"/>
-                <w:rFonts w:ascii="Times New Roman" w:hAnsi="Times New Roman"/>
-              </w:rPr>
-              <w:t>Project Stakeholders and Roles</w:t>
-            </w:r>
-            <w:r>
-              <w:rPr>
-                <w:rFonts w:ascii="Times New Roman" w:hAnsi="Times New Roman"/>
+                <w:noProof/>
+              </w:rPr>
+              <w:t>References</w:t>
+            </w:r>
+            <w:r>
+              <w:rPr>
+                <w:noProof/>
                 <w:webHidden/>
               </w:rPr>
               <w:tab/>
             </w:r>
             <w:r>
               <w:rPr>
-                <w:rFonts w:ascii="Times New Roman" w:hAnsi="Times New Roman"/>
+                <w:noProof/>
                 <w:webHidden/>
               </w:rPr>
               <w:fldChar w:fldCharType="begin"/>
             </w:r>
             <w:r>
               <w:rPr>
-                <w:rFonts w:ascii="Times New Roman" w:hAnsi="Times New Roman"/>
+                <w:noProof/>
                 <w:webHidden/>
               </w:rPr>
-              <w:instrText xml:space="preserve"> PAGEREF _Toc196150939 \h </w:instrText>
-            </w:r>
-            <w:r>
-              <w:rPr>
-                <w:rFonts w:ascii="Times New Roman" w:hAnsi="Times New Roman"/>
+              <w:instrText xml:space="preserve"> PAGEREF _Toc241185791 \h </w:instrText>
+            </w:r>
+            <w:r>
+              <w:rPr>
+                <w:noProof/>
                 <w:webHidden/>
               </w:rPr>
             </w:r>
             <w:r>
               <w:rPr>
-                <w:rFonts w:ascii="Times New Roman" w:hAnsi="Times New Roman"/>
+                <w:noProof/>
                 <w:webHidden/>
               </w:rPr>
               <w:fldChar w:fldCharType="separate"/>
             </w:r>
             <w:r>
               <w:rPr>
-                <w:rFonts w:ascii="Times New Roman" w:hAnsi="Times New Roman"/>
+                <w:noProof/>
                 <w:webHidden/>
               </w:rPr>
-              <w:t>8</w:t>
-            </w:r>
-            <w:r>
-              <w:rPr>
-                <w:rFonts w:ascii="Times New Roman" w:hAnsi="Times New Roman"/>
-                <w:webHidden/>
-              </w:rPr>
-              <w:fldChar w:fldCharType="end"/>
-            </w:r>
-          </w:hyperlink>
-        </w:p>
-        <w:p>
-          <w:pPr>
-            <w:pStyle w:val="TOC1"/>
-            <w:rPr>
-              <w:rFonts w:ascii="Times New Roman" w:eastAsiaTheme="minorEastAsia" w:hAnsi="Times New Roman"/>
-              <w:kern w:val="2"/>
-              <w:szCs w:val="24"/>
-              <w14:ligatures w14:val="standardContextual"/>
-            </w:rPr>
-          </w:pPr>
-          <w:hyperlink w:anchor="_Toc196150940" w:history="1">
-            <w:r>
-              <w:rPr>
-                <w:rStyle w:val="Hyperlink"/>
-                <w:rFonts w:ascii="Times New Roman" w:hAnsi="Times New Roman"/>
-              </w:rPr>
-              <w:t>8.</w:t>
-            </w:r>
-            <w:r>
-              <w:rPr>
-                <w:rFonts w:ascii="Times New Roman" w:eastAsiaTheme="minorEastAsia" w:hAnsi="Times New Roman"/>
-                <w:kern w:val="2"/>
-                <w:szCs w:val="24"/>
-                <w14:ligatures w14:val="standardContextual"/>
-              </w:rPr>
-              <w:tab/>
-            </w:r>
-            <w:r>
-              <w:rPr>
-                <w:rStyle w:val="Hyperlink"/>
-                <w:rFonts w:ascii="Times New Roman" w:hAnsi="Times New Roman"/>
-              </w:rPr>
-              <w:t>References</w:t>
-            </w:r>
-            <w:r>
-              <w:rPr>
-                <w:rFonts w:ascii="Times New Roman" w:hAnsi="Times New Roman"/>
-                <w:webHidden/>
-              </w:rPr>
-              <w:tab/>
-            </w:r>
-            <w:r>
-              <w:rPr>
-                <w:rFonts w:ascii="Times New Roman" w:hAnsi="Times New Roman"/>
-                <w:webHidden/>
-              </w:rPr>
-              <w:fldChar w:fldCharType="begin"/>
-            </w:r>
-            <w:r>
-              <w:rPr>
-                <w:rFonts w:ascii="Times New Roman" w:hAnsi="Times New Roman"/>
-                <w:webHidden/>
-              </w:rPr>
-              <w:instrText xml:space="preserve"> PAGEREF _Toc196150940 \h </w:instrText>
-            </w:r>
-            <w:r>
-              <w:rPr>
-                <w:rFonts w:ascii="Times New Roman" w:hAnsi="Times New Roman"/>
-                <w:webHidden/>
-              </w:rPr>
-            </w:r>
-            <w:r>
-              <w:rPr>
-                <w:rFonts w:ascii="Times New Roman" w:hAnsi="Times New Roman"/>
-                <w:webHidden/>
-              </w:rPr>
-              <w:fldChar w:fldCharType="separate"/>
-            </w:r>
-            <w:r>
-              <w:rPr>
-                <w:rFonts w:ascii="Times New Roman" w:hAnsi="Times New Roman"/>
-                <w:webHidden/>
-              </w:rPr>
-              <w:t>8</w:t>
-            </w:r>
-            <w:r>
-              <w:rPr>
-                <w:rFonts w:ascii="Times New Roman" w:hAnsi="Times New Roman"/>
+              <w:t>10</w:t>
+            </w:r>
+            <w:r>
+              <w:rPr>
+                <w:noProof/>
                 <w:webHidden/>
               </w:rPr>
               <w:fldChar w:fldCharType="end"/>
@@ -1904,7 +1898,6 @@
         </w:rPr>
       </w:pPr>
       <w:bookmarkStart w:id="5" w:name="_Toc87347698"/>
-      <w:bookmarkStart w:id="6" w:name="_Toc196150931"/>
     </w:p>
     <w:p>
       <w:pPr>
@@ -1920,6 +1913,7 @@
           <w:szCs w:val="18"/>
         </w:rPr>
       </w:pPr>
+      <w:bookmarkStart w:id="6" w:name="_Toc241185782"/>
       <w:r>
         <w:rPr>
           <w:rFonts w:ascii="Times New Roman" w:hAnsi="Times New Roman"/>
@@ -1945,74 +1939,39 @@
           <w:rFonts w:ascii="Times New Roman" w:hAnsi="Times New Roman"/>
           <w:szCs w:val="24"/>
         </w:rPr>
-        <w:t xml:space="preserve">Security Operations Centers (SOCs) receive thousands of alerts daily from network monitoring tools, yet the majority are false positives or low-priority events that still consume analyst time. This volume creates alert fatigue, a condition where analysts become desensitized and begin missing genuine threats, not because detection failed but because meaningful review at scale is not humanly possible. Existing automated tools, including rule-based Security Orchestration, Automation and Response (SOAR) platforms and machine learning scoring systems, address detection and ranking but do not take response actions and do not learn from outcomes. This project proposes ARSS, an Autonomous Response System for SOC, which sits at the Security Information and Event Management (SIEM) output layer and makes autonomous triage decisions using a Reinforcement Learning (RL) agent trained to choose one of four actions: Ignore, Log, Block, or Isolate. The agent's reward function is grounded in the MITRE </w:t>
-      </w:r>
+        <w:t xml:space="preserve">Security Operations Centers (SOCs) receive far more alerts than analysts can meaningfully review. Tariq et al. (2025) found that 51% of SOC teams report feeling overwhelmed by alert volume, and analysts resolve only 49% of alerts assigned to them within a workday. This is not a detection failure. The tools flagging alerts are working correctly. The unresolved problem </w:t>
+      </w:r>
+      <w:proofErr w:type="gramStart"/>
       <w:r>
         <w:rPr>
           <w:rFonts w:ascii="Times New Roman" w:hAnsi="Times New Roman"/>
           <w:szCs w:val="24"/>
         </w:rPr>
-        <w:t>Adversarial Tactics, Techniques, and Common Knowledge</w:t>
-      </w:r>
+        <w:t>sits downstream,</w:t>
+      </w:r>
+      <w:proofErr w:type="gramEnd"/>
       <w:r>
         <w:rPr>
           <w:rFonts w:ascii="Times New Roman" w:hAnsi="Times New Roman"/>
           <w:szCs w:val="24"/>
         </w:rPr>
-        <w:t xml:space="preserve"> (</w:t>
-      </w:r>
+        <w:t xml:space="preserve"> at the point of deciding what to </w:t>
+      </w:r>
+      <w:proofErr w:type="gramStart"/>
       <w:r>
         <w:rPr>
           <w:rFonts w:ascii="Times New Roman" w:hAnsi="Times New Roman"/>
           <w:szCs w:val="24"/>
         </w:rPr>
-        <w:t>ATT&amp;CK</w:t>
-      </w:r>
+        <w:t>actually do</w:t>
+      </w:r>
+      <w:proofErr w:type="gramEnd"/>
       <w:r>
         <w:rPr>
           <w:rFonts w:ascii="Times New Roman" w:hAnsi="Times New Roman"/>
           <w:szCs w:val="24"/>
         </w:rPr>
-        <w:t>)</w:t>
-      </w:r>
-      <w:r>
-        <w:rPr>
-          <w:rFonts w:ascii="Times New Roman" w:hAnsi="Times New Roman"/>
-          <w:szCs w:val="24"/>
-        </w:rPr>
-        <w:t xml:space="preserve"> framework, ensuring response decisions reflect real-world threat severity rather than abstract training costs. To build analyst trust, every decision is accompanied by a plain-English explanation generated by a Large Language Model (LLM), drawing on feature-level evidence from </w:t>
-      </w:r>
-      <w:proofErr w:type="spellStart"/>
-      <w:r>
-        <w:rPr>
-          <w:rFonts w:ascii="Times New Roman" w:hAnsi="Times New Roman"/>
-          <w:szCs w:val="24"/>
-        </w:rPr>
-        <w:t>SHapley</w:t>
-      </w:r>
-      <w:proofErr w:type="spellEnd"/>
-      <w:r>
-        <w:rPr>
-          <w:rFonts w:ascii="Times New Roman" w:hAnsi="Times New Roman"/>
-          <w:szCs w:val="24"/>
-        </w:rPr>
-        <w:t xml:space="preserve"> Additive </w:t>
-      </w:r>
-      <w:proofErr w:type="spellStart"/>
-      <w:r>
-        <w:rPr>
-          <w:rFonts w:ascii="Times New Roman" w:hAnsi="Times New Roman"/>
-          <w:szCs w:val="24"/>
-        </w:rPr>
-        <w:t>exPlanations</w:t>
-      </w:r>
-      <w:proofErr w:type="spellEnd"/>
-      <w:r>
-        <w:rPr>
-          <w:rFonts w:ascii="Times New Roman" w:hAnsi="Times New Roman"/>
-          <w:szCs w:val="24"/>
-        </w:rPr>
-        <w:t xml:space="preserve"> (SHAP) and the RL decision rationale, making every automated action auditable and verifiable by the analyst.</w:t>
+        <w:t xml:space="preserve"> with each alert, under a team's real, fluctuating operational capacity. Existing automated tools, including SIEM correlation engines, SOAR playbooks, and machine-learning risk scoring, decide what an alert deserves based solely on the alert's own properties. Checked directly against the technical documentation of more than a dozen major commercial platforms, including the newest agentic offerings, none of them let a team's current workload change what happens to an alert. This project proposes ARSS, a workload-adaptive alert-triage system that reads an alert's own risk profile together with the SOC's live operational state, including queue depth, arrival rate, and analyst capacity, and decides whether that alert should be closed automatically, deferred to a queue, or escalated to a human analyst immediately. A hard, learning-independent safety rule, external to the adaptive policy, guarantees that any alert scored as genuinely severe is always escalated regardless of current workload. The disposition decision itself is evaluated across five methods of increasing complexity: a static threshold, a supervised classifier, a learning-to-defer model, a contextual bandit, and offline reinforcement learning. This comparison demonstrates the value of learned adaptation empirically against real baselines, rather than assuming it in advance. Because no existing public dataset records live SOC workload alongside alert data, the system is trained and evaluated in a purpose-built simulation environment, generated from real network traffic and grounded in published research on operator workload from security operations and adjacent fields.</w:t>
       </w:r>
     </w:p>
     <w:p>
@@ -2316,14 +2275,13 @@
         </w:rPr>
       </w:pPr>
       <w:bookmarkStart w:id="7" w:name="_Toc87347699"/>
-      <w:bookmarkStart w:id="8" w:name="_Toc196150932"/>
+      <w:bookmarkStart w:id="8" w:name="_Toc241185783"/>
       <w:r>
         <w:rPr>
           <w:rFonts w:ascii="Times New Roman" w:hAnsi="Times New Roman"/>
           <w:sz w:val="32"/>
           <w:szCs w:val="18"/>
         </w:rPr>
-        <w:lastRenderedPageBreak/>
         <w:t>Introduction</w:t>
       </w:r>
       <w:bookmarkEnd w:id="7"/>
@@ -2336,7 +2294,15 @@
         <w:jc w:val="both"/>
       </w:pPr>
       <w:r>
-        <w:t>Security Operations Centers handle thousands of alerts daily from Intrusion Detection Systems (IDS), firewalls, and SIEM platforms. Detection tools have matured significantly: suspicious activity is flagged at scale and aggregated reliably. The problem that remains unsolved is triage, deciding what to actually do with each flagged alert before it reaches the analyst.</w:t>
+        <w:t xml:space="preserve">Security Operations Centers handle thousands of alerts daily from Intrusion Detection Systems (IDS), firewalls, and SIEM platforms. Detection technology has matured substantially. Modern classifiers, including well-tuned gradient-boosted models, reliably separate benign traffic from attacks and categorize confirmed attacks by type. The problem that remains unsolved is not detection. It is triage: deciding what </w:t>
+      </w:r>
+      <w:proofErr w:type="gramStart"/>
+      <w:r>
+        <w:t>actually happens</w:t>
+      </w:r>
+      <w:proofErr w:type="gramEnd"/>
+      <w:r>
+        <w:t xml:space="preserve"> to a flagged alert, under conditions where the number of alerts routinely exceeds the team's capacity to review them.</w:t>
       </w:r>
     </w:p>
     <w:p>
@@ -2346,7 +2312,23 @@
         <w:jc w:val="both"/>
       </w:pPr>
       <w:r>
-        <w:t>Existing Security Orchestration, Automation and Response (SOAR) tools address this through rule-based playbooks. These work well for known, anticipated attack patterns, but break down on new attack types and require manual updates every time the threat landscape shifts. Critically, they do not learn. When an analyst overrides a playbook decision, that correction is discarded. The system makes the same type of error again.</w:t>
+        <w:t xml:space="preserve">Existing tools address parts of this problem without addressing workload. SIEM platforms aggregate and correlate signals across sources. SOAR platforms go further and take real actions, including blocking and isolating, through pre-configured playbooks. Machine-learning risk scoring, rule-based and increasingly agentic, ranks or scores </w:t>
+      </w:r>
+      <w:proofErr w:type="gramStart"/>
+      <w:r>
+        <w:t>alerts</w:t>
+      </w:r>
+      <w:proofErr w:type="gramEnd"/>
+      <w:r>
+        <w:t xml:space="preserve"> by estimated danger. All of this is real, working technology. What none of it does, confirmed by checking the actual technical documentation of platforms including Splunk, Microsoft Sentinel, IBM </w:t>
+      </w:r>
+      <w:proofErr w:type="spellStart"/>
+      <w:r>
+        <w:t>QRadar</w:t>
+      </w:r>
+      <w:proofErr w:type="spellEnd"/>
+      <w:r>
+        <w:t>, Elastic, and Google SecOps, is let a team's current backlog change the decision. A playbook or a scoring model behaves identically whether the team has five open cases or five hundred.</w:t>
       </w:r>
     </w:p>
     <w:p>
@@ -2362,43 +2344,25 @@
         </w:rPr>
       </w:pPr>
       <w:r>
-        <w:t>ARSS sits at the SIEM output layer and replaces static playbooks with a trained RL policy. The policy takes the attack type, detection confidence, and danger score as input, and outputs a triage action. Because the reward function is grounded in the MITRE ATT&amp;CK framework, the agent learns that the cost of missing a Credential Access attack is far higher than missing a Reconnaissance scan. Every action is explained to the analyst in plain English through an LLM narrative, making the system auditable and trustworthy in a real SOC environment</w:t>
-      </w:r>
-      <w:r>
-        <w:t>.</w:t>
-      </w:r>
-      <w:r>
+        <w:t>ARSS sits downstream of the SIEM, reading its output, and adds specifically the one input confirmed missing everywhere: the SOC's live operational state. It does not perform network enforcement. Blocking and isolating remain the responsibility of the tools already built for that purpose. ARSS's own response to an alert is a disposition decision: close it automatically, defer it to a queue, or escalate it to a human analyst now. A severity floor, sitting outside the learned decision-making entirely, guarantees this adaptivity can never come at the cost of a genuinely severe alert being missed.</w:t>
+      </w:r>
+    </w:p>
+    <w:p>
+      <w:pPr>
+        <w:pStyle w:val="code-line"/>
+        <w:spacing w:before="0" w:beforeAutospacing="0" w:after="240" w:afterAutospacing="0"/>
+        <w:jc w:val="both"/>
         <w:rPr>
           <w:b/>
           <w:bCs/>
           <w:sz w:val="22"/>
           <w:szCs w:val="18"/>
         </w:rPr>
-        <w:tab/>
-      </w:r>
-    </w:p>
-    <w:p>
-      <w:pPr>
-        <w:pStyle w:val="code-line"/>
-        <w:spacing w:before="0" w:beforeAutospacing="0" w:after="240" w:afterAutospacing="0"/>
-        <w:jc w:val="both"/>
-        <w:rPr>
-          <w:b/>
-          <w:bCs/>
-          <w:sz w:val="22"/>
-          <w:szCs w:val="18"/>
-        </w:rPr>
-      </w:pPr>
-    </w:p>
-    <w:p>
-      <w:pPr>
-        <w:pStyle w:val="Heading1"/>
-        <w:spacing w:before="0" w:line="240" w:lineRule="auto"/>
-        <w:rPr>
-          <w:rFonts w:ascii="Times New Roman" w:hAnsi="Times New Roman"/>
-          <w:sz w:val="32"/>
-          <w:szCs w:val="18"/>
-        </w:rPr>
+      </w:pPr>
+    </w:p>
+    <w:p>
+      <w:pPr>
+        <w:pStyle w:val="Heading2"/>
       </w:pPr>
       <w:bookmarkStart w:id="9" w:name="_Toc440746948"/>
       <w:bookmarkStart w:id="10" w:name="_Toc440747337"/>
@@ -2406,13 +2370,8 @@
       <w:bookmarkStart w:id="12" w:name="_Toc488853127"/>
       <w:bookmarkStart w:id="13" w:name="_Toc506386181"/>
       <w:bookmarkStart w:id="14" w:name="_Toc87347700"/>
-      <w:bookmarkStart w:id="15" w:name="_Toc196150933"/>
-      <w:r>
-        <w:rPr>
-          <w:rFonts w:ascii="Times New Roman" w:hAnsi="Times New Roman"/>
-          <w:sz w:val="32"/>
-          <w:szCs w:val="18"/>
-        </w:rPr>
+      <w:bookmarkStart w:id="15" w:name="_Toc241185784"/>
+      <w:r>
         <w:t>Problem Statement</w:t>
       </w:r>
       <w:bookmarkEnd w:id="9"/>
@@ -2431,17 +2390,10 @@
       </w:pPr>
       <w:bookmarkStart w:id="16" w:name="_Hlk182671166"/>
       <w:r>
-        <w:t xml:space="preserve">SOC analysts routinely handle more alerts than they can meaningfully review. The vast majority are either benign or </w:t>
-      </w:r>
-      <w:proofErr w:type="gramStart"/>
-      <w:r>
-        <w:t>low-priority</w:t>
-      </w:r>
-      <w:proofErr w:type="gramEnd"/>
-      <w:r>
-        <w:t>, but no reliable automated system exists to separate and handle them without analyst involvement. Current rule-based SOAR tools are static and cannot adapt. Machine learning scoring systems rank alerts but do not take response actions. Neither approach learns from analyst feedback over time.</w:t>
-      </w:r>
-    </w:p>
+        <w:t>SOC analysts routinely handle more alerts than they can meaningfully review, and the gap is measured, not assumed. Over three-quarters of security teams report cutting staffing by half or more during nights, weekends, and holidays, and documented attack patterns show adversaries disproportionately timing real attacks for exactly those low-staffing windows. No existing triage mechanism, rule-based or learned, adjusts its behavior to that reality. A SOAR playbook that auto-closes low-severity alerts applies the same threshold at 3 AM on a skeleton crew as it does on a fully staffed Tuesday afternoon.</w:t>
+      </w:r>
+    </w:p>
+    <w:bookmarkEnd w:id="16"/>
     <w:p>
       <w:pPr>
         <w:pStyle w:val="code-line"/>
@@ -2449,12 +2401,8 @@
         <w:jc w:val="both"/>
       </w:pPr>
       <w:r>
-        <w:t>The deeper issue is that existing automated triage tools, including academic RL systems, optimize for abstract performance metrics disconnected from how security teams actually assess threats. A system whose decisions analysts cannot understand or verify will not be trusted or adopted, regardless of its accuracy numbers. There is a need for an adaptive triage agent that grounds its decisions in established threat intelligence, takes concrete response actions, and explains every decision in terms the analyst already understands</w:t>
-      </w:r>
-      <w:r>
-        <w:t>.</w:t>
-      </w:r>
-      <w:bookmarkEnd w:id="16"/>
+        <w:t>The broader idea of factoring workload into triage is not entirely unexplored. Prior work has proposed optimization-based reallocation of alerts across distributed SOC sites, and a static-capacity learning-to-defer model using real operational data. What has not been demonstrated is a system that makes the disposition decision autonomously, conditions that decision on a live, continuously updated measure of team capacity, and is evaluated as more than a replay of historical logs. That is the specific, narrow gap this project addresses, stated precisely so it can be checked rather than asserted as an unqualified claim that nobody has done this.</w:t>
+      </w:r>
     </w:p>
     <w:p>
       <w:pPr>
@@ -2507,13 +2455,7 @@
     </w:p>
     <w:p>
       <w:pPr>
-        <w:pStyle w:val="Heading1"/>
-        <w:spacing w:before="0" w:line="240" w:lineRule="auto"/>
-        <w:rPr>
-          <w:rFonts w:ascii="Times New Roman" w:hAnsi="Times New Roman"/>
-          <w:sz w:val="32"/>
-          <w:szCs w:val="18"/>
-        </w:rPr>
+        <w:pStyle w:val="Heading2"/>
       </w:pPr>
       <w:bookmarkStart w:id="17" w:name="_Toc440746949"/>
       <w:bookmarkStart w:id="18" w:name="_Toc440747338"/>
@@ -2521,14 +2463,8 @@
       <w:bookmarkStart w:id="20" w:name="_Toc488853128"/>
       <w:bookmarkStart w:id="21" w:name="_Toc506386182"/>
       <w:bookmarkStart w:id="22" w:name="_Toc87347701"/>
-      <w:bookmarkStart w:id="23" w:name="_Toc196150934"/>
-      <w:r>
-        <w:rPr>
-          <w:rFonts w:ascii="Times New Roman" w:hAnsi="Times New Roman"/>
-          <w:sz w:val="32"/>
-          <w:szCs w:val="18"/>
-        </w:rPr>
-        <w:lastRenderedPageBreak/>
+      <w:bookmarkStart w:id="23" w:name="_Toc241185785"/>
+      <w:r>
         <w:t>Problem Solution</w:t>
       </w:r>
       <w:bookmarkEnd w:id="17"/>
@@ -2537,441 +2473,443 @@
       <w:bookmarkEnd w:id="20"/>
       <w:bookmarkEnd w:id="21"/>
       <w:r>
+        <w:t>/Objectives</w:t>
+      </w:r>
+      <w:r>
+        <w:t xml:space="preserve"> </w:t>
+      </w:r>
+      <w:r>
+        <w:t>of the</w:t>
+      </w:r>
+      <w:r>
+        <w:t xml:space="preserve"> Proposed System</w:t>
+      </w:r>
+      <w:bookmarkEnd w:id="22"/>
+      <w:bookmarkEnd w:id="23"/>
+    </w:p>
+    <w:p>
+      <w:pPr>
+        <w:pStyle w:val="code-line"/>
+        <w:spacing w:before="0" w:beforeAutospacing="0" w:after="240" w:afterAutospacing="0"/>
+        <w:jc w:val="both"/>
+      </w:pPr>
+      <w:bookmarkStart w:id="24" w:name="_Toc87347702"/>
+      <w:r>
+        <w:t xml:space="preserve">ARSS is composed of six functional components. An ingestion layer normalizes incoming alerts from different source formats and determines whether an alert already carries usable severity, category, and confidence information from an upstream correlation layer, or requires scoring from raw signal. An alert-understanding component, the project's two-stage detection ensemble combining </w:t>
+      </w:r>
+      <w:proofErr w:type="spellStart"/>
+      <w:r>
+        <w:t>XGBoost</w:t>
+      </w:r>
+      <w:proofErr w:type="spellEnd"/>
+      <w:r>
+        <w:t xml:space="preserve"> with a Deep Neural Network, produces a danger score, an attack category, and a confidence value for alerts that require scoring.</w:t>
+      </w:r>
+    </w:p>
+    <w:p>
+      <w:pPr>
+        <w:pStyle w:val="code-line"/>
+        <w:spacing w:before="0" w:beforeAutospacing="0" w:after="240" w:afterAutospacing="0"/>
+        <w:jc w:val="both"/>
+      </w:pPr>
+      <w:r>
+        <w:t>A SOC-state tracking component maintains a live, multi-signal picture of the team's current operational load, including queue depth, arrival rate, severity-weighted burden, and staleness of pending alerts. This tracking is built to be checked against a real source of truth on a schedule rather than trusted as a single, unverified running count. A severity floor, external to any learned component, escalates a genuinely severe alert immediately regardless of the state of the queue. An adaptive disposition policy, evaluated across five candidate methods, makes the actual triage call for alerts that do not trigger the floor. A feedback mechanism records whether each decision held up, and that record is used to improve the policy over time.</w:t>
+      </w:r>
+    </w:p>
+    <w:p>
+      <w:pPr>
+        <w:pStyle w:val="Heading3"/>
+      </w:pPr>
+      <w:bookmarkStart w:id="25" w:name="_Toc241185786"/>
+      <w:r>
+        <w:t>Objectives</w:t>
+      </w:r>
+      <w:bookmarkEnd w:id="24"/>
+      <w:bookmarkEnd w:id="25"/>
+    </w:p>
+    <w:p>
+      <w:pPr>
+        <w:pStyle w:val="code-line"/>
+        <w:spacing w:before="0" w:beforeAutospacing="0" w:after="240" w:afterAutospacing="0"/>
+        <w:jc w:val="both"/>
+        <w:rPr>
+          <w:i/>
+          <w:iCs/>
+        </w:rPr>
+      </w:pPr>
+      <w:bookmarkStart w:id="26" w:name="_Toc506386183"/>
+      <w:bookmarkStart w:id="27" w:name="_Toc87347703"/>
+      <w:bookmarkStart w:id="28" w:name="_Toc518865259"/>
+      <w:r>
+        <w:rPr>
+          <w:rStyle w:val="Strong"/>
+          <w:i/>
+          <w:iCs/>
+        </w:rPr>
+        <w:t>To reuse and validate the project's existing two-stage detection ensemble (</w:t>
+      </w:r>
+      <w:proofErr w:type="spellStart"/>
+      <w:r>
+        <w:rPr>
+          <w:rStyle w:val="Strong"/>
+          <w:i/>
+          <w:iCs/>
+        </w:rPr>
+        <w:t>XGBoost</w:t>
+      </w:r>
+      <w:proofErr w:type="spellEnd"/>
+      <w:r>
+        <w:rPr>
+          <w:rStyle w:val="Strong"/>
+          <w:i/>
+          <w:iCs/>
+        </w:rPr>
+        <w:t xml:space="preserve"> + DNN) as the alert-scoring component, benchmarked against comparable published results on related network/IoT intrusion-detection datasets</w:t>
+      </w:r>
+      <w:r>
+        <w:rPr>
+          <w:rStyle w:val="Strong"/>
+          <w:b w:val="0"/>
+          <w:bCs w:val="0"/>
+          <w:i/>
+          <w:iCs/>
+        </w:rPr>
+        <w:t xml:space="preserve"> [14]</w:t>
+      </w:r>
+      <w:r>
+        <w:rPr>
+          <w:i/>
+          <w:iCs/>
+        </w:rPr>
+        <w:t>.</w:t>
+      </w:r>
+    </w:p>
+    <w:p>
+      <w:pPr>
+        <w:pStyle w:val="code-line"/>
+        <w:spacing w:before="0" w:beforeAutospacing="0" w:after="240" w:afterAutospacing="0"/>
+        <w:jc w:val="both"/>
+        <w:rPr>
+          <w:i/>
+          <w:iCs/>
+        </w:rPr>
+      </w:pPr>
+      <w:r>
+        <w:rPr>
+          <w:rStyle w:val="Strong"/>
+          <w:i/>
+          <w:iCs/>
+        </w:rPr>
+        <w:t>To design a SOC-state representation combining alert arrival rate, queue depth, severity-weighted burden, and alert staleness, and to build a discrete-event simulation environment capable of generating realistic training and evaluation data, since no existing public dataset records live SOC workload</w:t>
+      </w:r>
+      <w:r>
+        <w:rPr>
+          <w:i/>
+          <w:iCs/>
+        </w:rPr>
+        <w:t>.</w:t>
+      </w:r>
+    </w:p>
+    <w:p>
+      <w:pPr>
+        <w:pStyle w:val="code-line"/>
+        <w:spacing w:before="0" w:beforeAutospacing="0" w:after="240" w:afterAutospacing="0"/>
+        <w:jc w:val="both"/>
+        <w:rPr>
+          <w:i/>
+          <w:iCs/>
+        </w:rPr>
+      </w:pPr>
+      <w:r>
+        <w:rPr>
+          <w:rStyle w:val="Strong"/>
+          <w:i/>
+          <w:iCs/>
+        </w:rPr>
+        <w:t xml:space="preserve">To implement a severity floor as a hard, non-learned constraint that guarantees escalation of </w:t>
+      </w:r>
+      <w:proofErr w:type="gramStart"/>
+      <w:r>
+        <w:rPr>
+          <w:rStyle w:val="Strong"/>
+          <w:i/>
+          <w:iCs/>
+        </w:rPr>
+        <w:t>high-severity</w:t>
+      </w:r>
+      <w:proofErr w:type="gramEnd"/>
+      <w:r>
+        <w:rPr>
+          <w:rStyle w:val="Strong"/>
+          <w:i/>
+          <w:iCs/>
+        </w:rPr>
+        <w:t xml:space="preserve"> alerts independent of the adaptive policy's output</w:t>
+      </w:r>
+      <w:r>
+        <w:rPr>
+          <w:i/>
+          <w:iCs/>
+        </w:rPr>
+        <w:t>.</w:t>
+      </w:r>
+    </w:p>
+    <w:p>
+      <w:pPr>
+        <w:pStyle w:val="code-line"/>
+        <w:spacing w:before="0" w:beforeAutospacing="0" w:after="240" w:afterAutospacing="0"/>
+        <w:jc w:val="both"/>
+        <w:rPr>
+          <w:i/>
+          <w:iCs/>
+        </w:rPr>
+      </w:pPr>
+      <w:r>
+        <w:rPr>
+          <w:rStyle w:val="Strong"/>
+          <w:i/>
+          <w:iCs/>
+        </w:rPr>
+        <w:t xml:space="preserve">To implement and empirically compare five triage-decision methods, a static threshold, a supervised classifier, a learning-to-defer model, a contextual bandit, and offline reinforcement learning, under identical simulated conditions, </w:t>
+      </w:r>
+      <w:r>
+        <w:rPr>
+          <w:rStyle w:val="Strong"/>
+          <w:i/>
+          <w:iCs/>
+        </w:rPr>
+        <w:t xml:space="preserve">using Conservative Q-Learning and discrete Batch-Constrained Q-Learning as the candidate offline-RL algorithms [15, 16], </w:t>
+      </w:r>
+      <w:r>
+        <w:rPr>
+          <w:rStyle w:val="Strong"/>
+          <w:i/>
+          <w:iCs/>
+        </w:rPr>
+        <w:t>so that the method used in the final system is selected by evidence rather than assumed in advance</w:t>
+      </w:r>
+      <w:r>
+        <w:rPr>
+          <w:i/>
+          <w:iCs/>
+        </w:rPr>
+        <w:t>.</w:t>
+      </w:r>
+    </w:p>
+    <w:p>
+      <w:pPr>
+        <w:pStyle w:val="code-line"/>
+        <w:spacing w:before="0" w:beforeAutospacing="0" w:after="240" w:afterAutospacing="0"/>
+        <w:jc w:val="both"/>
+        <w:rPr>
+          <w:i/>
+          <w:iCs/>
+        </w:rPr>
+      </w:pPr>
+      <w:r>
+        <w:rPr>
+          <w:rStyle w:val="Strong"/>
+          <w:i/>
+          <w:iCs/>
+        </w:rPr>
+        <w:lastRenderedPageBreak/>
+        <w:t>To test the falsifiable hypothesis that workload-adaptive triage reduces analyst review burden during periods of high alert load without a statistically significant increase in missed high-severity alerts, relative to workload-blind baselines</w:t>
+      </w:r>
+      <w:r>
+        <w:rPr>
+          <w:i/>
+          <w:iCs/>
+        </w:rPr>
+        <w:t>.</w:t>
+      </w:r>
+    </w:p>
+    <w:p>
+      <w:pPr>
+        <w:pStyle w:val="code-line"/>
+        <w:spacing w:before="0" w:beforeAutospacing="0" w:after="240" w:afterAutospacing="0"/>
+        <w:jc w:val="both"/>
+        <w:rPr>
+          <w:i/>
+          <w:iCs/>
+        </w:rPr>
+      </w:pPr>
+      <w:r>
+        <w:rPr>
+          <w:rStyle w:val="Strong"/>
+          <w:i/>
+          <w:iCs/>
+        </w:rPr>
+        <w:t>To evaluate the adaptive policy's resilience against deliberate manipulation of the workload signal, consistent with documented "Informational Denial-of-Service" attack patterns in the literature</w:t>
+      </w:r>
+      <w:r>
+        <w:rPr>
+          <w:rStyle w:val="Strong"/>
+          <w:b w:val="0"/>
+          <w:bCs w:val="0"/>
+          <w:i/>
+          <w:iCs/>
+        </w:rPr>
+        <w:t xml:space="preserve"> [4], hardened through adversarial training in the state-adversarial MDP framework [17, 18]</w:t>
+      </w:r>
+      <w:r>
+        <w:rPr>
+          <w:i/>
+          <w:iCs/>
+        </w:rPr>
+        <w:t>.</w:t>
+      </w:r>
+    </w:p>
+    <w:p>
+      <w:pPr>
+        <w:pStyle w:val="code-line"/>
+        <w:spacing w:before="0" w:beforeAutospacing="0" w:after="240" w:afterAutospacing="0"/>
+        <w:jc w:val="both"/>
+        <w:rPr>
+          <w:i/>
+          <w:iCs/>
+        </w:rPr>
+      </w:pPr>
+    </w:p>
+    <w:p>
+      <w:pPr>
+        <w:pStyle w:val="code-line"/>
+        <w:spacing w:before="0" w:beforeAutospacing="0" w:after="240" w:afterAutospacing="0"/>
+        <w:jc w:val="both"/>
+        <w:rPr>
+          <w:i/>
+          <w:iCs/>
+        </w:rPr>
+      </w:pPr>
+    </w:p>
+    <w:p>
+      <w:pPr>
+        <w:pStyle w:val="code-line"/>
+        <w:spacing w:before="0" w:beforeAutospacing="0" w:after="240" w:afterAutospacing="0"/>
+        <w:jc w:val="both"/>
+        <w:rPr>
+          <w:i/>
+          <w:iCs/>
+        </w:rPr>
+      </w:pPr>
+    </w:p>
+    <w:p>
+      <w:pPr>
+        <w:pStyle w:val="code-line"/>
+        <w:spacing w:before="0" w:beforeAutospacing="0" w:after="240" w:afterAutospacing="0"/>
+        <w:jc w:val="both"/>
+        <w:rPr>
+          <w:i/>
+          <w:iCs/>
+        </w:rPr>
+      </w:pPr>
+    </w:p>
+    <w:p>
+      <w:pPr>
+        <w:pStyle w:val="code-line"/>
+        <w:spacing w:before="0" w:beforeAutospacing="0" w:after="240" w:afterAutospacing="0"/>
+        <w:jc w:val="both"/>
+        <w:rPr>
+          <w:i/>
+          <w:iCs/>
+        </w:rPr>
+      </w:pPr>
+    </w:p>
+    <w:p>
+      <w:pPr>
+        <w:pStyle w:val="code-line"/>
+        <w:spacing w:before="0" w:beforeAutospacing="0" w:after="240" w:afterAutospacing="0"/>
+        <w:jc w:val="both"/>
+        <w:rPr>
+          <w:i/>
+          <w:iCs/>
+        </w:rPr>
+      </w:pPr>
+    </w:p>
+    <w:p>
+      <w:pPr>
+        <w:pStyle w:val="code-line"/>
+        <w:spacing w:before="0" w:beforeAutospacing="0" w:after="240" w:afterAutospacing="0"/>
+        <w:jc w:val="both"/>
+        <w:rPr>
+          <w:i/>
+          <w:iCs/>
+        </w:rPr>
+      </w:pPr>
+    </w:p>
+    <w:p>
+      <w:pPr>
+        <w:pStyle w:val="code-line"/>
+        <w:spacing w:before="0" w:beforeAutospacing="0" w:after="240" w:afterAutospacing="0"/>
+        <w:jc w:val="both"/>
+        <w:rPr>
+          <w:i/>
+          <w:iCs/>
+        </w:rPr>
+      </w:pPr>
+    </w:p>
+    <w:p>
+      <w:pPr>
+        <w:pStyle w:val="Heading1"/>
+        <w:spacing w:before="0" w:line="240" w:lineRule="auto"/>
         <w:rPr>
           <w:rFonts w:ascii="Times New Roman" w:hAnsi="Times New Roman"/>
           <w:sz w:val="32"/>
           <w:szCs w:val="18"/>
         </w:rPr>
-        <w:t>/Objectives</w:t>
-      </w:r>
+      </w:pPr>
+      <w:bookmarkStart w:id="29" w:name="_Toc241185787"/>
       <w:r>
         <w:rPr>
           <w:rFonts w:ascii="Times New Roman" w:hAnsi="Times New Roman"/>
           <w:sz w:val="32"/>
           <w:szCs w:val="18"/>
         </w:rPr>
-        <w:t xml:space="preserve"> </w:t>
-      </w:r>
-      <w:r>
-        <w:rPr>
-          <w:rFonts w:ascii="Times New Roman" w:hAnsi="Times New Roman"/>
-          <w:sz w:val="32"/>
-          <w:szCs w:val="18"/>
-        </w:rPr>
-        <w:t>of the</w:t>
-      </w:r>
-      <w:r>
-        <w:rPr>
-          <w:rFonts w:ascii="Times New Roman" w:hAnsi="Times New Roman"/>
-          <w:sz w:val="32"/>
-          <w:szCs w:val="18"/>
-        </w:rPr>
-        <w:t xml:space="preserve"> Proposed System</w:t>
-      </w:r>
-      <w:bookmarkEnd w:id="22"/>
-      <w:bookmarkEnd w:id="23"/>
-    </w:p>
-    <w:p>
-      <w:pPr>
-        <w:pStyle w:val="code-line"/>
-        <w:spacing w:before="0" w:beforeAutospacing="0" w:after="240" w:afterAutospacing="0"/>
-        <w:jc w:val="both"/>
-      </w:pPr>
-      <w:bookmarkStart w:id="24" w:name="_Toc87347702"/>
-      <w:r>
-        <w:t>ARSS addresses this through three components. A two-stage detection ensemble (</w:t>
-      </w:r>
-      <w:proofErr w:type="spellStart"/>
-      <w:r>
-        <w:t>XGBoost</w:t>
-      </w:r>
-      <w:proofErr w:type="spellEnd"/>
-      <w:r>
-        <w:t xml:space="preserve"> + Deep Neural Network (DNN)) classifies incoming network flows as benign or attack, then categorizes confirmed attacks into seven types with a confidence score. These stages serve as training infrastructure; in deployment, the SIEM provides equivalent data directly.</w:t>
-      </w:r>
-    </w:p>
-    <w:p>
-      <w:pPr>
-        <w:pStyle w:val="code-line"/>
-        <w:spacing w:before="0" w:beforeAutospacing="0" w:after="240" w:afterAutospacing="0"/>
-        <w:jc w:val="both"/>
-      </w:pPr>
-      <w:r>
-        <w:t xml:space="preserve">A </w:t>
-      </w:r>
-      <w:r>
-        <w:t>Deep Learning</w:t>
-      </w:r>
-      <w:r>
-        <w:t xml:space="preserve"> triage agent receives a state vector of danger score, attack category, and classification confidence, and outputs one of four response actions. The reward function uses MITRE ATT&amp;CK severity weights, so missed high-severity attacks are penalized proportionally to their real-world impact. A Cognitive Semantic Layer then combines SHAP feature attributions from the detector with the RL decision and passes both to an LLM, which generates a short plain-English incident narrative displayed on the SOC dashboard.</w:t>
-      </w:r>
-    </w:p>
-    <w:p>
-      <w:pPr>
-        <w:pStyle w:val="Heading2"/>
-        <w:rPr>
-          <w:rFonts w:ascii="Times New Roman" w:hAnsi="Times New Roman"/>
-        </w:rPr>
-      </w:pPr>
-      <w:bookmarkStart w:id="25" w:name="_Toc196150935"/>
-      <w:r>
-        <w:rPr>
-          <w:rFonts w:ascii="Times New Roman" w:hAnsi="Times New Roman"/>
-        </w:rPr>
-        <w:t>Objectives</w:t>
-      </w:r>
-      <w:bookmarkEnd w:id="24"/>
-      <w:bookmarkEnd w:id="25"/>
-    </w:p>
-    <w:p>
-      <w:pPr>
-        <w:pStyle w:val="code-line"/>
-        <w:spacing w:before="0" w:beforeAutospacing="0" w:after="240" w:afterAutospacing="0"/>
-        <w:jc w:val="both"/>
-        <w:rPr>
-          <w:i/>
-          <w:iCs/>
-        </w:rPr>
-      </w:pPr>
-      <w:bookmarkStart w:id="26" w:name="_Toc506386183"/>
-      <w:bookmarkStart w:id="27" w:name="_Toc87347703"/>
-      <w:bookmarkStart w:id="28" w:name="_Toc518865259"/>
-      <w:r>
-        <w:rPr>
-          <w:rStyle w:val="Strong"/>
-          <w:i/>
-          <w:iCs/>
-        </w:rPr>
-        <w:t>BO-1:</w:t>
-      </w:r>
-      <w:r>
-        <w:rPr>
-          <w:i/>
-          <w:iCs/>
-        </w:rPr>
-        <w:t> </w:t>
-      </w:r>
-      <w:r>
-        <w:rPr>
-          <w:i/>
-          <w:iCs/>
-        </w:rPr>
-        <w:t>To build a two-stage ML ensemble that classifies network flows and produces attack category labels with confidence scores for RL state construction.</w:t>
-      </w:r>
-    </w:p>
-    <w:p>
-      <w:pPr>
-        <w:pStyle w:val="code-line"/>
-        <w:spacing w:before="0" w:beforeAutospacing="0" w:after="240" w:afterAutospacing="0"/>
-        <w:jc w:val="both"/>
-        <w:rPr>
-          <w:i/>
-          <w:iCs/>
-        </w:rPr>
-      </w:pPr>
-      <w:r>
-        <w:rPr>
-          <w:rStyle w:val="Strong"/>
-          <w:i/>
-          <w:iCs/>
-        </w:rPr>
-        <w:t>BO-2:</w:t>
-      </w:r>
-      <w:r>
-        <w:rPr>
-          <w:i/>
-          <w:iCs/>
-        </w:rPr>
-        <w:t> </w:t>
-      </w:r>
-      <w:r>
-        <w:rPr>
-          <w:i/>
-          <w:iCs/>
-        </w:rPr>
-        <w:t>To design a category-conditioned RL state space encoding danger score, attack category, and classification confidence, enabling category-specific response policies</w:t>
-      </w:r>
-      <w:r>
-        <w:rPr>
-          <w:i/>
-          <w:iCs/>
-        </w:rPr>
-        <w:t>.</w:t>
-      </w:r>
-    </w:p>
-    <w:p>
-      <w:pPr>
-        <w:pStyle w:val="code-line"/>
-        <w:spacing w:before="0" w:beforeAutospacing="0" w:after="240" w:afterAutospacing="0"/>
-        <w:jc w:val="both"/>
-        <w:rPr>
-          <w:i/>
-          <w:iCs/>
-        </w:rPr>
-      </w:pPr>
-      <w:r>
-        <w:rPr>
-          <w:rStyle w:val="Strong"/>
-          <w:i/>
-          <w:iCs/>
-        </w:rPr>
-        <w:t>BO-3:</w:t>
-      </w:r>
-      <w:r>
-        <w:rPr>
-          <w:i/>
-          <w:iCs/>
-        </w:rPr>
-        <w:t> </w:t>
-      </w:r>
-      <w:r>
-        <w:rPr>
-          <w:i/>
-          <w:iCs/>
-        </w:rPr>
-        <w:t xml:space="preserve">To train a </w:t>
-      </w:r>
-      <w:r>
-        <w:rPr>
-          <w:i/>
-          <w:iCs/>
-        </w:rPr>
-        <w:t>Deep Learning</w:t>
-      </w:r>
-      <w:r>
-        <w:rPr>
-          <w:i/>
-          <w:iCs/>
-        </w:rPr>
-        <w:t xml:space="preserve"> agent with a MITRE ATT&amp;CK severity-weighted reward function that optimizes the tradeoff between analyst workload reduction and threat containment.</w:t>
-      </w:r>
-    </w:p>
-    <w:p>
-      <w:pPr>
-        <w:pStyle w:val="code-line"/>
-        <w:spacing w:before="0" w:beforeAutospacing="0" w:after="240" w:afterAutospacing="0"/>
-        <w:jc w:val="both"/>
-        <w:rPr>
-          <w:i/>
-          <w:iCs/>
-        </w:rPr>
-      </w:pPr>
-      <w:r>
-        <w:rPr>
-          <w:rStyle w:val="Strong"/>
-          <w:i/>
-          <w:iCs/>
-        </w:rPr>
-        <w:t>BO-4:</w:t>
-      </w:r>
-      <w:r>
-        <w:rPr>
-          <w:i/>
-          <w:iCs/>
-        </w:rPr>
-        <w:t> </w:t>
-      </w:r>
-      <w:r>
-        <w:rPr>
-          <w:i/>
-          <w:iCs/>
-        </w:rPr>
-        <w:t>To implement a Cognitive Semantic Layer using an LLM to generate plain-English incident narratives from SHAP attributions and RL decisions for the SOC dashboard.</w:t>
-      </w:r>
-    </w:p>
-    <w:p>
-      <w:pPr>
-        <w:pStyle w:val="code-line"/>
-        <w:spacing w:before="0" w:beforeAutospacing="0" w:after="240" w:afterAutospacing="0"/>
-        <w:jc w:val="both"/>
-        <w:rPr>
-          <w:i/>
-          <w:iCs/>
-        </w:rPr>
-      </w:pPr>
-      <w:r>
-        <w:rPr>
-          <w:rStyle w:val="Strong"/>
-          <w:i/>
-          <w:iCs/>
-        </w:rPr>
-        <w:t>BO-5:</w:t>
-      </w:r>
-      <w:r>
-        <w:rPr>
-          <w:i/>
-          <w:iCs/>
-        </w:rPr>
-        <w:t> </w:t>
-      </w:r>
-      <w:r>
-        <w:rPr>
-          <w:i/>
-          <w:iCs/>
-        </w:rPr>
-        <w:t>To evaluate the system on the CIC-</w:t>
-      </w:r>
-      <w:proofErr w:type="spellStart"/>
-      <w:r>
-        <w:rPr>
-          <w:i/>
-          <w:iCs/>
-        </w:rPr>
-        <w:t>IIoT</w:t>
-      </w:r>
-      <w:proofErr w:type="spellEnd"/>
-      <w:r>
-        <w:rPr>
-          <w:i/>
-          <w:iCs/>
-        </w:rPr>
-        <w:t xml:space="preserve"> 2025 dataset and demonstrate measurable reduction in analyst-escalated alerts without proportional loss in threat containment.</w:t>
-      </w:r>
-    </w:p>
-    <w:p>
-      <w:pPr>
-        <w:pStyle w:val="code-line"/>
-        <w:spacing w:before="0" w:beforeAutospacing="0" w:after="240" w:afterAutospacing="0"/>
-        <w:jc w:val="both"/>
-        <w:rPr>
-          <w:i/>
-          <w:iCs/>
-        </w:rPr>
-      </w:pPr>
-      <w:r>
-        <w:rPr>
-          <w:rStyle w:val="Strong"/>
-          <w:i/>
-          <w:iCs/>
-        </w:rPr>
-        <w:t>BO-6:</w:t>
-      </w:r>
-      <w:r>
-        <w:rPr>
-          <w:i/>
-          <w:iCs/>
-        </w:rPr>
-        <w:t> </w:t>
-      </w:r>
-      <w:r>
-        <w:rPr>
-          <w:i/>
-          <w:iCs/>
-        </w:rPr>
-        <w:t>To compare the RL agent against a rule-based threshold baseline to establish the contribution of the learned policy.</w:t>
-      </w:r>
-    </w:p>
-    <w:p>
-      <w:pPr>
-        <w:pStyle w:val="code-line"/>
-        <w:spacing w:before="0" w:beforeAutospacing="0" w:after="240" w:afterAutospacing="0"/>
-        <w:jc w:val="both"/>
-        <w:rPr>
-          <w:i/>
-          <w:iCs/>
-        </w:rPr>
-      </w:pPr>
-    </w:p>
-    <w:p>
-      <w:pPr>
-        <w:pStyle w:val="code-line"/>
-        <w:spacing w:before="0" w:beforeAutospacing="0" w:after="240" w:afterAutospacing="0"/>
-        <w:jc w:val="both"/>
-        <w:rPr>
-          <w:i/>
-          <w:iCs/>
-        </w:rPr>
-      </w:pPr>
-    </w:p>
-    <w:p>
-      <w:pPr>
-        <w:pStyle w:val="code-line"/>
-        <w:spacing w:before="0" w:beforeAutospacing="0" w:after="240" w:afterAutospacing="0"/>
-        <w:jc w:val="both"/>
-        <w:rPr>
-          <w:i/>
-          <w:iCs/>
-        </w:rPr>
-      </w:pPr>
-    </w:p>
-    <w:p>
-      <w:pPr>
-        <w:pStyle w:val="code-line"/>
-        <w:spacing w:before="0" w:beforeAutospacing="0" w:after="240" w:afterAutospacing="0"/>
-        <w:jc w:val="both"/>
-        <w:rPr>
-          <w:i/>
-          <w:iCs/>
-        </w:rPr>
-      </w:pPr>
-    </w:p>
-    <w:p>
-      <w:pPr>
-        <w:pStyle w:val="code-line"/>
-        <w:spacing w:before="0" w:beforeAutospacing="0" w:after="240" w:afterAutospacing="0"/>
-        <w:jc w:val="both"/>
-        <w:rPr>
-          <w:i/>
-          <w:iCs/>
-        </w:rPr>
-      </w:pPr>
-    </w:p>
-    <w:p>
-      <w:pPr>
-        <w:pStyle w:val="code-line"/>
-        <w:spacing w:before="0" w:beforeAutospacing="0" w:after="240" w:afterAutospacing="0"/>
-        <w:jc w:val="both"/>
-        <w:rPr>
-          <w:i/>
-          <w:iCs/>
-        </w:rPr>
-      </w:pPr>
-    </w:p>
-    <w:p>
-      <w:pPr>
-        <w:pStyle w:val="code-line"/>
-        <w:spacing w:before="0" w:beforeAutospacing="0" w:after="240" w:afterAutospacing="0"/>
-        <w:jc w:val="both"/>
-        <w:rPr>
-          <w:i/>
-          <w:iCs/>
-        </w:rPr>
-      </w:pPr>
-    </w:p>
-    <w:p>
-      <w:pPr>
-        <w:pStyle w:val="code-line"/>
-        <w:spacing w:before="0" w:beforeAutospacing="0" w:after="240" w:afterAutospacing="0"/>
-        <w:jc w:val="both"/>
-        <w:rPr>
-          <w:i/>
-          <w:iCs/>
-        </w:rPr>
-      </w:pPr>
-    </w:p>
-    <w:p>
-      <w:pPr>
-        <w:pStyle w:val="Heading1"/>
-        <w:spacing w:before="0" w:line="240" w:lineRule="auto"/>
-        <w:rPr>
-          <w:rFonts w:ascii="Times New Roman" w:hAnsi="Times New Roman"/>
-          <w:sz w:val="32"/>
-          <w:szCs w:val="18"/>
-        </w:rPr>
-      </w:pPr>
-      <w:bookmarkStart w:id="29" w:name="_Toc196150936"/>
-      <w:r>
-        <w:rPr>
-          <w:rFonts w:ascii="Times New Roman" w:hAnsi="Times New Roman"/>
-          <w:sz w:val="32"/>
-          <w:szCs w:val="18"/>
-        </w:rPr>
-        <w:lastRenderedPageBreak/>
         <w:t>Related System Analysis/Literature Review</w:t>
       </w:r>
       <w:bookmarkEnd w:id="26"/>
       <w:bookmarkEnd w:id="27"/>
       <w:bookmarkEnd w:id="29"/>
+    </w:p>
+    <w:p>
+      <w:pPr>
+        <w:rPr>
+          <w:rFonts w:ascii="Times New Roman" w:hAnsi="Times New Roman"/>
+        </w:rPr>
+      </w:pPr>
+      <w:r>
+        <w:rPr>
+          <w:rFonts w:ascii="Times New Roman" w:hAnsi="Times New Roman"/>
+        </w:rPr>
+        <w:t xml:space="preserve">An earlier version of this document centered its literature review on a different lineage of RL-based alert-prioritization work: SAC-AP (Chavali et al., IEEE CEC 2022), TD3-AP (Chavali et al., Computers &amp; Security 2024), KNAP (Chavali et al., AINA 2024), </w:t>
+      </w:r>
+      <w:proofErr w:type="spellStart"/>
+      <w:r>
+        <w:rPr>
+          <w:rFonts w:ascii="Times New Roman" w:hAnsi="Times New Roman"/>
+        </w:rPr>
+        <w:t>AlertPro</w:t>
+      </w:r>
+      <w:proofErr w:type="spellEnd"/>
+      <w:r>
+        <w:rPr>
+          <w:rFonts w:ascii="Times New Roman" w:hAnsi="Times New Roman"/>
+        </w:rPr>
+        <w:t xml:space="preserve"> (Wang et al., Computers &amp; Security 2024), the A2C automation-mode framework (Chhetri et al., ACM TOIT 2024), and </w:t>
+      </w:r>
+      <w:proofErr w:type="spellStart"/>
+      <w:r>
+        <w:rPr>
+          <w:rFonts w:ascii="Times New Roman" w:hAnsi="Times New Roman"/>
+        </w:rPr>
+        <w:t>MITREtrieval</w:t>
+      </w:r>
+      <w:proofErr w:type="spellEnd"/>
+      <w:r>
+        <w:rPr>
+          <w:rFonts w:ascii="Times New Roman" w:hAnsi="Times New Roman"/>
+        </w:rPr>
+        <w:t xml:space="preserve"> (Huang et al., IEEE TNSM 2024). That review remains valid work and is not being discarded. It was reviewed and verified during this project's literature process, but it is no longer the central comparison, since these systems address continuous alert-priority ranking grounded in a MITRE ATT&amp;CK reward, which was the project's earlier direction before a full technical reset. They remain genuinely adjacent literature, cited below for completeness rather than as the project's closest prior art, which Table 1 addresses directly with the papers most relevant to the current, workload-adaptive triage direction.</w:t>
+      </w:r>
     </w:p>
     <w:p>
       <w:pPr>
@@ -3239,7 +3177,7 @@
                 <w:rFonts w:ascii="Times New Roman" w:hAnsi="Times New Roman"/>
                 <w:sz w:val="20"/>
               </w:rPr>
-              <w:t>SAC-AP -- Chavali et al., IEEE CEC 2022 [2]</w:t>
+              <w:t>Alert Fatigue Survey (Tariq et al., ACM CSUR 2025) [1]</w:t>
             </w:r>
           </w:p>
         </w:tc>
@@ -3270,7 +3208,7 @@
                 <w:rFonts w:ascii="Times New Roman" w:hAnsi="Times New Roman"/>
                 <w:sz w:val="20"/>
               </w:rPr>
-              <w:t>Soft Actor-Critic RL for alert prioritization. ~16% gain over DDPG.</w:t>
+              <w:t>Systematic review; 51% of SOC teams report feeling overwhelmed, 49% alert resolution rate.</w:t>
             </w:r>
           </w:p>
         </w:tc>
@@ -3301,7 +3239,7 @@
                 <w:rFonts w:ascii="Times New Roman" w:hAnsi="Times New Roman"/>
                 <w:sz w:val="20"/>
               </w:rPr>
-              <w:t>Synthetic game-theoretic reward. Ranking output only, no response actions.</w:t>
+              <w:t>Survey only, no implementation.</w:t>
             </w:r>
           </w:p>
         </w:tc>
@@ -3332,7 +3270,7 @@
                 <w:rFonts w:ascii="Times New Roman" w:hAnsi="Times New Roman"/>
                 <w:sz w:val="20"/>
               </w:rPr>
-              <w:t>ARSS uses MITRE ATT&amp;CK reward and outputs discrete response actions.</w:t>
+              <w:t>Establishes the motivating problem and its scale. Bibliographic entry verified; the exact wording of the 51%/49% figures within the paper itself is pending a direct re-check past ACM's access restriction (see note under References).</w:t>
             </w:r>
           </w:p>
         </w:tc>
@@ -3365,7 +3303,7 @@
                 <w:rFonts w:ascii="Times New Roman" w:hAnsi="Times New Roman"/>
                 <w:sz w:val="20"/>
               </w:rPr>
-              <w:t>TD3-AP -- Chavali et al., Computers &amp; Security 2024 [3]</w:t>
+              <w:t>Lázaro et al., AIAI 2026 [2]</w:t>
             </w:r>
           </w:p>
         </w:tc>
@@ -3396,7 +3334,15 @@
                 <w:rFonts w:ascii="Times New Roman" w:hAnsi="Times New Roman"/>
                 <w:sz w:val="20"/>
               </w:rPr>
-              <w:t>Extends SAC-AP with TD3. Validated on real IDS datasets.</w:t>
+              <w:t xml:space="preserve">Supervised classifier incorporating workload </w:t>
+            </w:r>
+            <w:r>
+              <w:rPr>
+                <w:rFonts w:ascii="Times New Roman" w:hAnsi="Times New Roman"/>
+                <w:sz w:val="20"/>
+              </w:rPr>
+              <w:lastRenderedPageBreak/>
+              <w:t>features, evaluated on real GMV CERT/SOC operational data over a 16-month period.</w:t>
             </w:r>
           </w:p>
         </w:tc>
@@ -3427,7 +3373,32 @@
                 <w:rFonts w:ascii="Times New Roman" w:hAnsi="Times New Roman"/>
                 <w:sz w:val="20"/>
               </w:rPr>
-              <w:t>Same abstract reward. No CTI grounding, no response actions.</w:t>
+              <w:lastRenderedPageBreak/>
+              <w:t xml:space="preserve">Advisory tool. Final decisions remain with the </w:t>
+            </w:r>
+            <w:r>
+              <w:rPr>
+                <w:rFonts w:ascii="Times New Roman" w:hAnsi="Times New Roman"/>
+                <w:sz w:val="20"/>
+              </w:rPr>
+              <w:lastRenderedPageBreak/>
+              <w:t xml:space="preserve">human operator, confirmed verbatim in the paper. Evaluated via a chronological </w:t>
+            </w:r>
+            <w:proofErr w:type="spellStart"/>
+            <w:r>
+              <w:rPr>
+                <w:rFonts w:ascii="Times New Roman" w:hAnsi="Times New Roman"/>
+                <w:sz w:val="20"/>
+              </w:rPr>
+              <w:t>backtest</w:t>
+            </w:r>
+            <w:proofErr w:type="spellEnd"/>
+            <w:r>
+              <w:rPr>
+                <w:rFonts w:ascii="Times New Roman" w:hAnsi="Times New Roman"/>
+                <w:sz w:val="20"/>
+              </w:rPr>
+              <w:t xml:space="preserve"> explicitly designed to mimic deployment, not a live closed loop.</w:t>
             </w:r>
           </w:p>
         </w:tc>
@@ -3458,7 +3429,16 @@
                 <w:rFonts w:ascii="Times New Roman" w:hAnsi="Times New Roman"/>
                 <w:sz w:val="20"/>
               </w:rPr>
-              <w:t>ARSS adopts off-policy RL but grounds reward in MITRE ATT&amp;CK with 4-action output.</w:t>
+              <w:lastRenderedPageBreak/>
+              <w:t xml:space="preserve">The closest published work to ARSS's problem. ARSS differs </w:t>
+            </w:r>
+            <w:r>
+              <w:rPr>
+                <w:rFonts w:ascii="Times New Roman" w:hAnsi="Times New Roman"/>
+                <w:sz w:val="20"/>
+              </w:rPr>
+              <w:lastRenderedPageBreak/>
+              <w:t>specifically on autonomy and live evaluation, not on the broad idea of using workload as a feature.</w:t>
             </w:r>
           </w:p>
         </w:tc>
@@ -3491,7 +3471,8 @@
                 <w:rFonts w:ascii="Times New Roman" w:hAnsi="Times New Roman"/>
                 <w:sz w:val="20"/>
               </w:rPr>
-              <w:t>KNAP -- Chavali et al., AINA 2024 [4]</w:t>
+              <w:lastRenderedPageBreak/>
+              <w:t>Tong et al., AAAI 2020 [3]</w:t>
             </w:r>
           </w:p>
         </w:tc>
@@ -3522,7 +3503,23 @@
                 <w:rFonts w:ascii="Times New Roman" w:hAnsi="Times New Roman"/>
                 <w:sz w:val="20"/>
               </w:rPr>
-              <w:t>Attack graph knowledge injection into DRL. Better sample efficiency.</w:t>
+              <w:t xml:space="preserve">RL trained </w:t>
+            </w:r>
+            <w:proofErr w:type="spellStart"/>
+            <w:r>
+              <w:rPr>
+                <w:rFonts w:ascii="Times New Roman" w:hAnsi="Times New Roman"/>
+                <w:sz w:val="20"/>
+              </w:rPr>
+              <w:t>adversarially</w:t>
+            </w:r>
+            <w:proofErr w:type="spellEnd"/>
+            <w:r>
+              <w:rPr>
+                <w:rFonts w:ascii="Times New Roman" w:hAnsi="Times New Roman"/>
+                <w:sz w:val="20"/>
+              </w:rPr>
+              <w:t xml:space="preserve"> against a strategic attacker under an alert-investigation budget constraint, via double-oracle equilibrium computation.</w:t>
             </w:r>
           </w:p>
         </w:tc>
@@ -3553,7 +3550,23 @@
                 <w:rFonts w:ascii="Times New Roman" w:hAnsi="Times New Roman"/>
                 <w:sz w:val="20"/>
               </w:rPr>
-              <w:t>Custom heuristic knowledge, not an established threat framework. No response actions.</w:t>
+              <w:t xml:space="preserve">Budget is a fixed constant, never observed by the policy as state. Alert queue resets every period; no </w:t>
+            </w:r>
+            <w:proofErr w:type="gramStart"/>
+            <w:r>
+              <w:rPr>
+                <w:rFonts w:ascii="Times New Roman" w:hAnsi="Times New Roman"/>
+                <w:sz w:val="20"/>
+              </w:rPr>
+              <w:t>persistent</w:t>
+            </w:r>
+            <w:proofErr w:type="gramEnd"/>
+            <w:r>
+              <w:rPr>
+                <w:rFonts w:ascii="Times New Roman" w:hAnsi="Times New Roman"/>
+                <w:sz w:val="20"/>
+              </w:rPr>
+              <w:t>, accumulating backlog.</w:t>
             </w:r>
           </w:p>
         </w:tc>
@@ -3584,7 +3597,7 @@
                 <w:rFonts w:ascii="Times New Roman" w:hAnsi="Times New Roman"/>
                 <w:sz w:val="20"/>
               </w:rPr>
-              <w:t>ARSS uses MITRE ATT&amp;CK as the knowledge source instead of a custom heuristic.</w:t>
+              <w:t>The closest published work combining RL and adversarial training for alert allocation. ARSS differs specifically by making live capacity an observed state feature and by modeling a persistent backlog.</w:t>
             </w:r>
           </w:p>
         </w:tc>
@@ -3612,21 +3625,12 @@
                 <w:rFonts w:ascii="Times New Roman" w:hAnsi="Times New Roman"/>
               </w:rPr>
             </w:pPr>
-            <w:proofErr w:type="spellStart"/>
             <w:r>
               <w:rPr>
                 <w:rFonts w:ascii="Times New Roman" w:hAnsi="Times New Roman"/>
                 <w:sz w:val="20"/>
               </w:rPr>
-              <w:t>AlertPro</w:t>
-            </w:r>
-            <w:proofErr w:type="spellEnd"/>
-            <w:r>
-              <w:rPr>
-                <w:rFonts w:ascii="Times New Roman" w:hAnsi="Times New Roman"/>
-                <w:sz w:val="20"/>
-              </w:rPr>
-              <w:t xml:space="preserve"> -- Wang et al., Computers &amp; Security 2024 [5]</w:t>
+              <w:t>RADAMS (Huang &amp; Zhu, Computers &amp; Security 2022) [4]</w:t>
             </w:r>
           </w:p>
         </w:tc>
@@ -3657,7 +3661,23 @@
                 <w:rFonts w:ascii="Times New Roman" w:hAnsi="Times New Roman"/>
                 <w:sz w:val="20"/>
               </w:rPr>
-              <w:t>RL with analyst feedback for alert re-ranking. Sub-500ms latency.</w:t>
+              <w:t>RL-based attention-management policy defending against Informational Denial-of-Service (</w:t>
+            </w:r>
+            <w:proofErr w:type="spellStart"/>
+            <w:r>
+              <w:rPr>
+                <w:rFonts w:ascii="Times New Roman" w:hAnsi="Times New Roman"/>
+                <w:sz w:val="20"/>
+              </w:rPr>
+              <w:t>IDoS</w:t>
+            </w:r>
+            <w:proofErr w:type="spellEnd"/>
+            <w:r>
+              <w:rPr>
+                <w:rFonts w:ascii="Times New Roman" w:hAnsi="Times New Roman"/>
+                <w:sz w:val="20"/>
+              </w:rPr>
+              <w:t>) attacks, where an attacker floods the system with low-cost feint alerts to hide real ones.</w:t>
             </w:r>
           </w:p>
         </w:tc>
@@ -3688,7 +3708,7 @@
                 <w:rFonts w:ascii="Times New Roman" w:hAnsi="Times New Roman"/>
                 <w:sz w:val="20"/>
               </w:rPr>
-              <w:t>Binary feedback signal, no severity weighting. Ranking only, no response actions.</w:t>
+              <w:t>Validated only in simulation, never against real SOC data or human operators.</w:t>
             </w:r>
           </w:p>
         </w:tc>
@@ -3719,7 +3739,7 @@
                 <w:rFonts w:ascii="Times New Roman" w:hAnsi="Times New Roman"/>
                 <w:sz w:val="20"/>
               </w:rPr>
-              <w:t>ARSS adds MITRE severity-weighted feedback and a discrete 4-action response space.</w:t>
+              <w:t>Formally names and models the exact adversarial threat ARSS's policy is hardened against; informs the adversarial-training approach.</w:t>
             </w:r>
           </w:p>
         </w:tc>
@@ -3752,7 +3772,7 @@
                 <w:rFonts w:ascii="Times New Roman" w:hAnsi="Times New Roman"/>
                 <w:sz w:val="20"/>
               </w:rPr>
-              <w:t>RADAMS -- Huang &amp; Zhu, Computers &amp; Security 2022 [6]</w:t>
+              <w:t>Shah et al., IEEE TIFS 2019 / IEEE TPDS 2020 [5]</w:t>
             </w:r>
           </w:p>
         </w:tc>
@@ -3783,23 +3803,7 @@
                 <w:rFonts w:ascii="Times New Roman" w:hAnsi="Times New Roman"/>
                 <w:sz w:val="20"/>
               </w:rPr>
-              <w:t xml:space="preserve">RL alert de-emphasis against flooding. 95.89% </w:t>
-            </w:r>
-            <w:proofErr w:type="gramStart"/>
-            <w:r>
-              <w:rPr>
-                <w:rFonts w:ascii="Times New Roman" w:hAnsi="Times New Roman"/>
-                <w:sz w:val="20"/>
-              </w:rPr>
-              <w:t>recall</w:t>
-            </w:r>
-            <w:proofErr w:type="gramEnd"/>
-            <w:r>
-              <w:rPr>
-                <w:rFonts w:ascii="Times New Roman" w:hAnsi="Times New Roman"/>
-                <w:sz w:val="20"/>
-              </w:rPr>
-              <w:t xml:space="preserve"> on 500K+ alerts.</w:t>
+              <w:t>Optimization-based (non-learned) reallocation of alerts across geographically distributed CSOC sites in response to site-level load.</w:t>
             </w:r>
           </w:p>
         </w:tc>
@@ -3830,7 +3834,7 @@
                 <w:rFonts w:ascii="Times New Roman" w:hAnsi="Times New Roman"/>
                 <w:sz w:val="20"/>
               </w:rPr>
-              <w:t>Attention management only. No response actions, no CTI grounding.</w:t>
+              <w:t>Site-to-site load balancing, not a per-alert, per-decision workload-adaptive policy.</w:t>
             </w:r>
           </w:p>
         </w:tc>
@@ -3861,7 +3865,7 @@
                 <w:rFonts w:ascii="Times New Roman" w:hAnsi="Times New Roman"/>
                 <w:sz w:val="20"/>
               </w:rPr>
-              <w:t>ARSS takes actual response actions. LOG covers deferral; Block and Isolate cover autonomous response.</w:t>
+              <w:t>Real, directly relevant prior art for "capacity-aware triage" at a coarser granularity, cited honestly rather than omitted.</w:t>
             </w:r>
           </w:p>
         </w:tc>
@@ -3889,12 +3893,21 @@
                 <w:rFonts w:ascii="Times New Roman" w:hAnsi="Times New Roman"/>
               </w:rPr>
             </w:pPr>
+            <w:proofErr w:type="spellStart"/>
             <w:r>
               <w:rPr>
                 <w:rFonts w:ascii="Times New Roman" w:hAnsi="Times New Roman"/>
                 <w:sz w:val="20"/>
               </w:rPr>
-              <w:t>Alert Fatigue Survey -- Tariq et al., ACM CSUR 2025 [1]</w:t>
+              <w:t>Jalalvand</w:t>
+            </w:r>
+            <w:proofErr w:type="spellEnd"/>
+            <w:r>
+              <w:rPr>
+                <w:rFonts w:ascii="Times New Roman" w:hAnsi="Times New Roman"/>
+                <w:sz w:val="20"/>
+              </w:rPr>
+              <w:t xml:space="preserve"> et al. (CSIRO), 2025 [6]</w:t>
             </w:r>
           </w:p>
         </w:tc>
@@ -3925,7 +3938,7 @@
                 <w:rFonts w:ascii="Times New Roman" w:hAnsi="Times New Roman"/>
                 <w:sz w:val="20"/>
               </w:rPr>
-              <w:t>Systematic review. 4,484 alerts/day, 67% uninvestigated. Flags RL at triage layer as underexplored.</w:t>
+              <w:t>Deep reinforcement learning for learning-to-defer, trained with analyst feedback.</w:t>
             </w:r>
           </w:p>
         </w:tc>
@@ -3956,7 +3969,7 @@
                 <w:rFonts w:ascii="Times New Roman" w:hAnsi="Times New Roman"/>
                 <w:sz w:val="20"/>
               </w:rPr>
-              <w:t>Survey only, no implementation.</w:t>
+              <w:t>Analyst capacity modeled as a fixed time budget that does not change during a run.</w:t>
             </w:r>
           </w:p>
         </w:tc>
@@ -3987,7 +4000,23 @@
                 <w:rFonts w:ascii="Times New Roman" w:hAnsi="Times New Roman"/>
                 <w:sz w:val="20"/>
               </w:rPr>
-              <w:t>Establishes the problem ARSS solves and confirms the gap is peer-recognized.</w:t>
+              <w:t xml:space="preserve">Reinforces the precise novelty claim: ARSS conditions its decision on a </w:t>
+            </w:r>
+            <w:proofErr w:type="gramStart"/>
+            <w:r>
+              <w:rPr>
+                <w:rFonts w:ascii="Times New Roman" w:hAnsi="Times New Roman"/>
+                <w:sz w:val="20"/>
+              </w:rPr>
+              <w:t>live</w:t>
+            </w:r>
+            <w:proofErr w:type="gramEnd"/>
+            <w:r>
+              <w:rPr>
+                <w:rFonts w:ascii="Times New Roman" w:hAnsi="Times New Roman"/>
+                <w:sz w:val="20"/>
+              </w:rPr>
+              <w:t>, changing capacity signal, which this closely related work does not.</w:t>
             </w:r>
           </w:p>
         </w:tc>
@@ -4020,23 +4049,7 @@
                 <w:rFonts w:ascii="Times New Roman" w:hAnsi="Times New Roman"/>
                 <w:sz w:val="20"/>
               </w:rPr>
-              <w:t xml:space="preserve">Alert Prioritization Survey -- </w:t>
-            </w:r>
-            <w:proofErr w:type="spellStart"/>
-            <w:r>
-              <w:rPr>
-                <w:rFonts w:ascii="Times New Roman" w:hAnsi="Times New Roman"/>
-                <w:sz w:val="20"/>
-              </w:rPr>
-              <w:t>Jalalvand</w:t>
-            </w:r>
-            <w:proofErr w:type="spellEnd"/>
-            <w:r>
-              <w:rPr>
-                <w:rFonts w:ascii="Times New Roman" w:hAnsi="Times New Roman"/>
-                <w:sz w:val="20"/>
-              </w:rPr>
-              <w:t xml:space="preserve"> et al., ACM CSUR 2024 [7]</w:t>
+              <w:t>Adaptive Incident Prioritization at Scale (Microsoft Security Research, CCS 2026) [7]</w:t>
             </w:r>
           </w:p>
         </w:tc>
@@ -4067,7 +4080,7 @@
                 <w:rFonts w:ascii="Times New Roman" w:hAnsi="Times New Roman"/>
                 <w:sz w:val="20"/>
               </w:rPr>
-              <w:t>Taxonomy of prioritization methods. Flags CTI-grounded RL as least-explored.</w:t>
+              <w:t>Real production system, evaluated on 1,000 customer organizations and 473,000 organization-days of queue telemetry.</w:t>
             </w:r>
           </w:p>
         </w:tc>
@@ -4093,12 +4106,21 @@
                 <w:rFonts w:ascii="Times New Roman" w:hAnsi="Times New Roman"/>
               </w:rPr>
             </w:pPr>
+            <w:proofErr w:type="gramStart"/>
             <w:r>
               <w:rPr>
                 <w:rFonts w:ascii="Times New Roman" w:hAnsi="Times New Roman"/>
                 <w:sz w:val="20"/>
               </w:rPr>
-              <w:t>Survey only, no implementation.</w:t>
+              <w:t>Confirmed,</w:t>
+            </w:r>
+            <w:proofErr w:type="gramEnd"/>
+            <w:r>
+              <w:rPr>
+                <w:rFonts w:ascii="Times New Roman" w:hAnsi="Times New Roman"/>
+                <w:sz w:val="20"/>
+              </w:rPr>
+              <w:t xml:space="preserve"> directly from the model description: prioritization never conditions on queue depth, analyst availability, or arrival rate, despite being described as adaptive.</w:t>
             </w:r>
           </w:p>
         </w:tc>
@@ -4129,7 +4151,7 @@
                 <w:rFonts w:ascii="Times New Roman" w:hAnsi="Times New Roman"/>
                 <w:sz w:val="20"/>
               </w:rPr>
-              <w:t>Confirms ARSS sits in an identified, unaddressed gap in the solution space.</w:t>
+              <w:t>Independent, large-scale, real-production confirmation that the workload-blindness gap ARSS addresses is not merely a research artifact.</w:t>
             </w:r>
           </w:p>
         </w:tc>
@@ -4162,7 +4184,7 @@
                 <w:rFonts w:ascii="Times New Roman" w:hAnsi="Times New Roman"/>
                 <w:sz w:val="20"/>
               </w:rPr>
-              <w:t>A2C Framework -- Chhetri et al., ACM TOIT 2024 [8]</w:t>
+              <w:t>Commercial platform survey (13+ platforms)</w:t>
             </w:r>
           </w:p>
         </w:tc>
@@ -4193,7 +4215,23 @@
                 <w:rFonts w:ascii="Times New Roman" w:hAnsi="Times New Roman"/>
                 <w:sz w:val="20"/>
               </w:rPr>
-              <w:t>Automate-Augment-Collaborate framework for SOC automation modes.</w:t>
+              <w:t xml:space="preserve">Splunk, Microsoft Sentinel, IBM </w:t>
+            </w:r>
+            <w:proofErr w:type="spellStart"/>
+            <w:r>
+              <w:rPr>
+                <w:rFonts w:ascii="Times New Roman" w:hAnsi="Times New Roman"/>
+                <w:sz w:val="20"/>
+              </w:rPr>
+              <w:t>QRadar</w:t>
+            </w:r>
+            <w:proofErr w:type="spellEnd"/>
+            <w:r>
+              <w:rPr>
+                <w:rFonts w:ascii="Times New Roman" w:hAnsi="Times New Roman"/>
+                <w:sz w:val="20"/>
+              </w:rPr>
+              <w:t>, Elastic, Google SecOps, and other major SOC platforms, checked directly against their own technical documentation.</w:t>
             </w:r>
           </w:p>
         </w:tc>
@@ -4224,7 +4262,7 @@
                 <w:rFonts w:ascii="Times New Roman" w:hAnsi="Times New Roman"/>
                 <w:sz w:val="20"/>
               </w:rPr>
-              <w:t>Conceptual only, no RL policy.</w:t>
+              <w:t>Confirmed absent in every platform checked: none allow current team workload to change an alert's scoring or disposition.</w:t>
             </w:r>
           </w:p>
         </w:tc>
@@ -4255,7 +4293,125 @@
                 <w:rFonts w:ascii="Times New Roman" w:hAnsi="Times New Roman"/>
                 <w:sz w:val="20"/>
               </w:rPr>
-              <w:t>ARSS operationalizes A2C: LOG = Collaborate, remaining actions = Automate.</w:t>
+              <w:t>Establishes that the gap ARSS addresses is real in current commercial practice, not only in the academic literature.</w:t>
+            </w:r>
+          </w:p>
+        </w:tc>
+      </w:tr>
+    </w:tbl>
+    <w:p>
+      <w:pPr>
+        <w:spacing w:line="240" w:lineRule="auto"/>
+        <w:jc w:val="both"/>
+        <w:rPr>
+          <w:rFonts w:ascii="Times New Roman" w:hAnsi="Times New Roman"/>
+          <w:b/>
+          <w:sz w:val="22"/>
+          <w:szCs w:val="18"/>
+        </w:rPr>
+      </w:pPr>
+    </w:p>
+    <w:p>
+      <w:pPr>
+        <w:spacing w:line="240" w:lineRule="auto"/>
+        <w:jc w:val="both"/>
+        <w:rPr>
+          <w:rFonts w:ascii="Times New Roman" w:hAnsi="Times New Roman"/>
+          <w:b/>
+          <w:sz w:val="22"/>
+          <w:szCs w:val="18"/>
+        </w:rPr>
+      </w:pPr>
+    </w:p>
+    <w:p>
+      <w:pPr>
+        <w:rPr>
+          <w:rFonts w:ascii="Times New Roman" w:hAnsi="Times New Roman"/>
+          <w:b/>
+        </w:rPr>
+      </w:pPr>
+      <w:r>
+        <w:rPr>
+          <w:rFonts w:ascii="Times New Roman" w:hAnsi="Times New Roman"/>
+          <w:b/>
+        </w:rPr>
+        <w:t>Table 1b: Adjacent Literature Reviewed Under the Project's Earlier Direction</w:t>
+      </w:r>
+    </w:p>
+    <w:tbl>
+      <w:tblPr>
+        <w:tblW w:w="0" w:type="auto"/>
+        <w:tblLook w:val="04A0" w:firstRow="1" w:lastRow="0" w:firstColumn="1" w:lastColumn="0" w:noHBand="0" w:noVBand="1"/>
+      </w:tblPr>
+      <w:tblGrid>
+        <w:gridCol w:w="3101"/>
+        <w:gridCol w:w="3101"/>
+        <w:gridCol w:w="3102"/>
+      </w:tblGrid>
+      <w:tr>
+        <w:tc>
+          <w:tcPr>
+            <w:tcW w:w="3101" w:type="dxa"/>
+          </w:tcPr>
+          <w:p>
+            <w:pPr>
+              <w:spacing w:line="240" w:lineRule="auto"/>
+              <w:jc w:val="both"/>
+              <w:rPr>
+                <w:rFonts w:ascii="Times New Roman" w:hAnsi="Times New Roman"/>
+                <w:b/>
+              </w:rPr>
+            </w:pPr>
+            <w:r>
+              <w:rPr>
+                <w:rFonts w:ascii="Times New Roman" w:hAnsi="Times New Roman"/>
+                <w:b/>
+              </w:rPr>
+              <w:t>Application Name</w:t>
+            </w:r>
+          </w:p>
+        </w:tc>
+        <w:tc>
+          <w:tcPr>
+            <w:tcW w:w="3101" w:type="dxa"/>
+          </w:tcPr>
+          <w:p>
+            <w:pPr>
+              <w:spacing w:line="240" w:lineRule="auto"/>
+              <w:jc w:val="both"/>
+              <w:rPr>
+                <w:rFonts w:ascii="Times New Roman" w:hAnsi="Times New Roman"/>
+                <w:b/>
+              </w:rPr>
+            </w:pPr>
+            <w:r>
+              <w:rPr>
+                <w:rFonts w:ascii="Times New Roman" w:hAnsi="Times New Roman"/>
+                <w:b/>
+              </w:rPr>
+              <w:t>Features</w:t>
+            </w:r>
+          </w:p>
+        </w:tc>
+        <w:tc>
+          <w:tcPr>
+            <w:tcW w:w="3102" w:type="dxa"/>
+          </w:tcPr>
+          <w:p>
+            <w:pPr>
+              <w:spacing w:line="240" w:lineRule="auto"/>
+              <w:jc w:val="both"/>
+              <w:rPr>
+                <w:rFonts w:ascii="Times New Roman" w:hAnsi="Times New Roman"/>
+                <w:b/>
+              </w:rPr>
+            </w:pPr>
+            <w:r>
+              <w:rPr>
+                <w:rFonts w:ascii="Times New Roman" w:hAnsi="Times New Roman"/>
+                <w:b/>
+              </w:rPr>
+              <w:t>Note</w:t>
             </w:r>
           </w:p>
         </w:tc>
@@ -4263,134 +4419,84 @@
       <w:tr>
         <w:tc>
           <w:tcPr>
-            <w:tcW w:w="1980" w:type="dxa"/>
-            <w:tcBorders>
-              <w:top w:val="single" w:sz="4" w:space="0" w:color="000000"/>
-              <w:left w:val="single" w:sz="4" w:space="0" w:color="000000"/>
-              <w:bottom w:val="single" w:sz="4" w:space="0" w:color="000000"/>
-              <w:right w:val="single" w:sz="4" w:space="0" w:color="000000"/>
-            </w:tcBorders>
-            <w:tcMar>
-              <w:top w:w="60" w:type="dxa"/>
-              <w:left w:w="80" w:type="dxa"/>
-              <w:bottom w:w="60" w:type="dxa"/>
-              <w:right w:w="80" w:type="dxa"/>
-            </w:tcMar>
+            <w:tcW w:w="3101" w:type="dxa"/>
           </w:tcPr>
           <w:p>
             <w:pPr>
-              <w:rPr>
-                <w:rFonts w:ascii="Times New Roman" w:hAnsi="Times New Roman"/>
+              <w:spacing w:line="240" w:lineRule="auto"/>
+              <w:jc w:val="both"/>
+              <w:rPr>
+                <w:rFonts w:ascii="Times New Roman" w:hAnsi="Times New Roman"/>
+                <w:b/>
               </w:rPr>
             </w:pPr>
-            <w:proofErr w:type="spellStart"/>
-            <w:r>
-              <w:rPr>
-                <w:rFonts w:ascii="Times New Roman" w:hAnsi="Times New Roman"/>
-                <w:sz w:val="20"/>
-              </w:rPr>
-              <w:t>MITREtrieval</w:t>
-            </w:r>
-            <w:proofErr w:type="spellEnd"/>
-            <w:r>
-              <w:rPr>
-                <w:rFonts w:ascii="Times New Roman" w:hAnsi="Times New Roman"/>
-                <w:sz w:val="20"/>
-              </w:rPr>
-              <w:t xml:space="preserve"> -- Huang et al., IEEE TNSM 2024 [9]</w:t>
+            <w:r>
+              <w:rPr>
+                <w:rFonts w:ascii="Times New Roman" w:hAnsi="Times New Roman"/>
+                <w:b/>
+              </w:rPr>
+              <w:lastRenderedPageBreak/>
+              <w:t>SAC-AP (Chavali et al., IEEE CEC 2022) [8]</w:t>
             </w:r>
           </w:p>
         </w:tc>
         <w:tc>
           <w:tcPr>
-            <w:tcW w:w="2430" w:type="dxa"/>
-            <w:tcBorders>
-              <w:top w:val="single" w:sz="4" w:space="0" w:color="000000"/>
-              <w:left w:val="single" w:sz="4" w:space="0" w:color="000000"/>
-              <w:bottom w:val="single" w:sz="4" w:space="0" w:color="000000"/>
-              <w:right w:val="single" w:sz="4" w:space="0" w:color="000000"/>
-            </w:tcBorders>
-            <w:tcMar>
-              <w:top w:w="60" w:type="dxa"/>
-              <w:left w:w="80" w:type="dxa"/>
-              <w:bottom w:w="60" w:type="dxa"/>
-              <w:right w:w="80" w:type="dxa"/>
-            </w:tcMar>
+            <w:tcW w:w="3101" w:type="dxa"/>
           </w:tcPr>
           <w:p>
             <w:pPr>
-              <w:rPr>
-                <w:rFonts w:ascii="Times New Roman" w:hAnsi="Times New Roman"/>
+              <w:spacing w:line="240" w:lineRule="auto"/>
+              <w:jc w:val="both"/>
+              <w:rPr>
+                <w:rFonts w:ascii="Times New Roman" w:hAnsi="Times New Roman"/>
+                <w:b/>
               </w:rPr>
             </w:pPr>
             <w:r>
               <w:rPr>
                 <w:rFonts w:ascii="Times New Roman" w:hAnsi="Times New Roman"/>
-                <w:sz w:val="20"/>
-              </w:rPr>
-              <w:t>BERT + MITRE ATT&amp;CK for TTP extraction from threat reports.</w:t>
+                <w:b/>
+              </w:rPr>
+              <w:t>Soft Actor-Critic RL for continuous alert-priority ranking.</w:t>
             </w:r>
           </w:p>
         </w:tc>
         <w:tc>
           <w:tcPr>
-            <w:tcW w:w="2285" w:type="dxa"/>
-            <w:tcBorders>
-              <w:top w:val="single" w:sz="4" w:space="0" w:color="000000"/>
-              <w:left w:val="single" w:sz="4" w:space="0" w:color="000000"/>
-              <w:bottom w:val="single" w:sz="4" w:space="0" w:color="000000"/>
-              <w:right w:val="single" w:sz="4" w:space="0" w:color="000000"/>
-            </w:tcBorders>
-            <w:tcMar>
-              <w:top w:w="60" w:type="dxa"/>
-              <w:left w:w="80" w:type="dxa"/>
-              <w:bottom w:w="60" w:type="dxa"/>
-              <w:right w:w="80" w:type="dxa"/>
-            </w:tcMar>
+            <w:tcW w:w="3102" w:type="dxa"/>
           </w:tcPr>
           <w:p>
             <w:pPr>
-              <w:rPr>
-                <w:rFonts w:ascii="Times New Roman" w:hAnsi="Times New Roman"/>
+              <w:spacing w:line="240" w:lineRule="auto"/>
+              <w:jc w:val="both"/>
+              <w:rPr>
+                <w:rFonts w:ascii="Times New Roman" w:hAnsi="Times New Roman"/>
+                <w:b/>
               </w:rPr>
             </w:pPr>
             <w:r>
               <w:rPr>
                 <w:rFonts w:ascii="Times New Roman" w:hAnsi="Times New Roman"/>
-                <w:sz w:val="20"/>
-              </w:rPr>
-              <w:t>Does not feed TTPs back into a triage policy or reward function.</w:t>
-            </w:r>
-          </w:p>
-        </w:tc>
-        <w:tc>
-          <w:tcPr>
-            <w:tcW w:w="2845" w:type="dxa"/>
-            <w:tcBorders>
-              <w:top w:val="single" w:sz="4" w:space="0" w:color="000000"/>
-              <w:left w:val="single" w:sz="4" w:space="0" w:color="000000"/>
-              <w:bottom w:val="single" w:sz="4" w:space="0" w:color="000000"/>
-              <w:right w:val="single" w:sz="4" w:space="0" w:color="000000"/>
-            </w:tcBorders>
-            <w:tcMar>
-              <w:top w:w="60" w:type="dxa"/>
-              <w:left w:w="80" w:type="dxa"/>
-              <w:bottom w:w="60" w:type="dxa"/>
-              <w:right w:w="80" w:type="dxa"/>
-            </w:tcMar>
-          </w:tcPr>
-          <w:p>
-            <w:pPr>
-              <w:rPr>
-                <w:rFonts w:ascii="Times New Roman" w:hAnsi="Times New Roman"/>
-              </w:rPr>
-            </w:pPr>
-            <w:r>
-              <w:rPr>
-                <w:rFonts w:ascii="Times New Roman" w:hAnsi="Times New Roman"/>
-                <w:sz w:val="20"/>
-              </w:rPr>
-              <w:t>Validates MITRE ATT&amp;CK as ML-compatible. ARSS uses it directly in the RL reward.</w:t>
+                <w:b/>
+              </w:rPr>
+              <w:t xml:space="preserve">Ranking output, not a discrete disposition decision; not </w:t>
+            </w:r>
+            <w:proofErr w:type="gramStart"/>
+            <w:r>
+              <w:rPr>
+                <w:rFonts w:ascii="Times New Roman" w:hAnsi="Times New Roman"/>
+                <w:b/>
+              </w:rPr>
+              <w:t>workload-conditioned</w:t>
+            </w:r>
+            <w:proofErr w:type="gramEnd"/>
+            <w:r>
+              <w:rPr>
+                <w:rFonts w:ascii="Times New Roman" w:hAnsi="Times New Roman"/>
+                <w:b/>
+              </w:rPr>
+              <w:t>.</w:t>
             </w:r>
           </w:p>
         </w:tc>
@@ -4398,125 +4504,389 @@
       <w:tr>
         <w:tc>
           <w:tcPr>
-            <w:tcW w:w="1980" w:type="dxa"/>
-            <w:tcBorders>
-              <w:top w:val="single" w:sz="4" w:space="0" w:color="000000"/>
-              <w:left w:val="single" w:sz="4" w:space="0" w:color="000000"/>
-              <w:bottom w:val="single" w:sz="4" w:space="0" w:color="000000"/>
-              <w:right w:val="single" w:sz="4" w:space="0" w:color="000000"/>
-            </w:tcBorders>
-            <w:tcMar>
-              <w:top w:w="60" w:type="dxa"/>
-              <w:left w:w="80" w:type="dxa"/>
-              <w:bottom w:w="60" w:type="dxa"/>
-              <w:right w:w="80" w:type="dxa"/>
-            </w:tcMar>
+            <w:tcW w:w="3101" w:type="dxa"/>
           </w:tcPr>
           <w:p>
             <w:pPr>
-              <w:rPr>
-                <w:rFonts w:ascii="Times New Roman" w:hAnsi="Times New Roman"/>
+              <w:spacing w:line="240" w:lineRule="auto"/>
+              <w:jc w:val="both"/>
+              <w:rPr>
+                <w:rFonts w:ascii="Times New Roman" w:hAnsi="Times New Roman"/>
+                <w:b/>
               </w:rPr>
             </w:pPr>
             <w:r>
               <w:rPr>
                 <w:rFonts w:ascii="Times New Roman" w:hAnsi="Times New Roman"/>
-                <w:sz w:val="20"/>
-              </w:rPr>
-              <w:t>CrowdStrike Charlotte AI -- Commercial, 2024 [10]</w:t>
+                <w:b/>
+              </w:rPr>
+              <w:t>TD3-AP (Chavali et al., Computers &amp; Security 2024) [9]</w:t>
             </w:r>
           </w:p>
         </w:tc>
         <w:tc>
           <w:tcPr>
-            <w:tcW w:w="2430" w:type="dxa"/>
-            <w:tcBorders>
-              <w:top w:val="single" w:sz="4" w:space="0" w:color="000000"/>
-              <w:left w:val="single" w:sz="4" w:space="0" w:color="000000"/>
-              <w:bottom w:val="single" w:sz="4" w:space="0" w:color="000000"/>
-              <w:right w:val="single" w:sz="4" w:space="0" w:color="000000"/>
-            </w:tcBorders>
-            <w:tcMar>
-              <w:top w:w="60" w:type="dxa"/>
-              <w:left w:w="80" w:type="dxa"/>
-              <w:bottom w:w="60" w:type="dxa"/>
-              <w:right w:w="80" w:type="dxa"/>
-            </w:tcMar>
+            <w:tcW w:w="3101" w:type="dxa"/>
           </w:tcPr>
           <w:p>
             <w:pPr>
-              <w:rPr>
-                <w:rFonts w:ascii="Times New Roman" w:hAnsi="Times New Roman"/>
+              <w:spacing w:line="240" w:lineRule="auto"/>
+              <w:jc w:val="both"/>
+              <w:rPr>
+                <w:rFonts w:ascii="Times New Roman" w:hAnsi="Times New Roman"/>
+                <w:b/>
               </w:rPr>
             </w:pPr>
             <w:r>
               <w:rPr>
                 <w:rFonts w:ascii="Times New Roman" w:hAnsi="Times New Roman"/>
-                <w:sz w:val="20"/>
-              </w:rPr>
-              <w:t>Imitation learning on analyst decisions. LLM explanation layer.</w:t>
+                <w:b/>
+              </w:rPr>
+              <w:t>Extends SAC-AP with TD3, validated on real IDS datasets.</w:t>
             </w:r>
           </w:p>
         </w:tc>
         <w:tc>
           <w:tcPr>
-            <w:tcW w:w="2285" w:type="dxa"/>
-            <w:tcBorders>
-              <w:top w:val="single" w:sz="4" w:space="0" w:color="000000"/>
-              <w:left w:val="single" w:sz="4" w:space="0" w:color="000000"/>
-              <w:bottom w:val="single" w:sz="4" w:space="0" w:color="000000"/>
-              <w:right w:val="single" w:sz="4" w:space="0" w:color="000000"/>
-            </w:tcBorders>
-            <w:tcMar>
-              <w:top w:w="60" w:type="dxa"/>
-              <w:left w:w="80" w:type="dxa"/>
-              <w:bottom w:w="60" w:type="dxa"/>
-              <w:right w:w="80" w:type="dxa"/>
-            </w:tcMar>
+            <w:tcW w:w="3102" w:type="dxa"/>
           </w:tcPr>
           <w:p>
             <w:pPr>
-              <w:rPr>
-                <w:rFonts w:ascii="Times New Roman" w:hAnsi="Times New Roman"/>
+              <w:spacing w:line="240" w:lineRule="auto"/>
+              <w:jc w:val="both"/>
+              <w:rPr>
+                <w:rFonts w:ascii="Times New Roman" w:hAnsi="Times New Roman"/>
+                <w:b/>
               </w:rPr>
             </w:pPr>
             <w:r>
               <w:rPr>
                 <w:rFonts w:ascii="Times New Roman" w:hAnsi="Times New Roman"/>
-                <w:sz w:val="20"/>
-              </w:rPr>
-              <w:t>Cannot exceed average analyst performance. Replicates historical bias.</w:t>
+                <w:b/>
+              </w:rPr>
+              <w:t>Same ranking-output limitation as SAC-AP.</w:t>
+            </w:r>
+          </w:p>
+        </w:tc>
+      </w:tr>
+      <w:tr>
+        <w:tc>
+          <w:tcPr>
+            <w:tcW w:w="3101" w:type="dxa"/>
+          </w:tcPr>
+          <w:p>
+            <w:pPr>
+              <w:spacing w:line="240" w:lineRule="auto"/>
+              <w:jc w:val="both"/>
+              <w:rPr>
+                <w:rFonts w:ascii="Times New Roman" w:hAnsi="Times New Roman"/>
+                <w:b/>
+              </w:rPr>
+            </w:pPr>
+            <w:r>
+              <w:rPr>
+                <w:rFonts w:ascii="Times New Roman" w:hAnsi="Times New Roman"/>
+                <w:b/>
+              </w:rPr>
+              <w:t>KNAP (Chavali et al., AINA 2024) [10]</w:t>
             </w:r>
           </w:p>
         </w:tc>
         <w:tc>
           <w:tcPr>
-            <w:tcW w:w="2845" w:type="dxa"/>
-            <w:tcBorders>
-              <w:top w:val="single" w:sz="4" w:space="0" w:color="000000"/>
-              <w:left w:val="single" w:sz="4" w:space="0" w:color="000000"/>
-              <w:bottom w:val="single" w:sz="4" w:space="0" w:color="000000"/>
-              <w:right w:val="single" w:sz="4" w:space="0" w:color="000000"/>
-            </w:tcBorders>
-            <w:tcMar>
-              <w:top w:w="60" w:type="dxa"/>
-              <w:left w:w="80" w:type="dxa"/>
-              <w:bottom w:w="60" w:type="dxa"/>
-              <w:right w:w="80" w:type="dxa"/>
-            </w:tcMar>
+            <w:tcW w:w="3101" w:type="dxa"/>
           </w:tcPr>
           <w:p>
             <w:pPr>
-              <w:rPr>
-                <w:rFonts w:ascii="Times New Roman" w:hAnsi="Times New Roman"/>
+              <w:spacing w:line="240" w:lineRule="auto"/>
+              <w:jc w:val="both"/>
+              <w:rPr>
+                <w:rFonts w:ascii="Times New Roman" w:hAnsi="Times New Roman"/>
+                <w:b/>
               </w:rPr>
             </w:pPr>
             <w:r>
               <w:rPr>
                 <w:rFonts w:ascii="Times New Roman" w:hAnsi="Times New Roman"/>
-                <w:sz w:val="20"/>
-              </w:rPr>
-              <w:t>ARSS optimizes beyond past decisions using RL with a MITRE-grounded reward.</w:t>
+                <w:b/>
+              </w:rPr>
+              <w:t>Attack-graph knowledge injection into deep RL for alert prioritization.</w:t>
+            </w:r>
+          </w:p>
+        </w:tc>
+        <w:tc>
+          <w:tcPr>
+            <w:tcW w:w="3102" w:type="dxa"/>
+          </w:tcPr>
+          <w:p>
+            <w:pPr>
+              <w:spacing w:line="240" w:lineRule="auto"/>
+              <w:jc w:val="both"/>
+              <w:rPr>
+                <w:rFonts w:ascii="Times New Roman" w:hAnsi="Times New Roman"/>
+                <w:b/>
+              </w:rPr>
+            </w:pPr>
+            <w:r>
+              <w:rPr>
+                <w:rFonts w:ascii="Times New Roman" w:hAnsi="Times New Roman"/>
+                <w:b/>
+              </w:rPr>
+              <w:t xml:space="preserve">Custom heuristic knowledge source, not </w:t>
+            </w:r>
+            <w:proofErr w:type="gramStart"/>
+            <w:r>
+              <w:rPr>
+                <w:rFonts w:ascii="Times New Roman" w:hAnsi="Times New Roman"/>
+                <w:b/>
+              </w:rPr>
+              <w:t>workload-conditioned</w:t>
+            </w:r>
+            <w:proofErr w:type="gramEnd"/>
+            <w:r>
+              <w:rPr>
+                <w:rFonts w:ascii="Times New Roman" w:hAnsi="Times New Roman"/>
+                <w:b/>
+              </w:rPr>
+              <w:t>.</w:t>
+            </w:r>
+          </w:p>
+        </w:tc>
+      </w:tr>
+      <w:tr>
+        <w:tc>
+          <w:tcPr>
+            <w:tcW w:w="3101" w:type="dxa"/>
+          </w:tcPr>
+          <w:p>
+            <w:pPr>
+              <w:spacing w:line="240" w:lineRule="auto"/>
+              <w:jc w:val="both"/>
+              <w:rPr>
+                <w:rFonts w:ascii="Times New Roman" w:hAnsi="Times New Roman"/>
+                <w:b/>
+              </w:rPr>
+            </w:pPr>
+            <w:proofErr w:type="spellStart"/>
+            <w:r>
+              <w:rPr>
+                <w:rFonts w:ascii="Times New Roman" w:hAnsi="Times New Roman"/>
+                <w:b/>
+              </w:rPr>
+              <w:t>AlertPro</w:t>
+            </w:r>
+            <w:proofErr w:type="spellEnd"/>
+            <w:r>
+              <w:rPr>
+                <w:rFonts w:ascii="Times New Roman" w:hAnsi="Times New Roman"/>
+                <w:b/>
+              </w:rPr>
+              <w:t xml:space="preserve"> (Wang et al., Computers &amp; Security 2024) [11]</w:t>
+            </w:r>
+          </w:p>
+        </w:tc>
+        <w:tc>
+          <w:tcPr>
+            <w:tcW w:w="3101" w:type="dxa"/>
+          </w:tcPr>
+          <w:p>
+            <w:pPr>
+              <w:spacing w:line="240" w:lineRule="auto"/>
+              <w:jc w:val="both"/>
+              <w:rPr>
+                <w:rFonts w:ascii="Times New Roman" w:hAnsi="Times New Roman"/>
+                <w:b/>
+              </w:rPr>
+            </w:pPr>
+            <w:r>
+              <w:rPr>
+                <w:rFonts w:ascii="Times New Roman" w:hAnsi="Times New Roman"/>
+                <w:b/>
+              </w:rPr>
+              <w:t>RL with analyst feedback for alert re-ranking, sub-500ms latency.</w:t>
+            </w:r>
+          </w:p>
+        </w:tc>
+        <w:tc>
+          <w:tcPr>
+            <w:tcW w:w="3102" w:type="dxa"/>
+          </w:tcPr>
+          <w:p>
+            <w:pPr>
+              <w:spacing w:line="240" w:lineRule="auto"/>
+              <w:jc w:val="both"/>
+              <w:rPr>
+                <w:rFonts w:ascii="Times New Roman" w:hAnsi="Times New Roman"/>
+                <w:b/>
+              </w:rPr>
+            </w:pPr>
+            <w:r>
+              <w:rPr>
+                <w:rFonts w:ascii="Times New Roman" w:hAnsi="Times New Roman"/>
+                <w:b/>
+              </w:rPr>
+              <w:t>Ranking only, no autonomous disposition decision.</w:t>
+            </w:r>
+          </w:p>
+        </w:tc>
+      </w:tr>
+      <w:tr>
+        <w:tc>
+          <w:tcPr>
+            <w:tcW w:w="3101" w:type="dxa"/>
+          </w:tcPr>
+          <w:p>
+            <w:pPr>
+              <w:spacing w:line="240" w:lineRule="auto"/>
+              <w:jc w:val="both"/>
+              <w:rPr>
+                <w:rFonts w:ascii="Times New Roman" w:hAnsi="Times New Roman"/>
+                <w:b/>
+              </w:rPr>
+            </w:pPr>
+            <w:r>
+              <w:rPr>
+                <w:rFonts w:ascii="Times New Roman" w:hAnsi="Times New Roman"/>
+                <w:b/>
+              </w:rPr>
+              <w:t>A2C Framework (Chhetri et al., ACM TOIT 2024) [12]</w:t>
+            </w:r>
+          </w:p>
+        </w:tc>
+        <w:tc>
+          <w:tcPr>
+            <w:tcW w:w="3101" w:type="dxa"/>
+          </w:tcPr>
+          <w:p>
+            <w:pPr>
+              <w:spacing w:line="240" w:lineRule="auto"/>
+              <w:jc w:val="both"/>
+              <w:rPr>
+                <w:rFonts w:ascii="Times New Roman" w:hAnsi="Times New Roman"/>
+                <w:b/>
+              </w:rPr>
+            </w:pPr>
+            <w:r>
+              <w:rPr>
+                <w:rFonts w:ascii="Times New Roman" w:hAnsi="Times New Roman"/>
+                <w:b/>
+              </w:rPr>
+              <w:t>Automate-Augment-Collaborate conceptual framework for SOC automation modes.</w:t>
+            </w:r>
+          </w:p>
+        </w:tc>
+        <w:tc>
+          <w:tcPr>
+            <w:tcW w:w="3102" w:type="dxa"/>
+          </w:tcPr>
+          <w:p>
+            <w:pPr>
+              <w:spacing w:line="240" w:lineRule="auto"/>
+              <w:jc w:val="both"/>
+              <w:rPr>
+                <w:rFonts w:ascii="Times New Roman" w:hAnsi="Times New Roman"/>
+                <w:b/>
+              </w:rPr>
+            </w:pPr>
+            <w:r>
+              <w:rPr>
+                <w:rFonts w:ascii="Times New Roman" w:hAnsi="Times New Roman"/>
+                <w:b/>
+              </w:rPr>
+              <w:t>Conceptual, no learned policy implemented.</w:t>
+            </w:r>
+          </w:p>
+        </w:tc>
+      </w:tr>
+      <w:tr>
+        <w:tc>
+          <w:tcPr>
+            <w:tcW w:w="3101" w:type="dxa"/>
+          </w:tcPr>
+          <w:p>
+            <w:pPr>
+              <w:spacing w:line="240" w:lineRule="auto"/>
+              <w:jc w:val="both"/>
+              <w:rPr>
+                <w:rFonts w:ascii="Times New Roman" w:hAnsi="Times New Roman"/>
+                <w:b/>
+              </w:rPr>
+            </w:pPr>
+            <w:proofErr w:type="spellStart"/>
+            <w:r>
+              <w:rPr>
+                <w:rFonts w:ascii="Times New Roman" w:hAnsi="Times New Roman"/>
+                <w:b/>
+              </w:rPr>
+              <w:t>MITREtrieval</w:t>
+            </w:r>
+            <w:proofErr w:type="spellEnd"/>
+            <w:r>
+              <w:rPr>
+                <w:rFonts w:ascii="Times New Roman" w:hAnsi="Times New Roman"/>
+                <w:b/>
+              </w:rPr>
+              <w:t xml:space="preserve"> (Huang et al., IEEE TNSM 2024) [13]</w:t>
+            </w:r>
+          </w:p>
+        </w:tc>
+        <w:tc>
+          <w:tcPr>
+            <w:tcW w:w="3101" w:type="dxa"/>
+          </w:tcPr>
+          <w:p>
+            <w:pPr>
+              <w:spacing w:line="240" w:lineRule="auto"/>
+              <w:jc w:val="both"/>
+              <w:rPr>
+                <w:rFonts w:ascii="Times New Roman" w:hAnsi="Times New Roman"/>
+                <w:b/>
+              </w:rPr>
+            </w:pPr>
+            <w:r>
+              <w:rPr>
+                <w:rFonts w:ascii="Times New Roman" w:hAnsi="Times New Roman"/>
+                <w:b/>
+              </w:rPr>
+              <w:t xml:space="preserve">BERT combined with MITRE ATT&amp;CK </w:t>
+            </w:r>
+            <w:proofErr w:type="gramStart"/>
+            <w:r>
+              <w:rPr>
+                <w:rFonts w:ascii="Times New Roman" w:hAnsi="Times New Roman"/>
+                <w:b/>
+              </w:rPr>
+              <w:t>for extracting</w:t>
+            </w:r>
+            <w:proofErr w:type="gramEnd"/>
+            <w:r>
+              <w:rPr>
+                <w:rFonts w:ascii="Times New Roman" w:hAnsi="Times New Roman"/>
+                <w:b/>
+              </w:rPr>
+              <w:t xml:space="preserve"> attack techniques from threat reports.</w:t>
+            </w:r>
+          </w:p>
+        </w:tc>
+        <w:tc>
+          <w:tcPr>
+            <w:tcW w:w="3102" w:type="dxa"/>
+          </w:tcPr>
+          <w:p>
+            <w:pPr>
+              <w:spacing w:line="240" w:lineRule="auto"/>
+              <w:jc w:val="both"/>
+              <w:rPr>
+                <w:rFonts w:ascii="Times New Roman" w:hAnsi="Times New Roman"/>
+                <w:b/>
+              </w:rPr>
+            </w:pPr>
+            <w:r>
+              <w:rPr>
+                <w:rFonts w:ascii="Times New Roman" w:hAnsi="Times New Roman"/>
+                <w:b/>
+              </w:rPr>
+              <w:t>Does not feed into a triage policy or reward function; no longer load-bearing since MITRE ATT&amp;CK is not the project's reward mechanism.</w:t>
             </w:r>
           </w:p>
         </w:tc>
@@ -4536,52 +4906,16 @@
     </w:p>
     <w:p>
       <w:pPr>
-        <w:spacing w:line="240" w:lineRule="auto"/>
-        <w:jc w:val="both"/>
-        <w:rPr>
-          <w:rFonts w:ascii="Times New Roman" w:hAnsi="Times New Roman"/>
-          <w:b/>
-          <w:sz w:val="22"/>
-          <w:szCs w:val="18"/>
-        </w:rPr>
-      </w:pPr>
-    </w:p>
-    <w:p>
-      <w:pPr>
-        <w:spacing w:line="240" w:lineRule="auto"/>
-        <w:jc w:val="both"/>
-        <w:rPr>
-          <w:rFonts w:ascii="Times New Roman" w:hAnsi="Times New Roman"/>
-          <w:b/>
-          <w:sz w:val="22"/>
-          <w:szCs w:val="18"/>
-        </w:rPr>
-      </w:pPr>
-    </w:p>
-    <w:p>
-      <w:pPr>
-        <w:pStyle w:val="Heading1"/>
-        <w:spacing w:before="0" w:line="240" w:lineRule="auto"/>
-        <w:rPr>
-          <w:rFonts w:ascii="Times New Roman" w:hAnsi="Times New Roman"/>
-          <w:sz w:val="32"/>
-          <w:szCs w:val="18"/>
-        </w:rPr>
+        <w:pStyle w:val="Heading2"/>
       </w:pPr>
       <w:bookmarkStart w:id="35" w:name="_Toc87347704"/>
-      <w:bookmarkStart w:id="36" w:name="_Toc196150937"/>
+      <w:bookmarkStart w:id="36" w:name="_Toc241185788"/>
       <w:bookmarkEnd w:id="30"/>
       <w:bookmarkEnd w:id="31"/>
       <w:bookmarkEnd w:id="32"/>
       <w:bookmarkEnd w:id="33"/>
       <w:bookmarkEnd w:id="34"/>
       <w:r>
-        <w:rPr>
-          <w:rFonts w:ascii="Times New Roman" w:hAnsi="Times New Roman"/>
-          <w:sz w:val="32"/>
-          <w:szCs w:val="18"/>
-        </w:rPr>
-        <w:lastRenderedPageBreak/>
         <w:t>Vision Statement</w:t>
       </w:r>
       <w:bookmarkEnd w:id="35"/>
@@ -4599,7 +4933,23 @@
       <w:bookmarkStart w:id="40" w:name="_Toc488853131"/>
       <w:bookmarkStart w:id="41" w:name="_Toc506386185"/>
       <w:r>
-        <w:t>ARSS is an autonomous triage agent designed to protect analyst attention, not replace it. It handles routine alerts automatically, escalates genuine threats with full explanations, and grounds every decision in the MITRE ATT&amp;CK framework so that security teams can trust and audit what the system does. Gartner's 2026 cybersecurity trends report identifies alert triage automation as a key near-term improvement for security operations teams, while stressing that human-in-the-loop frameworks remain critical as these systems mature [11]. ARSS is built for exactly that balance: autonomous action on routine cases, full transparency on everything else.</w:t>
+        <w:t xml:space="preserve">ARSS is a decision layer for the alert an analyst is about to see, not a replacement for the tools that generate or enforce a response to it. It sits between existing detection and orchestration infrastructure and the human analyst, adjusting what gets automatically closed, deferred, or escalated based on how the team's operational capacity is </w:t>
+      </w:r>
+      <w:proofErr w:type="gramStart"/>
+      <w:r>
+        <w:t>actually changing</w:t>
+      </w:r>
+      <w:proofErr w:type="gramEnd"/>
+      <w:r>
+        <w:t xml:space="preserve">, while guaranteeing through a severity floor that a genuinely dangerous alert is never affected by that adjustment. The project's central claim is deliberately narrow and testable: that conditioning the disposition decision on live </w:t>
+      </w:r>
+      <w:proofErr w:type="gramStart"/>
+      <w:r>
+        <w:t>workload state</w:t>
+      </w:r>
+      <w:proofErr w:type="gramEnd"/>
+      <w:r>
+        <w:t xml:space="preserve"> measurably helps, tested against real alternative baselines rather than assumed, with the honest possibility that a simpler method proves sufficient.</w:t>
       </w:r>
     </w:p>
     <w:p>
@@ -4620,7 +4970,7 @@
         </w:rPr>
       </w:pPr>
       <w:bookmarkStart w:id="42" w:name="_Toc87347705"/>
-      <w:bookmarkStart w:id="43" w:name="_Toc196150938"/>
+      <w:bookmarkStart w:id="43" w:name="_Toc241185789"/>
       <w:r>
         <w:rPr>
           <w:rFonts w:ascii="Times New Roman" w:hAnsi="Times New Roman"/>
@@ -4645,7 +4995,13 @@
       <w:bookmarkStart w:id="44" w:name="_Toc488853135"/>
       <w:bookmarkStart w:id="45" w:name="_Toc506386196"/>
       <w:r>
-        <w:t>ARSS covers the design, development, and evaluation of an autonomous alert triage system with an explainability layer. The system will:</w:t>
+        <w:t>ARSS covers the design, development, and evaluation of a</w:t>
+      </w:r>
+      <w:r>
+        <w:t xml:space="preserve"> workload-adaptive alert-triage system</w:t>
+      </w:r>
+      <w:r>
+        <w:t>. The system will:</w:t>
       </w:r>
     </w:p>
     <w:p>
@@ -4659,7 +5015,21 @@
         <w:jc w:val="both"/>
       </w:pPr>
       <w:r>
-        <w:t>Accept alert data from a SIEM or simulated alert stream as input.</w:t>
+        <w:t xml:space="preserve">Accept alert data from a simulated alert stream </w:t>
+      </w:r>
+      <w:r>
+        <w:t>generated from real network traffic (CIC-</w:t>
+      </w:r>
+      <w:proofErr w:type="spellStart"/>
+      <w:r>
+        <w:t>IIoT</w:t>
+      </w:r>
+      <w:proofErr w:type="spellEnd"/>
+      <w:r>
+        <w:t xml:space="preserve"> 2025), standing in for the output of a SIEM's detection and correlation layer</w:t>
+      </w:r>
+      <w:r>
+        <w:t>.</w:t>
       </w:r>
     </w:p>
     <w:p>
@@ -4673,7 +5043,22 @@
         <w:jc w:val="both"/>
       </w:pPr>
       <w:r>
-        <w:t>Classify alerts through a two-stage ML ensemble into binary and categorical threat labels.</w:t>
+        <w:t>Normalize incoming alert data</w:t>
+      </w:r>
+      <w:r>
+        <w:t xml:space="preserve"> into </w:t>
+      </w:r>
+      <w:r>
+        <w:t>a single internal representation, with the design supporting multiple SIEM source formats. Splunk is the primary target, given its dominant market position</w:t>
+      </w:r>
+      <w:r>
+        <w:t xml:space="preserve"> and </w:t>
+      </w:r>
+      <w:r>
+        <w:t>the comparative simplicity of its ingestion API</w:t>
+      </w:r>
+      <w:r>
+        <w:t>.</w:t>
       </w:r>
     </w:p>
     <w:p>
@@ -4687,7 +5072,17 @@
         <w:jc w:val="both"/>
       </w:pPr>
       <w:r>
-        <w:t>Generate a state vector of danger score, attack category, and confidence for the RL agent.</w:t>
+        <w:lastRenderedPageBreak/>
+        <w:t>Score alerts requiring it through the project's existing two-stage detection ensemble, producing</w:t>
+      </w:r>
+      <w:r>
+        <w:t xml:space="preserve"> a danger score, attack category, and confidence </w:t>
+      </w:r>
+      <w:r>
+        <w:t>value</w:t>
+      </w:r>
+      <w:r>
+        <w:t>.</w:t>
       </w:r>
     </w:p>
     <w:p>
@@ -4701,19 +5096,22 @@
         <w:jc w:val="both"/>
       </w:pPr>
       <w:r>
-        <w:t xml:space="preserve">Output one of four triage actions (Ignore, Log, Block, Isolate) using a trained </w:t>
-      </w:r>
-      <w:r>
-        <w:t>Deep Learning</w:t>
-      </w:r>
-      <w:r>
-        <w:t xml:space="preserve"> </w:t>
-      </w:r>
-      <w:r>
-        <w:t xml:space="preserve">agent </w:t>
-      </w:r>
-      <w:r>
-        <w:t>policy.</w:t>
+        <w:t>Maintain a liv</w:t>
+      </w:r>
+      <w:r>
+        <w:t xml:space="preserve">e, </w:t>
+      </w:r>
+      <w:r>
+        <w:t>multi-signal SOC-state representation within</w:t>
+      </w:r>
+      <w:r>
+        <w:t xml:space="preserve"> a </w:t>
+      </w:r>
+      <w:r>
+        <w:t>purpose-built discrete-event simulation environment, since no existing dataset records real SOC workload</w:t>
+      </w:r>
+      <w:r>
+        <w:t>.</w:t>
       </w:r>
     </w:p>
     <w:p>
@@ -4727,7 +5125,10 @@
         <w:jc w:val="both"/>
       </w:pPr>
       <w:r>
-        <w:t>Produce SHAP feature attributions for each classification decision.</w:t>
+        <w:t>Apply a severity floor that escalates high-severity alerts unconditionally, independent of the learned policy</w:t>
+      </w:r>
+      <w:r>
+        <w:t>.</w:t>
       </w:r>
     </w:p>
     <w:p>
@@ -4741,7 +5142,22 @@
         <w:jc w:val="both"/>
       </w:pPr>
       <w:r>
-        <w:t>Generate a plain-English incident narrative using an LLM from SHAP output and RL decision.</w:t>
+        <w:t>Implement and compare five candidate disposition methods: static threshold, supervised classifier, learning</w:t>
+      </w:r>
+      <w:r>
+        <w:t>-</w:t>
+      </w:r>
+      <w:r>
+        <w:t>to-defer, contextual bandit,</w:t>
+      </w:r>
+      <w:r>
+        <w:t xml:space="preserve"> and </w:t>
+      </w:r>
+      <w:r>
+        <w:t>offline reinforcement learning, under identical simulated conditions</w:t>
+      </w:r>
+      <w:r>
+        <w:t>.</w:t>
       </w:r>
     </w:p>
     <w:p>
@@ -4755,7 +5171,21 @@
         <w:jc w:val="both"/>
       </w:pPr>
       <w:r>
-        <w:t>Display decisions and explanations on a SOC analyst dashboard.</w:t>
+        <w:t>Record decision outcomes and use them to update the adaptive policy over time.</w:t>
+      </w:r>
+    </w:p>
+    <w:p>
+      <w:pPr>
+        <w:pStyle w:val="code-line"/>
+        <w:numPr>
+          <w:ilvl w:val="0"/>
+          <w:numId w:val="28"/>
+        </w:numPr>
+        <w:spacing w:before="0" w:beforeAutospacing="0" w:after="240" w:afterAutospacing="0"/>
+        <w:jc w:val="both"/>
+      </w:pPr>
+      <w:r>
+        <w:t>Evaluate the system against a falsifiable hypothesis: whether workload-adaptive triage reduces analyst review burden without a significant increase in missed high-severity alerts, relative to workload-blind baselines.</w:t>
       </w:r>
     </w:p>
     <w:p>
@@ -4764,15 +5194,7 @@
         <w:jc w:val="both"/>
       </w:pPr>
       <w:r>
-        <w:t>The project will focus on prototype-level implementation evaluated on the CIC-</w:t>
-      </w:r>
-      <w:proofErr w:type="spellStart"/>
-      <w:r>
-        <w:t>IIoT</w:t>
-      </w:r>
-      <w:proofErr w:type="spellEnd"/>
-      <w:r>
-        <w:t xml:space="preserve"> 2025 dataset with simulated alert replay. Real-time packet capture, live SIEM integration, and production deployment are outside the current scope. Constraints include dataset availability, computational resources, and timeline. The system is designed to be modular so that live SIEM integration can be added in a later phase without architectural changes.</w:t>
+        <w:t>The project will focus on prototype-level implementation, evaluated in simulation rather than against a real organization's live alert stream. This is a constraint of the timeline and of the practical impossibility of a student project obtaining production SIEM access, stated plainly rather than implied otherwise. Real-time deployment, live production SIEM integration, and any form of network enforcement action are explicitly outside the current scope. Enforcement remains the responsibility of existing tools the system is designed to sit alongside, not replace. The system is designed with SIEM-format compatibility as a broader goal, and the ingestion layer's design is intended to generalize beyond the primary target platform without architectural change.</w:t>
       </w:r>
     </w:p>
     <w:p>
@@ -4816,14 +5238,13 @@
         </w:rPr>
       </w:pPr>
       <w:bookmarkStart w:id="46" w:name="_Toc87347713"/>
-      <w:bookmarkStart w:id="47" w:name="_Toc196150939"/>
+      <w:bookmarkStart w:id="47" w:name="_Toc241185790"/>
       <w:r>
         <w:rPr>
           <w:rFonts w:ascii="Times New Roman" w:hAnsi="Times New Roman"/>
           <w:sz w:val="32"/>
           <w:szCs w:val="18"/>
         </w:rPr>
-        <w:lastRenderedPageBreak/>
         <w:t>Project Stakeholders</w:t>
       </w:r>
       <w:bookmarkEnd w:id="44"/>
@@ -5111,13 +5532,16 @@
               <w:jc w:val="center"/>
             </w:pPr>
             <w:r>
-              <w:t>System design, Literature review</w:t>
-            </w:r>
-            <w:r>
-              <w:t>,</w:t>
-            </w:r>
-            <w:r>
-              <w:t xml:space="preserve"> RL agent development, documentation</w:t>
+              <w:t xml:space="preserve">System design, </w:t>
+            </w:r>
+            <w:r>
+              <w:rPr>
+                <w:rFonts w:cs="Times"/>
+              </w:rPr>
+              <w:t>literature review, adaptive-policy</w:t>
+            </w:r>
+            <w:r>
+              <w:t xml:space="preserve"> development, documentation</w:t>
             </w:r>
           </w:p>
         </w:tc>
@@ -5152,6 +5576,7 @@
                 <w:b/>
                 <w:bCs/>
               </w:rPr>
+              <w:lastRenderedPageBreak/>
               <w:t xml:space="preserve">Haider </w:t>
             </w:r>
             <w:r>
@@ -5195,10 +5620,13 @@
               <w:jc w:val="center"/>
             </w:pPr>
             <w:r>
-              <w:t xml:space="preserve">ML ensemble training, </w:t>
-            </w:r>
-            <w:r>
-              <w:t>Security,</w:t>
+              <w:rPr>
+                <w:rFonts w:cs="Times"/>
+              </w:rPr>
+              <w:t>Detection ensemble training, SOC-state tracking implementation</w:t>
+            </w:r>
+            <w:r>
+              <w:t>,</w:t>
             </w:r>
             <w:r>
               <w:t xml:space="preserve"> testing</w:t>
@@ -5275,10 +5703,10 @@
               <w:t xml:space="preserve"> </w:t>
             </w:r>
             <w:r>
-              <w:t>E</w:t>
-            </w:r>
-            <w:r>
-              <w:t>xplainability layer</w:t>
+              <w:rPr>
+                <w:rFonts w:cs="Times"/>
+              </w:rPr>
+              <w:t>Simulation environment</w:t>
             </w:r>
             <w:r>
               <w:t>,</w:t>
@@ -5502,33 +5930,36 @@
       <w:pPr>
         <w:rPr>
           <w:rFonts w:ascii="Times New Roman" w:hAnsi="Times New Roman"/>
-        </w:rPr>
-      </w:pPr>
-    </w:p>
-    <w:p>
-      <w:pPr>
-        <w:pStyle w:val="Heading1"/>
-        <w:spacing w:before="0" w:line="240" w:lineRule="auto"/>
-        <w:jc w:val="both"/>
+          <w:i/>
+        </w:rPr>
+      </w:pPr>
+      <w:r>
         <w:rPr>
           <w:rFonts w:ascii="Times New Roman" w:hAnsi="Times New Roman"/>
-          <w:sz w:val="32"/>
-          <w:szCs w:val="18"/>
-        </w:rPr>
+          <w:i/>
+        </w:rPr>
+        <w:t>Note: the per-person task descriptions above have been updated to match the current system's components (the earlier version listed "RL agent development" and "explainability layer" specifically, reflecting the pre-reset architecture). The general division of labor is carried over unchanged from the original document; the team should confirm these specific task reassignments rather than treat them as already decided.</w:t>
+      </w:r>
+    </w:p>
+    <w:p>
+      <w:pPr>
+        <w:rPr>
+          <w:rFonts w:ascii="Times New Roman" w:hAnsi="Times New Roman"/>
+        </w:rPr>
+      </w:pPr>
+    </w:p>
+    <w:p>
+      <w:pPr>
+        <w:pStyle w:val="Heading2"/>
       </w:pPr>
       <w:bookmarkStart w:id="53" w:name="_Toc488853140"/>
       <w:bookmarkStart w:id="54" w:name="_Toc506386204"/>
       <w:bookmarkStart w:id="55" w:name="_Toc87347717"/>
-      <w:bookmarkStart w:id="56" w:name="_Toc196150940"/>
+      <w:bookmarkStart w:id="56" w:name="_Toc241185791"/>
       <w:bookmarkEnd w:id="48"/>
       <w:bookmarkEnd w:id="49"/>
       <w:bookmarkEnd w:id="50"/>
       <w:r>
-        <w:rPr>
-          <w:rFonts w:ascii="Times New Roman" w:hAnsi="Times New Roman"/>
-          <w:sz w:val="32"/>
-          <w:szCs w:val="18"/>
-        </w:rPr>
         <w:t>References</w:t>
       </w:r>
       <w:bookmarkEnd w:id="53"/>
@@ -5560,258 +5991,558 @@
     <w:p>
       <w:pPr>
         <w:pStyle w:val="code-line"/>
-        <w:spacing w:before="0" w:beforeAutospacing="0" w:after="240" w:afterAutospacing="0"/>
-        <w:jc w:val="both"/>
-      </w:pPr>
-      <w:r>
-        <w:t>[2] L. Chavali, T. Gupta, and P. Saxena, "Soft Actor-Critic Based Deep Reinforcement Learning for Alert Prioritization," in </w:t>
-      </w:r>
-      <w:r>
-        <w:rPr>
-          <w:rStyle w:val="Emphasis"/>
-        </w:rPr>
-        <w:t>Proc. IEEE Congress on Evolutionary Computation (CEC)</w:t>
-      </w:r>
-      <w:r>
-        <w:t>, 2022. DOI: 10.1109/CEC55065.2022.9870423</w:t>
+        <w:rPr>
+          <w:i/>
+        </w:rPr>
+      </w:pPr>
+      <w:r>
+        <w:rPr>
+          <w:i/>
+        </w:rPr>
+        <w:t>[2] M. Lázaro, L. Álvarez-Pérez, F.-J. González-Serrano, A. Gutiérrez-López, J.-L. Álvarez-Aldana, M. Gil-López, A. Izquierdo-Núñez, and J. Montero-Santos, "AI-Driven Alert Triage in Security Operations Centers: Imbalanced Learning with Human-in-the-Loop Contextual Bias Modeling," in Artificial Intelligence Applications and Innovations (AIAI 2026), IFIP Advances in Information and Communication Technology, vol. 794, Springer, Cham, 2026, pp. 150-164. DOI: 10.1007/978-3-032-30805-4_11</w:t>
       </w:r>
     </w:p>
     <w:p>
       <w:pPr>
         <w:pStyle w:val="code-line"/>
-        <w:spacing w:before="0" w:beforeAutospacing="0" w:after="240" w:afterAutospacing="0"/>
-        <w:jc w:val="both"/>
-      </w:pPr>
-      <w:r>
-        <w:t>[3] L. Chavali, A. Krishnan, P. Saxena, B. Mitra, and A. S. Chivukula, "Off-Policy Actor-Critic Deep Reinforcement Learning for Alert Prioritization," </w:t>
-      </w:r>
-      <w:r>
-        <w:rPr>
-          <w:rStyle w:val="Emphasis"/>
-        </w:rPr>
-        <w:t>Computers &amp; Security</w:t>
-      </w:r>
-      <w:r>
-        <w:t>, vol. 142, 2024. DOI: 10.1016/j.cose.2024.103893</w:t>
+        <w:rPr>
+          <w:i/>
+        </w:rPr>
+      </w:pPr>
+      <w:r>
+        <w:rPr>
+          <w:i/>
+        </w:rPr>
+        <w:t xml:space="preserve">[3] Y. Tong, A. Laszka, C. Yan, N. Zhang, and Y. </w:t>
+      </w:r>
+      <w:proofErr w:type="spellStart"/>
+      <w:r>
+        <w:rPr>
+          <w:i/>
+        </w:rPr>
+        <w:t>Vorobeychik</w:t>
+      </w:r>
+      <w:proofErr w:type="spellEnd"/>
+      <w:r>
+        <w:rPr>
+          <w:i/>
+        </w:rPr>
+        <w:t xml:space="preserve">, "Finding Needles in a Moving Haystack: Prioritizing Alerts with Adversarial Reinforcement Learning," AAAI, 2020. </w:t>
+      </w:r>
+      <w:proofErr w:type="spellStart"/>
+      <w:r>
+        <w:rPr>
+          <w:i/>
+        </w:rPr>
+        <w:t>arXiv</w:t>
+      </w:r>
+      <w:proofErr w:type="spellEnd"/>
+      <w:r>
+        <w:rPr>
+          <w:i/>
+        </w:rPr>
+        <w:t>: 1906.08805</w:t>
       </w:r>
     </w:p>
     <w:p>
       <w:pPr>
         <w:pStyle w:val="code-line"/>
-        <w:spacing w:before="0" w:beforeAutospacing="0" w:after="240" w:afterAutospacing="0"/>
-        <w:jc w:val="both"/>
-      </w:pPr>
-      <w:r>
-        <w:t>[4] L. Chavali, P. Saxena, and B. Mitra, "KNAP: Knowledge-Empowered Deep Reinforcement Learning for Alert Prioritization," in </w:t>
-      </w:r>
-      <w:r>
-        <w:rPr>
-          <w:rStyle w:val="Emphasis"/>
-        </w:rPr>
-        <w:t>Proc. Advanced Information Networking and Applications (AINA)</w:t>
-      </w:r>
-      <w:r>
-        <w:t>, Springer LNCS, 2024. DOI: 10.1007/978-3-031-57916-5_34</w:t>
+        <w:rPr>
+          <w:i/>
+        </w:rPr>
+      </w:pPr>
+      <w:r>
+        <w:rPr>
+          <w:i/>
+        </w:rPr>
+        <w:t xml:space="preserve">[4] L. Huang and Q. Zhu, "RADAMS: Resilient and Adaptive Alert and Attention Management Strategy Against Informational Denial-of-Service Attack," Computers &amp; Security, 2022. </w:t>
+      </w:r>
+      <w:proofErr w:type="spellStart"/>
+      <w:r>
+        <w:rPr>
+          <w:i/>
+        </w:rPr>
+        <w:t>arXiv</w:t>
+      </w:r>
+      <w:proofErr w:type="spellEnd"/>
+      <w:r>
+        <w:rPr>
+          <w:i/>
+        </w:rPr>
+        <w:t>: 2111.03463</w:t>
       </w:r>
     </w:p>
     <w:p>
       <w:pPr>
         <w:pStyle w:val="code-line"/>
-        <w:spacing w:before="0" w:beforeAutospacing="0" w:after="240" w:afterAutospacing="0"/>
-        <w:jc w:val="both"/>
-      </w:pPr>
-      <w:r>
-        <w:t>[5] X. Wang, X. Yang, X. Liang, et al., "</w:t>
+        <w:rPr>
+          <w:i/>
+        </w:rPr>
+      </w:pPr>
+      <w:r>
+        <w:rPr>
+          <w:i/>
+        </w:rPr>
+        <w:t xml:space="preserve">[5] A. Shah, R. Ganesan, S. </w:t>
       </w:r>
       <w:proofErr w:type="spellStart"/>
       <w:r>
+        <w:rPr>
+          <w:i/>
+        </w:rPr>
+        <w:t>Jajodia</w:t>
+      </w:r>
+      <w:proofErr w:type="spellEnd"/>
+      <w:r>
+        <w:rPr>
+          <w:i/>
+        </w:rPr>
+        <w:t xml:space="preserve">, and H. Cam, "A Two-Step Approach to Optimal Selection of Alerts for Investigation in a CSOC," IEEE Transactions on Information Forensics and Security, 2019; A. Shah, R. Ganesan, S. </w:t>
+      </w:r>
+      <w:proofErr w:type="spellStart"/>
+      <w:r>
+        <w:rPr>
+          <w:i/>
+        </w:rPr>
+        <w:t>Jajodia</w:t>
+      </w:r>
+      <w:proofErr w:type="spellEnd"/>
+      <w:r>
+        <w:rPr>
+          <w:i/>
+        </w:rPr>
+        <w:t xml:space="preserve">, P. </w:t>
+      </w:r>
+      <w:proofErr w:type="spellStart"/>
+      <w:r>
+        <w:rPr>
+          <w:i/>
+        </w:rPr>
+        <w:t>Samarati</w:t>
+      </w:r>
+      <w:proofErr w:type="spellEnd"/>
+      <w:r>
+        <w:rPr>
+          <w:i/>
+        </w:rPr>
+        <w:t xml:space="preserve">, and H. Cam, "Adaptive Alert </w:t>
+      </w:r>
+      <w:r>
+        <w:rPr>
+          <w:i/>
+        </w:rPr>
+        <w:lastRenderedPageBreak/>
+        <w:t>Management for Balancing Optimal Performance among Distributed CSOCs Using Reinforcement Learning," IEEE Transactions on Parallel and Distributed Systems, 2020.</w:t>
+      </w:r>
+    </w:p>
+    <w:p>
+      <w:pPr>
+        <w:pStyle w:val="code-line"/>
+        <w:rPr>
+          <w:i/>
+        </w:rPr>
+      </w:pPr>
+      <w:r>
+        <w:rPr>
+          <w:i/>
+        </w:rPr>
+        <w:t xml:space="preserve">[6] F. </w:t>
+      </w:r>
+      <w:proofErr w:type="spellStart"/>
+      <w:r>
+        <w:rPr>
+          <w:i/>
+        </w:rPr>
+        <w:t>Jalalvand</w:t>
+      </w:r>
+      <w:proofErr w:type="spellEnd"/>
+      <w:r>
+        <w:rPr>
+          <w:i/>
+        </w:rPr>
+        <w:t xml:space="preserve">, M. B. Chhetri, S. Nepal, and C. Paris, "Adaptive Alert </w:t>
+      </w:r>
+      <w:proofErr w:type="spellStart"/>
+      <w:r>
+        <w:rPr>
+          <w:i/>
+        </w:rPr>
+        <w:t>Prioritisation</w:t>
+      </w:r>
+      <w:proofErr w:type="spellEnd"/>
+      <w:r>
+        <w:rPr>
+          <w:i/>
+        </w:rPr>
+        <w:t xml:space="preserve"> in Security Operations </w:t>
+      </w:r>
+      <w:proofErr w:type="spellStart"/>
+      <w:r>
+        <w:rPr>
+          <w:i/>
+        </w:rPr>
+        <w:t>Centres</w:t>
+      </w:r>
+      <w:proofErr w:type="spellEnd"/>
+      <w:r>
+        <w:rPr>
+          <w:i/>
+        </w:rPr>
+        <w:t>," arXiv:2506.18462, 2025 (published version: Information Sciences, 2026, DOI: 10.1016/j.ins.2026.124128).</w:t>
+      </w:r>
+    </w:p>
+    <w:p>
+      <w:pPr>
+        <w:pStyle w:val="code-line"/>
+        <w:rPr>
+          <w:i/>
+        </w:rPr>
+      </w:pPr>
+      <w:r>
+        <w:rPr>
+          <w:i/>
+        </w:rPr>
+        <w:t xml:space="preserve">[7] Microsoft Security Research, "Adaptive Incident Prioritization for Security Operations at Scale," ACM CCS, 2026. </w:t>
+      </w:r>
+      <w:proofErr w:type="spellStart"/>
+      <w:r>
+        <w:rPr>
+          <w:i/>
+        </w:rPr>
+        <w:t>arXiv</w:t>
+      </w:r>
+      <w:proofErr w:type="spellEnd"/>
+      <w:r>
+        <w:rPr>
+          <w:i/>
+        </w:rPr>
+        <w:t>: 2607.16963</w:t>
+      </w:r>
+    </w:p>
+    <w:p>
+      <w:pPr>
+        <w:pStyle w:val="code-line"/>
+        <w:rPr>
+          <w:i/>
+        </w:rPr>
+      </w:pPr>
+      <w:r>
+        <w:rPr>
+          <w:i/>
+        </w:rPr>
+        <w:t>[8] L. Chavali, T. Gupta, and P. Saxena, "Soft Actor-Critic Based Deep Reinforcement Learning for Alert Prioritization," in Proc. IEEE Congress on Evolutionary Computation (CEC), 2022. DOI: 10.1109/CEC55065.2022.9870423</w:t>
+      </w:r>
+    </w:p>
+    <w:p>
+      <w:pPr>
+        <w:pStyle w:val="code-line"/>
+        <w:rPr>
+          <w:i/>
+        </w:rPr>
+      </w:pPr>
+      <w:r>
+        <w:rPr>
+          <w:i/>
+        </w:rPr>
+        <w:t>[9] L. Chavali, A. Krishnan, P. Saxena, B. Mitra, and A. S. Chivukula, "Off-Policy Actor-Critic Deep Reinforcement Learning for Alert Prioritization," Computers &amp; Security, vol. 142, 2024. DOI: 10.1016/j.cose.2024.103893</w:t>
+      </w:r>
+    </w:p>
+    <w:p>
+      <w:pPr>
+        <w:pStyle w:val="code-line"/>
+        <w:rPr>
+          <w:i/>
+        </w:rPr>
+      </w:pPr>
+      <w:r>
+        <w:rPr>
+          <w:i/>
+        </w:rPr>
+        <w:t>[10] L. Chavali, P. Saxena, and B. Mitra, "KNAP: Knowledge-Empowered Deep Reinforcement Learning for Alert Prioritization," in Proc. Advanced Information Networking and Applications (AINA), Springer LNCS, 2024. DOI: 10.1007/978-3-031-57916-5_34</w:t>
+      </w:r>
+    </w:p>
+    <w:p>
+      <w:pPr>
+        <w:pStyle w:val="code-line"/>
+        <w:rPr>
+          <w:i/>
+        </w:rPr>
+      </w:pPr>
+      <w:r>
+        <w:rPr>
+          <w:i/>
+        </w:rPr>
+        <w:t>[11] X. Wang, X. Yang, X. Liang, et al., "</w:t>
+      </w:r>
+      <w:proofErr w:type="spellStart"/>
+      <w:r>
+        <w:rPr>
+          <w:i/>
+        </w:rPr>
         <w:t>AlertPro</w:t>
       </w:r>
       <w:proofErr w:type="spellEnd"/>
       <w:r>
-        <w:t>: Context-Aware Reinforcement Learning for Alert Prioritization," </w:t>
-      </w:r>
-      <w:r>
-        <w:rPr>
-          <w:rStyle w:val="Emphasis"/>
-        </w:rPr>
-        <w:t>Computers &amp; Security</w:t>
-      </w:r>
-      <w:r>
-        <w:t>, vol. 137, 2024. DOI: 10.1016/j.cose.2023.103583</w:t>
+        <w:rPr>
+          <w:i/>
+        </w:rPr>
+        <w:t>: Context-Aware Reinforcement Learning for Alert Prioritization," Computers &amp; Security, vol. 137, 2024. DOI: 10.1016/j.cose.2023.103583</w:t>
       </w:r>
     </w:p>
     <w:p>
       <w:pPr>
         <w:pStyle w:val="code-line"/>
-        <w:spacing w:before="0" w:beforeAutospacing="0" w:after="240" w:afterAutospacing="0"/>
-        <w:jc w:val="both"/>
-      </w:pPr>
-      <w:r>
-        <w:t>[6] L. Huang and Q. Zhu, "RADAMS: Resilient and Adaptive Alert and Attention Management Strategy Against Informational Denial-of-Service Attack," </w:t>
-      </w:r>
-      <w:r>
-        <w:rPr>
-          <w:rStyle w:val="Emphasis"/>
-        </w:rPr>
-        <w:t>Computers &amp; Security</w:t>
-      </w:r>
-      <w:r>
-        <w:t xml:space="preserve">, 2022. </w:t>
+        <w:rPr>
+          <w:i/>
+        </w:rPr>
+      </w:pPr>
+      <w:r>
+        <w:rPr>
+          <w:i/>
+        </w:rPr>
+        <w:t xml:space="preserve">[12] M. B. Chhetri, S. Tariq, R. Singh, F. </w:t>
       </w:r>
       <w:proofErr w:type="spellStart"/>
       <w:r>
+        <w:rPr>
+          <w:i/>
+        </w:rPr>
+        <w:t>Jalalvand</w:t>
+      </w:r>
+      <w:proofErr w:type="spellEnd"/>
+      <w:r>
+        <w:rPr>
+          <w:i/>
+        </w:rPr>
+        <w:t>, C. Paris, and S. Nepal, "Human-AI Teaming for Alert Fatigue: An A2C Framework Approach," ACM Transactions on Internet Technology, vol. 24, no. 3, 2024. DOI: 10.1145/3670009</w:t>
+      </w:r>
+    </w:p>
+    <w:p>
+      <w:pPr>
+        <w:pStyle w:val="code-line"/>
+        <w:rPr>
+          <w:i/>
+        </w:rPr>
+      </w:pPr>
+      <w:r>
+        <w:rPr>
+          <w:i/>
+        </w:rPr>
+        <w:t xml:space="preserve">[13] Y. T. Huang, R. </w:t>
+      </w:r>
+      <w:proofErr w:type="spellStart"/>
+      <w:r>
+        <w:rPr>
+          <w:i/>
+        </w:rPr>
+        <w:t>Vaitheeshwari</w:t>
+      </w:r>
+      <w:proofErr w:type="spellEnd"/>
+      <w:r>
+        <w:rPr>
+          <w:i/>
+        </w:rPr>
+        <w:t>, M. C. Chen, Y. D. Lin, and R. H. Hwang, "</w:t>
+      </w:r>
+      <w:proofErr w:type="spellStart"/>
+      <w:r>
+        <w:rPr>
+          <w:i/>
+        </w:rPr>
+        <w:t>MITREtrieval</w:t>
+      </w:r>
+      <w:proofErr w:type="spellEnd"/>
+      <w:r>
+        <w:rPr>
+          <w:i/>
+        </w:rPr>
+        <w:t>: Fusing BERT with MITRE ATT&amp;CK Ontology for TTP Extraction from Threat Reports," IEEE Transactions on Network and Service Management, vol. 21, no. 4, 2024. DOI: 10.1109/TNSM.2024.3401200</w:t>
+      </w:r>
+    </w:p>
+    <w:p>
+      <w:pPr>
+        <w:pStyle w:val="code-line"/>
+        <w:rPr>
+          <w:i/>
+        </w:rPr>
+      </w:pPr>
+      <w:r>
+        <w:rPr>
+          <w:i/>
+        </w:rPr>
+        <w:t xml:space="preserve">[14] M. A. Bouke et al., "Multi-Level Distributional Entropy for Explainable Network Intrusion Detection," 2026. </w:t>
+      </w:r>
+      <w:proofErr w:type="spellStart"/>
+      <w:r>
+        <w:rPr>
+          <w:i/>
+        </w:rPr>
         <w:t>arXiv</w:t>
       </w:r>
       <w:proofErr w:type="spellEnd"/>
       <w:r>
-        <w:t>: 2111.03463</w:t>
+        <w:rPr>
+          <w:i/>
+        </w:rPr>
+        <w:t>: 2606.29797</w:t>
       </w:r>
     </w:p>
     <w:p>
       <w:pPr>
         <w:pStyle w:val="code-line"/>
-        <w:spacing w:before="0" w:beforeAutospacing="0" w:after="240" w:afterAutospacing="0"/>
-        <w:jc w:val="both"/>
-      </w:pPr>
-      <w:r>
-        <w:lastRenderedPageBreak/>
-        <w:t xml:space="preserve">[7] F. </w:t>
+        <w:rPr>
+          <w:i/>
+        </w:rPr>
+      </w:pPr>
+      <w:r>
+        <w:rPr>
+          <w:i/>
+        </w:rPr>
+        <w:t xml:space="preserve">[15] A. Kumar, A. Zhou, G. Tucker, and S. Levine, "Conservative Q-Learning for Offline Reinforcement Learning," </w:t>
       </w:r>
       <w:proofErr w:type="spellStart"/>
       <w:r>
-        <w:t>Jalalvand</w:t>
+        <w:rPr>
+          <w:i/>
+        </w:rPr>
+        <w:t>NeurIPS</w:t>
       </w:r>
       <w:proofErr w:type="spellEnd"/>
       <w:r>
-        <w:t xml:space="preserve">, M. B. Chhetri, S. Nepal, and C. Paris, "Alert </w:t>
+        <w:rPr>
+          <w:i/>
+        </w:rPr>
+        <w:t xml:space="preserve">, 2020. </w:t>
       </w:r>
       <w:proofErr w:type="spellStart"/>
       <w:r>
-        <w:t>Prioritisation</w:t>
+        <w:rPr>
+          <w:i/>
+        </w:rPr>
+        <w:t>arXiv</w:t>
       </w:r>
       <w:proofErr w:type="spellEnd"/>
       <w:r>
-        <w:t xml:space="preserve"> in Security Operations </w:t>
+        <w:rPr>
+          <w:i/>
+        </w:rPr>
+        <w:t>: 2006.04779</w:t>
+      </w:r>
+    </w:p>
+    <w:p>
+      <w:pPr>
+        <w:pStyle w:val="code-line"/>
+        <w:rPr>
+          <w:i/>
+        </w:rPr>
+      </w:pPr>
+      <w:r>
+        <w:rPr>
+          <w:i/>
+        </w:rPr>
+        <w:t xml:space="preserve">[16] S. Fujimoto, E. Conti, M. </w:t>
       </w:r>
       <w:proofErr w:type="spellStart"/>
       <w:r>
-        <w:t>Centres</w:t>
+        <w:rPr>
+          <w:i/>
+        </w:rPr>
+        <w:t>Ghavamzadeh</w:t>
       </w:r>
       <w:proofErr w:type="spellEnd"/>
       <w:r>
-        <w:t>: A Systematic Survey," </w:t>
-      </w:r>
-      <w:r>
-        <w:rPr>
-          <w:rStyle w:val="Emphasis"/>
-        </w:rPr>
-        <w:t>ACM Computing Surveys</w:t>
-      </w:r>
-      <w:r>
-        <w:t>, vol. 57, no. 2, Article 42, 2024. DOI: 10.1145/3695462</w:t>
+        <w:rPr>
+          <w:i/>
+        </w:rPr>
+        <w:t xml:space="preserve">, and J. Pineau, "Benchmarking Batch Deep Reinforcement Learning Algorithms," </w:t>
+      </w:r>
+      <w:proofErr w:type="spellStart"/>
+      <w:r>
+        <w:rPr>
+          <w:i/>
+        </w:rPr>
+        <w:t>NeurIPS</w:t>
+      </w:r>
+      <w:proofErr w:type="spellEnd"/>
+      <w:r>
+        <w:rPr>
+          <w:i/>
+        </w:rPr>
+        <w:t xml:space="preserve"> Deep RL Workshop, 2019. </w:t>
+      </w:r>
+      <w:proofErr w:type="spellStart"/>
+      <w:r>
+        <w:rPr>
+          <w:i/>
+        </w:rPr>
+        <w:t>arXiv</w:t>
+      </w:r>
+      <w:proofErr w:type="spellEnd"/>
+      <w:r>
+        <w:rPr>
+          <w:i/>
+        </w:rPr>
+        <w:t>: 1910.01708</w:t>
       </w:r>
     </w:p>
     <w:p>
       <w:pPr>
         <w:pStyle w:val="code-line"/>
-        <w:spacing w:before="0" w:beforeAutospacing="0" w:after="240" w:afterAutospacing="0"/>
-        <w:jc w:val="both"/>
-      </w:pPr>
-      <w:r>
-        <w:t xml:space="preserve">[8] M. B. Chhetri, S. Tariq, R. Singh, F. </w:t>
+        <w:rPr>
+          <w:i/>
+        </w:rPr>
+      </w:pPr>
+      <w:r>
+        <w:rPr>
+          <w:i/>
+        </w:rPr>
+        <w:t xml:space="preserve">[17] H. Zhang, H. Chen, C. Xiao, B. Li, D. Boning, and C.-J. Hsieh, "Robust Deep Reinforcement Learning against Adversarial Perturbations on State Observations," </w:t>
       </w:r>
       <w:proofErr w:type="spellStart"/>
       <w:r>
-        <w:t>Jalalvand</w:t>
+        <w:rPr>
+          <w:i/>
+        </w:rPr>
+        <w:t>NeurIPS</w:t>
       </w:r>
       <w:proofErr w:type="spellEnd"/>
       <w:r>
-        <w:t>, C. Paris, and S. Nepal, "Human-AI Teaming for Alert Fatigue: An A2C Framework Approach," </w:t>
-      </w:r>
-      <w:r>
-        <w:rPr>
-          <w:rStyle w:val="Emphasis"/>
-        </w:rPr>
-        <w:t>ACM Transactions on Internet Technology</w:t>
-      </w:r>
-      <w:r>
-        <w:t>, vol. 24, no. 3, 2024. DOI: 10.1145/3670009</w:t>
+        <w:rPr>
+          <w:i/>
+        </w:rPr>
+        <w:t>, 2020.</w:t>
       </w:r>
     </w:p>
     <w:p>
       <w:pPr>
         <w:pStyle w:val="code-line"/>
-        <w:spacing w:before="0" w:beforeAutospacing="0" w:after="240" w:afterAutospacing="0"/>
-        <w:jc w:val="both"/>
-      </w:pPr>
-      <w:r>
-        <w:t xml:space="preserve">[9] Y. T. Huang, R. </w:t>
+        <w:rPr>
+          <w:i/>
+        </w:rPr>
+      </w:pPr>
+      <w:r>
+        <w:rPr>
+          <w:i/>
+        </w:rPr>
+        <w:t xml:space="preserve">[18] H. Zhang, H. Chen, D. Boning, and C.-J. Hsieh, "Robust Reinforcement Learning on State Observations with Learned Optimal Adversary," ICLR, 2021. </w:t>
       </w:r>
       <w:proofErr w:type="spellStart"/>
       <w:r>
-        <w:t>Vaitheeshwari</w:t>
+        <w:rPr>
+          <w:i/>
+        </w:rPr>
+        <w:t>arXiv</w:t>
       </w:r>
       <w:proofErr w:type="spellEnd"/>
       <w:r>
-        <w:t>, M. C. Chen, Y. D. Lin, and R. H. Hwang, "</w:t>
-      </w:r>
-      <w:proofErr w:type="spellStart"/>
-      <w:r>
-        <w:t>MITREtrieval</w:t>
-      </w:r>
-      <w:proofErr w:type="spellEnd"/>
-      <w:r>
-        <w:t>: Fusing BERT with MITRE ATT&amp;CK Ontology for TTP Extraction from Threat Reports," </w:t>
-      </w:r>
-      <w:r>
-        <w:rPr>
-          <w:rStyle w:val="Emphasis"/>
-        </w:rPr>
-        <w:t>IEEE Transactions on Network and Service Management</w:t>
-      </w:r>
-      <w:r>
-        <w:t>, vol. 21, no. 4, 2024. DOI: 10.1109/TNSM.2024.3401200</w:t>
-      </w:r>
-    </w:p>
-    <w:p>
-      <w:pPr>
-        <w:pStyle w:val="code-line"/>
-        <w:spacing w:before="0" w:beforeAutospacing="0" w:after="240" w:afterAutospacing="0"/>
-        <w:jc w:val="both"/>
-      </w:pPr>
-      <w:r>
-        <w:t>[10] CrowdStrike, "Charlotte AI: Generative AI for Cybersecurity," CrowdStrike Product Documentation, 2024. Available: </w:t>
-      </w:r>
-      <w:hyperlink r:id="rId13" w:history="1">
-        <w:r>
-          <w:rPr>
-            <w:rStyle w:val="Hyperlink"/>
-          </w:rPr>
-          <w:t>https://www.crowdstrike.com/platform/charlotte-ai/</w:t>
-        </w:r>
-      </w:hyperlink>
-    </w:p>
-    <w:p>
-      <w:pPr>
-        <w:pStyle w:val="code-line"/>
-        <w:spacing w:before="0" w:beforeAutospacing="0" w:after="240" w:afterAutospacing="0"/>
-        <w:jc w:val="both"/>
-      </w:pPr>
-      <w:r>
-        <w:t>[11] Gartner, "Gartner Identifies the Top Cybersecurity Trends for 2026," Gartner Newsroom, Feb. 2026. Available: </w:t>
-      </w:r>
-      <w:hyperlink r:id="rId14" w:history="1">
-        <w:r>
-          <w:rPr>
-            <w:rStyle w:val="Hyperlink"/>
-          </w:rPr>
-          <w:t>https://www.gartner.com/en/newsroom/press-releases/2026-02-05-gartner-identifies-the-top-cybersecurity-trends-for-2026</w:t>
-        </w:r>
-      </w:hyperlink>
+        <w:rPr>
+          <w:i/>
+        </w:rPr>
+        <w:t>: 2101.08452</w:t>
+      </w:r>
     </w:p>
     <w:sectPr>
-      <w:footerReference w:type="default" r:id="rId15"/>
+      <w:footerReference w:type="default" r:id="rId18"/>
       <w:type w:val="continuous"/>
       <w:pgSz w:w="11906" w:h="16838" w:code="9"/>
       <w:pgMar w:top="1440" w:right="1296" w:bottom="1440" w:left="1296" w:header="720" w:footer="720" w:gutter="0"/>
@@ -5843,6 +6574,16 @@
 </file>
 
 <file path=word/footer1.xml><?xml version="1.0" encoding="utf-8"?>
+<w:ftr xmlns:wpc="http://schemas.microsoft.com/office/word/2010/wordprocessingCanvas" xmlns:cx="http://schemas.microsoft.com/office/drawing/2014/chartex" xmlns:cx1="http://schemas.microsoft.com/office/drawing/2015/9/8/chartex" xmlns:cx2="http://schemas.microsoft.com/office/drawing/2015/10/21/chartex" xmlns:cx3="http://schemas.microsoft.com/office/drawing/2016/5/9/chartex" xmlns:cx4="http://schemas.microsoft.com/office/drawing/2016/5/10/chartex" xmlns:cx5="http://schemas.microsoft.com/office/drawing/2016/5/11/chartex" xmlns:cx6="http://schemas.microsoft.com/office/drawing/2016/5/12/chartex" xmlns:cx7="http://schemas.microsoft.com/office/drawing/2016/5/13/chartex" xmlns:cx8="http://schemas.microsoft.com/office/drawing/2016/5/14/chartex" xmlns:mc="http://schemas.openxmlformats.org/markup-compatibility/2006" xmlns:aink="http://schemas.microsoft.com/office/drawing/2016/ink" xmlns:am3d="http://schemas.microsoft.com/office/drawing/2017/model3d" xmlns:o="urn:schemas-microsoft-com:office:office" xmlns:oel="http://schemas.microsoft.com/office/2019/extlst" xmlns:r="http://schemas.openxmlformats.org/officeDocument/2006/relationships" xmlns:m="http://schemas.openxmlformats.org/officeDocument/2006/math" xmlns:v="urn:schemas-microsoft-com:vml" xmlns:wp14="http://schemas.microsoft.com/office/word/2010/wordprocessingDrawing" xmlns:wp="http://schemas.openxmlformats.org/drawingml/2006/wordprocessingDrawing" xmlns:w10="urn:schemas-microsoft-com:office:word" xmlns:w="http://schemas.openxmlformats.org/wordprocessingml/2006/main" xmlns:w14="http://schemas.microsoft.com/office/word/2010/wordml" xmlns:w15="http://schemas.microsoft.com/office/word/2012/wordml" xmlns:w16cex="http://schemas.microsoft.com/office/word/2018/wordml/cex" xmlns:w16cid="http://schemas.microsoft.com/office/word/2016/wordml/cid" xmlns:w16="http://schemas.microsoft.com/office/word/2018/wordml" xmlns:w16du="http://schemas.microsoft.com/office/word/2023/wordml/word16du" xmlns:w16sdtdh="http://schemas.microsoft.com/office/word/2020/wordml/sdtdatahash" xmlns:w16sdtfl="http://schemas.microsoft.com/office/word/2024/wordml/sdtformatlock" xmlns:w16se="http://schemas.microsoft.com/office/word/2015/wordml/symex" xmlns:wpg="http://schemas.microsoft.com/office/word/2010/wordprocessingGroup" xmlns:wpi="http://schemas.microsoft.com/office/word/2010/wordprocessingInk" xmlns:wne="http://schemas.microsoft.com/office/word/2006/wordml" xmlns:wps="http://schemas.microsoft.com/office/word/2010/wordprocessingShape" mc:Ignorable="w14 w15 w16se w16cid w16 w16cex w16sdtdh w16sdtfl w16du wp14">
+  <w:p>
+    <w:pPr>
+      <w:pStyle w:val="Footer"/>
+    </w:pPr>
+  </w:p>
+</w:ftr>
+</file>
+
+<file path=word/footer2.xml><?xml version="1.0" encoding="utf-8"?>
 <w:ftr xmlns:wpc="http://schemas.microsoft.com/office/word/2010/wordprocessingCanvas" xmlns:cx="http://schemas.microsoft.com/office/drawing/2014/chartex" xmlns:cx1="http://schemas.microsoft.com/office/drawing/2015/9/8/chartex" xmlns:cx2="http://schemas.microsoft.com/office/drawing/2015/10/21/chartex" xmlns:cx3="http://schemas.microsoft.com/office/drawing/2016/5/9/chartex" xmlns:cx4="http://schemas.microsoft.com/office/drawing/2016/5/10/chartex" xmlns:cx5="http://schemas.microsoft.com/office/drawing/2016/5/11/chartex" xmlns:cx6="http://schemas.microsoft.com/office/drawing/2016/5/12/chartex" xmlns:cx7="http://schemas.microsoft.com/office/drawing/2016/5/13/chartex" xmlns:cx8="http://schemas.microsoft.com/office/drawing/2016/5/14/chartex" xmlns:mc="http://schemas.openxmlformats.org/markup-compatibility/2006" xmlns:aink="http://schemas.microsoft.com/office/drawing/2016/ink" xmlns:am3d="http://schemas.microsoft.com/office/drawing/2017/model3d" xmlns:o="urn:schemas-microsoft-com:office:office" xmlns:oel="http://schemas.microsoft.com/office/2019/extlst" xmlns:r="http://schemas.openxmlformats.org/officeDocument/2006/relationships" xmlns:m="http://schemas.openxmlformats.org/officeDocument/2006/math" xmlns:v="urn:schemas-microsoft-com:vml" xmlns:wp14="http://schemas.microsoft.com/office/word/2010/wordprocessingDrawing" xmlns:wp="http://schemas.openxmlformats.org/drawingml/2006/wordprocessingDrawing" xmlns:w10="urn:schemas-microsoft-com:office:word" xmlns:w="http://schemas.openxmlformats.org/wordprocessingml/2006/main" xmlns:w14="http://schemas.microsoft.com/office/word/2010/wordml" xmlns:w15="http://schemas.microsoft.com/office/word/2012/wordml" xmlns:w16cex="http://schemas.microsoft.com/office/word/2018/wordml/cex" xmlns:w16cid="http://schemas.microsoft.com/office/word/2016/wordml/cid" xmlns:w16="http://schemas.microsoft.com/office/word/2018/wordml" xmlns:w16du="http://schemas.microsoft.com/office/word/2023/wordml/word16du" xmlns:w16sdtdh="http://schemas.microsoft.com/office/word/2020/wordml/sdtdatahash" xmlns:w16sdtfl="http://schemas.microsoft.com/office/word/2024/wordml/sdtformatlock" xmlns:w16se="http://schemas.microsoft.com/office/word/2015/wordml/symex" xmlns:wpg="http://schemas.microsoft.com/office/word/2010/wordprocessingGroup" xmlns:wpi="http://schemas.microsoft.com/office/word/2010/wordprocessingInk" xmlns:wne="http://schemas.microsoft.com/office/word/2006/wordml" xmlns:wps="http://schemas.microsoft.com/office/word/2010/wordprocessingShape" mc:Ignorable="w14 w15 w16se w16cid w16 w16cex w16sdtdh w16sdtfl w16du wp14">
   <w:p>
     <w:pPr>
@@ -5858,7 +6599,17 @@
 </w:ftr>
 </file>
 
-<file path=word/footer2.xml><?xml version="1.0" encoding="utf-8"?>
+<file path=word/footer3.xml><?xml version="1.0" encoding="utf-8"?>
+<w:ftr xmlns:wpc="http://schemas.microsoft.com/office/word/2010/wordprocessingCanvas" xmlns:cx="http://schemas.microsoft.com/office/drawing/2014/chartex" xmlns:cx1="http://schemas.microsoft.com/office/drawing/2015/9/8/chartex" xmlns:cx2="http://schemas.microsoft.com/office/drawing/2015/10/21/chartex" xmlns:cx3="http://schemas.microsoft.com/office/drawing/2016/5/9/chartex" xmlns:cx4="http://schemas.microsoft.com/office/drawing/2016/5/10/chartex" xmlns:cx5="http://schemas.microsoft.com/office/drawing/2016/5/11/chartex" xmlns:cx6="http://schemas.microsoft.com/office/drawing/2016/5/12/chartex" xmlns:cx7="http://schemas.microsoft.com/office/drawing/2016/5/13/chartex" xmlns:cx8="http://schemas.microsoft.com/office/drawing/2016/5/14/chartex" xmlns:mc="http://schemas.openxmlformats.org/markup-compatibility/2006" xmlns:aink="http://schemas.microsoft.com/office/drawing/2016/ink" xmlns:am3d="http://schemas.microsoft.com/office/drawing/2017/model3d" xmlns:o="urn:schemas-microsoft-com:office:office" xmlns:oel="http://schemas.microsoft.com/office/2019/extlst" xmlns:r="http://schemas.openxmlformats.org/officeDocument/2006/relationships" xmlns:m="http://schemas.openxmlformats.org/officeDocument/2006/math" xmlns:v="urn:schemas-microsoft-com:vml" xmlns:wp14="http://schemas.microsoft.com/office/word/2010/wordprocessingDrawing" xmlns:wp="http://schemas.openxmlformats.org/drawingml/2006/wordprocessingDrawing" xmlns:w10="urn:schemas-microsoft-com:office:word" xmlns:w="http://schemas.openxmlformats.org/wordprocessingml/2006/main" xmlns:w14="http://schemas.microsoft.com/office/word/2010/wordml" xmlns:w15="http://schemas.microsoft.com/office/word/2012/wordml" xmlns:w16cex="http://schemas.microsoft.com/office/word/2018/wordml/cex" xmlns:w16cid="http://schemas.microsoft.com/office/word/2016/wordml/cid" xmlns:w16="http://schemas.microsoft.com/office/word/2018/wordml" xmlns:w16du="http://schemas.microsoft.com/office/word/2023/wordml/word16du" xmlns:w16sdtdh="http://schemas.microsoft.com/office/word/2020/wordml/sdtdatahash" xmlns:w16sdtfl="http://schemas.microsoft.com/office/word/2024/wordml/sdtformatlock" xmlns:w16se="http://schemas.microsoft.com/office/word/2015/wordml/symex" xmlns:wpg="http://schemas.microsoft.com/office/word/2010/wordprocessingGroup" xmlns:wpi="http://schemas.microsoft.com/office/word/2010/wordprocessingInk" xmlns:wne="http://schemas.microsoft.com/office/word/2006/wordml" xmlns:wps="http://schemas.microsoft.com/office/word/2010/wordprocessingShape" mc:Ignorable="w14 w15 w16se w16cid w16 w16cex w16sdtdh w16sdtfl w16du wp14">
+  <w:p>
+    <w:pPr>
+      <w:pStyle w:val="Footer"/>
+    </w:pPr>
+  </w:p>
+</w:ftr>
+</file>
+
+<file path=word/footer4.xml><?xml version="1.0" encoding="utf-8"?>
 <w:ftr xmlns:wpc="http://schemas.microsoft.com/office/word/2010/wordprocessingCanvas" xmlns:cx="http://schemas.microsoft.com/office/drawing/2014/chartex" xmlns:cx1="http://schemas.microsoft.com/office/drawing/2015/9/8/chartex" xmlns:cx2="http://schemas.microsoft.com/office/drawing/2015/10/21/chartex" xmlns:cx3="http://schemas.microsoft.com/office/drawing/2016/5/9/chartex" xmlns:cx4="http://schemas.microsoft.com/office/drawing/2016/5/10/chartex" xmlns:cx5="http://schemas.microsoft.com/office/drawing/2016/5/11/chartex" xmlns:cx6="http://schemas.microsoft.com/office/drawing/2016/5/12/chartex" xmlns:cx7="http://schemas.microsoft.com/office/drawing/2016/5/13/chartex" xmlns:cx8="http://schemas.microsoft.com/office/drawing/2016/5/14/chartex" xmlns:mc="http://schemas.openxmlformats.org/markup-compatibility/2006" xmlns:aink="http://schemas.microsoft.com/office/drawing/2016/ink" xmlns:am3d="http://schemas.microsoft.com/office/drawing/2017/model3d" xmlns:o="urn:schemas-microsoft-com:office:office" xmlns:oel="http://schemas.microsoft.com/office/2019/extlst" xmlns:r="http://schemas.openxmlformats.org/officeDocument/2006/relationships" xmlns:m="http://schemas.openxmlformats.org/officeDocument/2006/math" xmlns:v="urn:schemas-microsoft-com:vml" xmlns:wp14="http://schemas.microsoft.com/office/word/2010/wordprocessingDrawing" xmlns:wp="http://schemas.openxmlformats.org/drawingml/2006/wordprocessingDrawing" xmlns:w10="urn:schemas-microsoft-com:office:word" xmlns:w="http://schemas.openxmlformats.org/wordprocessingml/2006/main" xmlns:w14="http://schemas.microsoft.com/office/word/2010/wordml" xmlns:w15="http://schemas.microsoft.com/office/word/2012/wordml" xmlns:w16cex="http://schemas.microsoft.com/office/word/2018/wordml/cex" xmlns:w16cid="http://schemas.microsoft.com/office/word/2016/wordml/cid" xmlns:w16="http://schemas.microsoft.com/office/word/2018/wordml" xmlns:w16du="http://schemas.microsoft.com/office/word/2023/wordml/word16du" xmlns:w16sdtdh="http://schemas.microsoft.com/office/word/2020/wordml/sdtdatahash" xmlns:w16sdtfl="http://schemas.microsoft.com/office/word/2024/wordml/sdtformatlock" xmlns:w16se="http://schemas.microsoft.com/office/word/2015/wordml/symex" xmlns:wpg="http://schemas.microsoft.com/office/word/2010/wordprocessingGroup" xmlns:wpi="http://schemas.microsoft.com/office/word/2010/wordprocessingInk" xmlns:wne="http://schemas.microsoft.com/office/word/2006/wordml" xmlns:wps="http://schemas.microsoft.com/office/word/2010/wordprocessingShape" mc:Ignorable="w14 w15 w16se w16cid w16 w16cex w16sdtdh w16sdtfl w16du wp14">
   <w:sdt>
     <w:sdtPr>
@@ -5930,6 +6681,36 @@
 </w:footnotes>
 </file>
 
+<file path=word/header1.xml><?xml version="1.0" encoding="utf-8"?>
+<w:hdr xmlns:wpc="http://schemas.microsoft.com/office/word/2010/wordprocessingCanvas" xmlns:cx="http://schemas.microsoft.com/office/drawing/2014/chartex" xmlns:cx1="http://schemas.microsoft.com/office/drawing/2015/9/8/chartex" xmlns:cx2="http://schemas.microsoft.com/office/drawing/2015/10/21/chartex" xmlns:cx3="http://schemas.microsoft.com/office/drawing/2016/5/9/chartex" xmlns:cx4="http://schemas.microsoft.com/office/drawing/2016/5/10/chartex" xmlns:cx5="http://schemas.microsoft.com/office/drawing/2016/5/11/chartex" xmlns:cx6="http://schemas.microsoft.com/office/drawing/2016/5/12/chartex" xmlns:cx7="http://schemas.microsoft.com/office/drawing/2016/5/13/chartex" xmlns:cx8="http://schemas.microsoft.com/office/drawing/2016/5/14/chartex" xmlns:mc="http://schemas.openxmlformats.org/markup-compatibility/2006" xmlns:aink="http://schemas.microsoft.com/office/drawing/2016/ink" xmlns:am3d="http://schemas.microsoft.com/office/drawing/2017/model3d" xmlns:o="urn:schemas-microsoft-com:office:office" xmlns:oel="http://schemas.microsoft.com/office/2019/extlst" xmlns:r="http://schemas.openxmlformats.org/officeDocument/2006/relationships" xmlns:m="http://schemas.openxmlformats.org/officeDocument/2006/math" xmlns:v="urn:schemas-microsoft-com:vml" xmlns:wp14="http://schemas.microsoft.com/office/word/2010/wordprocessingDrawing" xmlns:wp="http://schemas.openxmlformats.org/drawingml/2006/wordprocessingDrawing" xmlns:w10="urn:schemas-microsoft-com:office:word" xmlns:w="http://schemas.openxmlformats.org/wordprocessingml/2006/main" xmlns:w14="http://schemas.microsoft.com/office/word/2010/wordml" xmlns:w15="http://schemas.microsoft.com/office/word/2012/wordml" xmlns:w16cex="http://schemas.microsoft.com/office/word/2018/wordml/cex" xmlns:w16cid="http://schemas.microsoft.com/office/word/2016/wordml/cid" xmlns:w16="http://schemas.microsoft.com/office/word/2018/wordml" xmlns:w16du="http://schemas.microsoft.com/office/word/2023/wordml/word16du" xmlns:w16sdtdh="http://schemas.microsoft.com/office/word/2020/wordml/sdtdatahash" xmlns:w16sdtfl="http://schemas.microsoft.com/office/word/2024/wordml/sdtformatlock" xmlns:w16se="http://schemas.microsoft.com/office/word/2015/wordml/symex" xmlns:wpg="http://schemas.microsoft.com/office/word/2010/wordprocessingGroup" xmlns:wpi="http://schemas.microsoft.com/office/word/2010/wordprocessingInk" xmlns:wne="http://schemas.microsoft.com/office/word/2006/wordml" xmlns:wps="http://schemas.microsoft.com/office/word/2010/wordprocessingShape" mc:Ignorable="w14 w15 w16se w16cid w16 w16cex w16sdtdh w16sdtfl w16du wp14">
+  <w:p>
+    <w:pPr>
+      <w:pStyle w:val="Header"/>
+    </w:pPr>
+  </w:p>
+</w:hdr>
+</file>
+
+<file path=word/header2.xml><?xml version="1.0" encoding="utf-8"?>
+<w:hdr xmlns:wpc="http://schemas.microsoft.com/office/word/2010/wordprocessingCanvas" xmlns:cx="http://schemas.microsoft.com/office/drawing/2014/chartex" xmlns:cx1="http://schemas.microsoft.com/office/drawing/2015/9/8/chartex" xmlns:cx2="http://schemas.microsoft.com/office/drawing/2015/10/21/chartex" xmlns:cx3="http://schemas.microsoft.com/office/drawing/2016/5/9/chartex" xmlns:cx4="http://schemas.microsoft.com/office/drawing/2016/5/10/chartex" xmlns:cx5="http://schemas.microsoft.com/office/drawing/2016/5/11/chartex" xmlns:cx6="http://schemas.microsoft.com/office/drawing/2016/5/12/chartex" xmlns:cx7="http://schemas.microsoft.com/office/drawing/2016/5/13/chartex" xmlns:cx8="http://schemas.microsoft.com/office/drawing/2016/5/14/chartex" xmlns:mc="http://schemas.openxmlformats.org/markup-compatibility/2006" xmlns:aink="http://schemas.microsoft.com/office/drawing/2016/ink" xmlns:am3d="http://schemas.microsoft.com/office/drawing/2017/model3d" xmlns:o="urn:schemas-microsoft-com:office:office" xmlns:oel="http://schemas.microsoft.com/office/2019/extlst" xmlns:r="http://schemas.openxmlformats.org/officeDocument/2006/relationships" xmlns:m="http://schemas.openxmlformats.org/officeDocument/2006/math" xmlns:v="urn:schemas-microsoft-com:vml" xmlns:wp14="http://schemas.microsoft.com/office/word/2010/wordprocessingDrawing" xmlns:wp="http://schemas.openxmlformats.org/drawingml/2006/wordprocessingDrawing" xmlns:w10="urn:schemas-microsoft-com:office:word" xmlns:w="http://schemas.openxmlformats.org/wordprocessingml/2006/main" xmlns:w14="http://schemas.microsoft.com/office/word/2010/wordml" xmlns:w15="http://schemas.microsoft.com/office/word/2012/wordml" xmlns:w16cex="http://schemas.microsoft.com/office/word/2018/wordml/cex" xmlns:w16cid="http://schemas.microsoft.com/office/word/2016/wordml/cid" xmlns:w16="http://schemas.microsoft.com/office/word/2018/wordml" xmlns:w16du="http://schemas.microsoft.com/office/word/2023/wordml/word16du" xmlns:w16sdtdh="http://schemas.microsoft.com/office/word/2020/wordml/sdtdatahash" xmlns:w16sdtfl="http://schemas.microsoft.com/office/word/2024/wordml/sdtformatlock" xmlns:w16se="http://schemas.microsoft.com/office/word/2015/wordml/symex" xmlns:wpg="http://schemas.microsoft.com/office/word/2010/wordprocessingGroup" xmlns:wpi="http://schemas.microsoft.com/office/word/2010/wordprocessingInk" xmlns:wne="http://schemas.microsoft.com/office/word/2006/wordml" xmlns:wps="http://schemas.microsoft.com/office/word/2010/wordprocessingShape" mc:Ignorable="w14 w15 w16se w16cid w16 w16cex w16sdtdh w16sdtfl w16du wp14">
+  <w:p>
+    <w:pPr>
+      <w:pStyle w:val="Header"/>
+    </w:pPr>
+  </w:p>
+</w:hdr>
+</file>
+
+<file path=word/header3.xml><?xml version="1.0" encoding="utf-8"?>
+<w:hdr xmlns:wpc="http://schemas.microsoft.com/office/word/2010/wordprocessingCanvas" xmlns:cx="http://schemas.microsoft.com/office/drawing/2014/chartex" xmlns:cx1="http://schemas.microsoft.com/office/drawing/2015/9/8/chartex" xmlns:cx2="http://schemas.microsoft.com/office/drawing/2015/10/21/chartex" xmlns:cx3="http://schemas.microsoft.com/office/drawing/2016/5/9/chartex" xmlns:cx4="http://schemas.microsoft.com/office/drawing/2016/5/10/chartex" xmlns:cx5="http://schemas.microsoft.com/office/drawing/2016/5/11/chartex" xmlns:cx6="http://schemas.microsoft.com/office/drawing/2016/5/12/chartex" xmlns:cx7="http://schemas.microsoft.com/office/drawing/2016/5/13/chartex" xmlns:cx8="http://schemas.microsoft.com/office/drawing/2016/5/14/chartex" xmlns:mc="http://schemas.openxmlformats.org/markup-compatibility/2006" xmlns:aink="http://schemas.microsoft.com/office/drawing/2016/ink" xmlns:am3d="http://schemas.microsoft.com/office/drawing/2017/model3d" xmlns:o="urn:schemas-microsoft-com:office:office" xmlns:oel="http://schemas.microsoft.com/office/2019/extlst" xmlns:r="http://schemas.openxmlformats.org/officeDocument/2006/relationships" xmlns:m="http://schemas.openxmlformats.org/officeDocument/2006/math" xmlns:v="urn:schemas-microsoft-com:vml" xmlns:wp14="http://schemas.microsoft.com/office/word/2010/wordprocessingDrawing" xmlns:wp="http://schemas.openxmlformats.org/drawingml/2006/wordprocessingDrawing" xmlns:w10="urn:schemas-microsoft-com:office:word" xmlns:w="http://schemas.openxmlformats.org/wordprocessingml/2006/main" xmlns:w14="http://schemas.microsoft.com/office/word/2010/wordml" xmlns:w15="http://schemas.microsoft.com/office/word/2012/wordml" xmlns:w16cex="http://schemas.microsoft.com/office/word/2018/wordml/cex" xmlns:w16cid="http://schemas.microsoft.com/office/word/2016/wordml/cid" xmlns:w16="http://schemas.microsoft.com/office/word/2018/wordml" xmlns:w16du="http://schemas.microsoft.com/office/word/2023/wordml/word16du" xmlns:w16sdtdh="http://schemas.microsoft.com/office/word/2020/wordml/sdtdatahash" xmlns:w16sdtfl="http://schemas.microsoft.com/office/word/2024/wordml/sdtformatlock" xmlns:w16se="http://schemas.microsoft.com/office/word/2015/wordml/symex" xmlns:wpg="http://schemas.microsoft.com/office/word/2010/wordprocessingGroup" xmlns:wpi="http://schemas.microsoft.com/office/word/2010/wordprocessingInk" xmlns:wne="http://schemas.microsoft.com/office/word/2006/wordml" xmlns:wps="http://schemas.microsoft.com/office/word/2010/wordprocessingShape" mc:Ignorable="w14 w15 w16se w16cid w16 w16cex w16sdtdh w16sdtfl w16du wp14">
+  <w:p>
+    <w:pPr>
+      <w:pStyle w:val="Header"/>
+    </w:pPr>
+  </w:p>
+</w:hdr>
+</file>
+
 <file path=word/numbering.xml><?xml version="1.0" encoding="utf-8"?>
 <w:numbering xmlns:wpc="http://schemas.microsoft.com/office/word/2010/wordprocessingCanvas" xmlns:cx="http://schemas.microsoft.com/office/drawing/2014/chartex" xmlns:cx1="http://schemas.microsoft.com/office/drawing/2015/9/8/chartex" xmlns:cx2="http://schemas.microsoft.com/office/drawing/2015/10/21/chartex" xmlns:cx3="http://schemas.microsoft.com/office/drawing/2016/5/9/chartex" xmlns:cx4="http://schemas.microsoft.com/office/drawing/2016/5/10/chartex" xmlns:cx5="http://schemas.microsoft.com/office/drawing/2016/5/11/chartex" xmlns:cx6="http://schemas.microsoft.com/office/drawing/2016/5/12/chartex" xmlns:cx7="http://schemas.microsoft.com/office/drawing/2016/5/13/chartex" xmlns:cx8="http://schemas.microsoft.com/office/drawing/2016/5/14/chartex" xmlns:mc="http://schemas.openxmlformats.org/markup-compatibility/2006" xmlns:aink="http://schemas.microsoft.com/office/drawing/2016/ink" xmlns:am3d="http://schemas.microsoft.com/office/drawing/2017/model3d" xmlns:o="urn:schemas-microsoft-com:office:office" xmlns:oel="http://schemas.microsoft.com/office/2019/extlst" xmlns:r="http://schemas.openxmlformats.org/officeDocument/2006/relationships" xmlns:m="http://schemas.openxmlformats.org/officeDocument/2006/math" xmlns:v="urn:schemas-microsoft-com:vml" xmlns:wp14="http://schemas.microsoft.com/office/word/2010/wordprocessingDrawing" xmlns:wp="http://schemas.openxmlformats.org/drawingml/2006/wordprocessingDrawing" xmlns:w10="urn:schemas-microsoft-com:office:word" xmlns:w="http://schemas.openxmlformats.org/wordprocessingml/2006/main" xmlns:w14="http://schemas.microsoft.com/office/word/2010/wordml" xmlns:w15="http://schemas.microsoft.com/office/word/2012/wordml" xmlns:w16cex="http://schemas.microsoft.com/office/word/2018/wordml/cex" xmlns:w16cid="http://schemas.microsoft.com/office/word/2016/wordml/cid" xmlns:w16="http://schemas.microsoft.com/office/word/2018/wordml" xmlns:w16du="http://schemas.microsoft.com/office/word/2023/wordml/word16du" xmlns:w16sdtdh="http://schemas.microsoft.com/office/word/2020/wordml/sdtdatahash" xmlns:w16sdtfl="http://schemas.microsoft.com/office/word/2024/wordml/sdtformatlock" xmlns:w16se="http://schemas.microsoft.com/office/word/2015/wordml/symex" xmlns:wpg="http://schemas.microsoft.com/office/word/2010/wordprocessingGroup" xmlns:wpi="http://schemas.microsoft.com/office/word/2010/wordprocessingInk" xmlns:wne="http://schemas.microsoft.com/office/word/2006/wordml" xmlns:wps="http://schemas.microsoft.com/office/word/2010/wordprocessingShape" mc:Ignorable="w14 w15 w16se w16cid w16 w16cex w16sdtdh w16sdtfl w16du wp14">
   <w:numPicBullet w:numPicBulletId="0">
@@ -5953,7 +6734,7 @@
         <v:path o:extrusionok="f" gradientshapeok="t" o:connecttype="rect"/>
         <o:lock v:ext="edit" aspectratio="t"/>
       </v:shapetype>
-      <v:shape id="Picture 889636011" o:spid="_x0000_i1025" type="#_x0000_t75" style="width:6pt;height:6pt;visibility:visible;mso-wrap-style:square" o:bullet="t">
+      <v:shape id="Picture 889636011" o:spid="_x0000_i1025" type="#_x0000_t75" style="width:5.65pt;height:5.65pt;visibility:visible;mso-wrap-style:square" o:bullet="t">
         <v:imagedata r:id="rId1" o:title=""/>
       </v:shape>
     </w:pict>
@@ -9591,7 +10372,6 @@
   <w:style w:type="table" w:default="1" w:styleId="TableNormal">
     <w:name w:val="Normal Table"/>
     <w:uiPriority w:val="99"/>
-    <w:semiHidden/>
     <w:unhideWhenUsed/>
     <w:tblPr>
       <w:tblInd w:w="0" w:type="dxa"/>
@@ -10739,6 +11519,15 @@
 </file>
 
 <file path=customXml/item1.xml><?xml version="1.0" encoding="utf-8"?>
+<?mso-contentType ?>
+<FormTemplates xmlns="http://schemas.microsoft.com/sharepoint/v3/contenttype/forms">
+  <Display>DocumentLibraryForm</Display>
+  <Edit>DocumentLibraryForm</Edit>
+  <New>DocumentLibraryForm</New>
+</FormTemplates>
+</file>
+
+<file path=customXml/item2.xml><?xml version="1.0" encoding="utf-8"?>
 <ct:contentTypeSchema xmlns:ct="http://schemas.microsoft.com/office/2006/metadata/contentType" xmlns:ma="http://schemas.microsoft.com/office/2006/metadata/properties/metaAttributes" ct:_="" ma:_="" ma:contentTypeName="Document" ma:contentTypeID="0x010100745CC57E34C74F4AA8E7561B26D8BE4E" ma:contentTypeVersion="6" ma:contentTypeDescription="Create a new document." ma:contentTypeScope="" ma:versionID="cf3c9e93c9ad0da3214da2f2d1f45168">
   <xsd:schema xmlns:xsd="http://www.w3.org/2001/XMLSchema" xmlns:xs="http://www.w3.org/2001/XMLSchema" xmlns:p="http://schemas.microsoft.com/office/2006/metadata/properties" xmlns:ns3="c37bdea3-cabc-463f-acad-5e9bc727a59f" targetNamespace="http://schemas.microsoft.com/office/2006/metadata/properties" ma:root="true" ma:fieldsID="380af84fe4744a2804aa759064d8b890" ns3:_="">
     <xsd:import namespace="c37bdea3-cabc-463f-acad-5e9bc727a59f"/>
@@ -10894,16 +11683,11 @@
 </ct:contentTypeSchema>
 </file>
 
-<file path=customXml/item2.xml><?xml version="1.0" encoding="utf-8"?>
-<?mso-contentType ?>
-<FormTemplates xmlns="http://schemas.microsoft.com/sharepoint/v3/contenttype/forms">
-  <Display>DocumentLibraryForm</Display>
-  <Edit>DocumentLibraryForm</Edit>
-  <New>DocumentLibraryForm</New>
-</FormTemplates>
+<file path=customXml/item3.xml><?xml version="1.0" encoding="utf-8"?>
+<b:Sources xmlns:b="http://schemas.openxmlformats.org/officeDocument/2006/bibliography" xmlns="http://schemas.openxmlformats.org/officeDocument/2006/bibliography" SelectedStyle="\APA.XSL" StyleName="APA"/>
 </file>
 
-<file path=customXml/item3.xml><?xml version="1.0" encoding="utf-8"?>
+<file path=customXml/item4.xml><?xml version="1.0" encoding="utf-8"?>
 <p:properties xmlns:p="http://schemas.microsoft.com/office/2006/metadata/properties" xmlns:xsi="http://www.w3.org/2001/XMLSchema-instance" xmlns:pc="http://schemas.microsoft.com/office/infopath/2007/PartnerControls">
   <documentManagement>
     <_activity xmlns="c37bdea3-cabc-463f-acad-5e9bc727a59f" xsi:nil="true"/>
@@ -10911,11 +11695,15 @@
 </p:properties>
 </file>
 
-<file path=customXml/item4.xml><?xml version="1.0" encoding="utf-8"?>
-<b:Sources xmlns:b="http://schemas.openxmlformats.org/officeDocument/2006/bibliography" xmlns="http://schemas.openxmlformats.org/officeDocument/2006/bibliography" SelectedStyle="\APA.XSL" StyleName="APA"/>
+<file path=customXml/itemProps1.xml><?xml version="1.0" encoding="utf-8"?>
+<ds:datastoreItem xmlns:ds="http://schemas.openxmlformats.org/officeDocument/2006/customXml" ds:itemID="{646E4319-A019-400A-960A-46228DF890D0}">
+  <ds:schemaRefs>
+    <ds:schemaRef ds:uri="http://schemas.microsoft.com/sharepoint/v3/contenttype/forms"/>
+  </ds:schemaRefs>
+</ds:datastoreItem>
 </file>
 
-<file path=customXml/itemProps1.xml><?xml version="1.0" encoding="utf-8"?>
+<file path=customXml/itemProps2.xml><?xml version="1.0" encoding="utf-8"?>
 <ds:datastoreItem xmlns:ds="http://schemas.openxmlformats.org/officeDocument/2006/customXml" ds:itemID="{EF24ECC0-377A-4E60-B7A2-D5369707CE29}">
   <ds:schemaRefs>
     <ds:schemaRef ds:uri="http://schemas.microsoft.com/office/2006/metadata/contentType"/>
@@ -10933,15 +11721,15 @@
 </ds:datastoreItem>
 </file>
 
-<file path=customXml/itemProps2.xml><?xml version="1.0" encoding="utf-8"?>
-<ds:datastoreItem xmlns:ds="http://schemas.openxmlformats.org/officeDocument/2006/customXml" ds:itemID="{646E4319-A019-400A-960A-46228DF890D0}">
+<file path=customXml/itemProps3.xml><?xml version="1.0" encoding="utf-8"?>
+<ds:datastoreItem xmlns:ds="http://schemas.openxmlformats.org/officeDocument/2006/customXml" ds:itemID="{39AACC1B-0A20-46FB-A2F8-E3A0024CDEA6}">
   <ds:schemaRefs>
-    <ds:schemaRef ds:uri="http://schemas.microsoft.com/sharepoint/v3/contenttype/forms"/>
+    <ds:schemaRef ds:uri="http://schemas.openxmlformats.org/officeDocument/2006/bibliography"/>
   </ds:schemaRefs>
 </ds:datastoreItem>
 </file>
 
-<file path=customXml/itemProps3.xml><?xml version="1.0" encoding="utf-8"?>
+<file path=customXml/itemProps4.xml><?xml version="1.0" encoding="utf-8"?>
 <ds:datastoreItem xmlns:ds="http://schemas.openxmlformats.org/officeDocument/2006/customXml" ds:itemID="{C8385FB4-902E-41CA-B78A-0113A81D0A4E}">
   <ds:schemaRefs>
     <ds:schemaRef ds:uri="http://schemas.microsoft.com/office/2006/metadata/properties"/>
@@ -10949,12 +11737,4 @@
     <ds:schemaRef ds:uri="c37bdea3-cabc-463f-acad-5e9bc727a59f"/>
   </ds:schemaRefs>
 </ds:datastoreItem>
-</file>
-
-<file path=customXml/itemProps4.xml><?xml version="1.0" encoding="utf-8"?>
-<ds:datastoreItem xmlns:ds="http://schemas.openxmlformats.org/officeDocument/2006/customXml" ds:itemID="{39AACC1B-0A20-46FB-A2F8-E3A0024CDEA6}">
-  <ds:schemaRefs>
-    <ds:schemaRef ds:uri="http://schemas.openxmlformats.org/officeDocument/2006/bibliography"/>
-  </ds:schemaRefs>
-</ds:datastoreItem>
 </file>
</xml_diff>